<commit_message>
Re-render tras recortes (modelos fundacionales + Anexo D removido + Resumen compactado + figuras 60%)
</commit_message>
<xml_diff>
--- a/docs/informe_anexos.docx
+++ b/docs/informe_anexos.docx
@@ -344,7 +344,7 @@
         <w:rPr>
           <w:color w:val="000000"/>
         </w:rPr>
-        <w:t xml:space="preserve">Este documento complementario reúne los seis anexos técnicos del proyecto</w:t>
+        <w:t xml:space="preserve">Este documento complementario reúne cinco anexos técnicos del proyecto</w:t>
       </w:r>
       <w:r>
         <w:rPr>
@@ -506,7 +506,7 @@
           <w:b/>
           <w:color w:val="000000"/>
         </w:rPr>
-        <w:t xml:space="preserve">Anexo D</w:t>
+        <w:t xml:space="preserve">Anexo E</w:t>
       </w:r>
       <w:r>
         <w:rPr>
@@ -518,7 +518,7 @@
         <w:rPr>
           <w:color w:val="000000"/>
         </w:rPr>
-        <w:t xml:space="preserve">reporta el análisis de sensibilidad del acoplamiento caudal-NDVI con la variable alternativa de caudal máximo mensual.</w:t>
+        <w:t xml:space="preserve">contiene los fragmentos de código que materializan cada fase del pipeline.</w:t>
       </w:r>
     </w:p>
     <w:p>
@@ -535,7 +535,7 @@
           <w:b/>
           <w:color w:val="000000"/>
         </w:rPr>
-        <w:t xml:space="preserve">Anexo E</w:t>
+        <w:t xml:space="preserve">Anexo F</w:t>
       </w:r>
       <w:r>
         <w:rPr>
@@ -547,24 +547,18 @@
         <w:rPr>
           <w:color w:val="000000"/>
         </w:rPr>
-        <w:t xml:space="preserve">contiene los fragmentos de código que materializan cada fase del pipeline.</w:t>
+        <w:t xml:space="preserve">reúne las tablas de detalle movidas desde el cuerpo del informe.</w:t>
       </w:r>
     </w:p>
     <w:p>
       <w:pPr>
-        <w:numPr>
-          <w:ilvl w:val="0"/>
-          <w:numId w:val="1001"/>
-        </w:numPr>
-        <w:pStyle w:val="Compact"/>
+        <w:pStyle w:val="FirstParagraph"/>
       </w:pPr>
       <w:r>
         <w:rPr>
-          <w:bCs/>
-          <w:b/>
-          <w:color w:val="000000"/>
-        </w:rPr>
-        <w:t xml:space="preserve">Anexo F</w:t>
+          <w:color w:val="000000"/>
+        </w:rPr>
+        <w:t xml:space="preserve">(La letra D queda sin usar; el análisis de sensibilidad caudal máximo vs medio que ocupaba esa posición se sintetiza ahora en el cuerpo del informe principal y los datos detallados quedan en</w:t>
       </w:r>
       <w:r>
         <w:rPr>
@@ -574,9 +568,16 @@
       </w:r>
       <w:r>
         <w:rPr>
-          <w:color w:val="000000"/>
-        </w:rPr>
-        <w:t xml:space="preserve">reúne dos tablas de detalle (cruce SAR-NDVI-GFD por estación y transiciones JRC) referenciadas desde el cuerpo del informe.</w:t>
+          <w:rStyle w:val="VerbatimChar"/>
+          <w:color w:val="000000"/>
+        </w:rPr>
+        <w:t xml:space="preserve">outputs/tables/caudal_comparacion_max_medio.csv</w:t>
+      </w:r>
+      <w:r>
+        <w:rPr>
+          <w:color w:val="000000"/>
+        </w:rPr>
+        <w:t xml:space="preserve">.)</w:t>
       </w:r>
     </w:p>
     <w:bookmarkEnd w:id="20"/>
@@ -2025,7 +2026,7 @@
       </w:r>
     </w:p>
     <w:bookmarkEnd w:id="25"/>
-    <w:bookmarkStart w:id="26" w:name="Xb49b8a1d06ba2fad23efec932696c776bd44353"/>
+    <w:bookmarkStart w:id="40" w:name="X87afce93389166fcff86155294321157c45f278"/>
     <w:p>
       <w:pPr>
         <w:pStyle w:val="Heading1"/>
@@ -2034,7 +2035,7 @@
         <w:rPr>
           <w:color w:val="000000"/>
         </w:rPr>
-        <w:t xml:space="preserve">Anexo D: Análisis de sensibilidad — caudal máximo vs medio mensual de El Banco</w:t>
+        <w:t xml:space="preserve">Anexo E: Fragmentos de código complementaríos</w:t>
       </w:r>
     </w:p>
     <w:p>
@@ -2045,7 +2046,7 @@
         <w:rPr>
           <w:color w:val="000000"/>
         </w:rPr>
-        <w:t xml:space="preserve">El cuerpo del informe usa el caudal</w:t>
+        <w:t xml:space="preserve">Para mantener el cuerpo del informe centrado en la interpretación de resultados, los fragmentos de código que materializan cada fase del pipeline se documentan en este anexo, organizados temáticamente en cuatro apartados que reproducen el orden lógico de la cadena de procesamiento: datacube y series temporales (E.1), reproyección y topología sobre parches segmentados (E.2), forzamiento climático y detección SAR (E.3), y métricas de fragmentación del paisaje en Julia (E.4). Los conceptos técnicos invocados aquí ,datacube, z-score, bfast, SamGeo, predicado DE-9IM, Random Forest, backscatter SAR, dispersión de doble rebote, F1-score, se introducen y explican funcionalmente en el cuerpo del</w:t>
       </w:r>
       <w:r>
         <w:rPr>
@@ -2055,267 +2056,40 @@
       </w:r>
       <w:r>
         <w:rPr>
-          <w:bCs/>
-          <w:b/>
-          <w:color w:val="000000"/>
-        </w:rPr>
-        <w:t xml:space="preserve">medio mensual</w:t>
-      </w:r>
-      <w:r>
-        <w:rPr>
-          <w:color w:val="000000"/>
-        </w:rPr>
-        <w:t xml:space="preserve"> </w:t>
-      </w:r>
-      <w:r>
-        <w:rPr>
-          <w:color w:val="000000"/>
-        </w:rPr>
-        <w:t xml:space="preserve">del río Magdalena en El Banco por coherencia con Ganadería Caribe (Aracataca, disponible solo en variable media). El análisis paralelo con la variable alternativa</w:t>
-      </w:r>
-      <w:r>
-        <w:rPr>
-          <w:color w:val="000000"/>
-        </w:rPr>
-        <w:t xml:space="preserve"> </w:t>
-      </w:r>
-      <w:r>
-        <w:rPr>
-          <w:bCs/>
-          <w:b/>
-          <w:color w:val="000000"/>
-        </w:rPr>
-        <w:t xml:space="preserve">caudal máximo mensual</w:t>
-      </w:r>
-      <w:r>
-        <w:rPr>
-          <w:color w:val="000000"/>
-        </w:rPr>
-        <w:t xml:space="preserve"> </w:t>
-      </w:r>
-      <w:r>
-        <w:rPr>
-          <w:color w:val="000000"/>
-        </w:rPr>
-        <w:t xml:space="preserve">—también disponible en DHIME, 144 obs. 2013–2025— arroja correlaciones positivas universales con NDVI cuyo signo coincide y cuyo pico también se ubica en el rezago de tres meses (manglar</w:t>
-      </w:r>
-      <w:r>
-        <w:rPr>
-          <w:color w:val="000000"/>
-        </w:rPr>
-        <w:t xml:space="preserve"> </w:t>
-      </w:r>
-      <m:oMath>
-        <m:sSub>
-          <m:e>
-            <m:r>
-              <m:t>ρ</m:t>
-            </m:r>
-          </m:e>
-          <m:sub>
-            <m:r>
-              <m:rPr>
-                <m:nor/>
-                <m:sty m:val="p"/>
-              </m:rPr>
-              <m:t>máx</m:t>
-            </m:r>
-          </m:sub>
-        </m:sSub>
-        <m:r>
-          <m:rPr>
-            <m:sty m:val="p"/>
-          </m:rPr>
-          <m:t>=</m:t>
-        </m:r>
-        <m:r>
-          <m:rPr>
-            <m:sty m:val="p"/>
-          </m:rPr>
-          <m:t>+</m:t>
-        </m:r>
-        <m:r>
-          <m:t>0</m:t>
-        </m:r>
-        <m:r>
-          <m:rPr>
-            <m:sty m:val="p"/>
-          </m:rPr>
-          <m:t>,</m:t>
-        </m:r>
-        <m:r>
-          <m:t>277</m:t>
-        </m:r>
-      </m:oMath>
-      <w:r>
-        <w:rPr>
-          <w:color w:val="000000"/>
-        </w:rPr>
-        <w:t xml:space="preserve"> </w:t>
-      </w:r>
-      <w:r>
-        <w:rPr>
-          <w:color w:val="000000"/>
-        </w:rPr>
-        <w:t xml:space="preserve">vs</w:t>
-      </w:r>
-      <w:r>
-        <w:rPr>
-          <w:color w:val="000000"/>
-        </w:rPr>
-        <w:t xml:space="preserve"> </w:t>
-      </w:r>
-      <m:oMath>
-        <m:sSub>
-          <m:e>
-            <m:r>
-              <m:t>ρ</m:t>
-            </m:r>
-          </m:e>
-          <m:sub>
-            <m:r>
-              <m:rPr>
-                <m:nor/>
-                <m:sty m:val="p"/>
-              </m:rPr>
-              <m:t>medio</m:t>
-            </m:r>
-          </m:sub>
-        </m:sSub>
-        <m:r>
-          <m:rPr>
-            <m:sty m:val="p"/>
-          </m:rPr>
-          <m:t>=</m:t>
-        </m:r>
-        <m:r>
-          <m:rPr>
-            <m:sty m:val="p"/>
-          </m:rPr>
-          <m:t>+</m:t>
-        </m:r>
-        <m:r>
-          <m:t>0</m:t>
-        </m:r>
-        <m:r>
-          <m:rPr>
-            <m:sty m:val="p"/>
-          </m:rPr>
-          <m:t>,</m:t>
-        </m:r>
-        <m:r>
-          <m:t>256</m:t>
-        </m:r>
-      </m:oMath>
-      <w:r>
-        <w:rPr>
-          <w:color w:val="000000"/>
-        </w:rPr>
-        <w:t xml:space="preserve">). La diferencia operativa se concentra en los rezagos cortos:</w:t>
-      </w:r>
-      <w:r>
-        <w:rPr>
-          <w:color w:val="000000"/>
-        </w:rPr>
-        <w:t xml:space="preserve"> </w:t>
-      </w:r>
-      <m:oMath>
-        <m:sSub>
-          <m:e>
-            <m:r>
-              <m:t>ρ</m:t>
-            </m:r>
-          </m:e>
-          <m:sub>
-            <m:r>
-              <m:rPr>
-                <m:nor/>
-                <m:sty m:val="p"/>
-              </m:rPr>
-              <m:t>máx</m:t>
-            </m:r>
-          </m:sub>
-        </m:sSub>
-      </m:oMath>
-      <w:r>
-        <w:rPr>
-          <w:color w:val="000000"/>
-        </w:rPr>
-        <w:t xml:space="preserve"> </w:t>
-      </w:r>
-      <w:r>
-        <w:rPr>
-          <w:color w:val="000000"/>
-        </w:rPr>
-        <w:t xml:space="preserve">supera a</w:t>
-      </w:r>
-      <w:r>
-        <w:rPr>
-          <w:color w:val="000000"/>
-        </w:rPr>
-        <w:t xml:space="preserve"> </w:t>
-      </w:r>
-      <m:oMath>
-        <m:sSub>
-          <m:e>
-            <m:r>
-              <m:t>ρ</m:t>
-            </m:r>
-          </m:e>
-          <m:sub>
-            <m:r>
-              <m:rPr>
-                <m:nor/>
-                <m:sty m:val="p"/>
-              </m:rPr>
-              <m:t>medio</m:t>
-            </m:r>
-          </m:sub>
-        </m:sSub>
-      </m:oMath>
-      <w:r>
-        <w:rPr>
-          <w:color w:val="000000"/>
-        </w:rPr>
-        <w:t xml:space="preserve"> </w:t>
-      </w:r>
-      <w:r>
-        <w:rPr>
-          <w:color w:val="000000"/>
-        </w:rPr>
-        <w:t xml:space="preserve">por 0,08–0,12 unidades en lag 0–1, consistente con que los picos extremos del caudal máximo se asocian más rápidamente con cambios espectrales puntuales mientras el caudal medio captura el efecto agregado del régimen sostenido. Las conclusiones científicas del cuerpo del informe son por tanto robustas a la elección de la variable hidrométrica; los datos detallados de ambas series están disponibles en</w:t>
-      </w:r>
-      <w:r>
-        <w:rPr>
-          <w:color w:val="000000"/>
-        </w:rPr>
-        <w:t xml:space="preserve"> </w:t>
-      </w:r>
-      <w:r>
-        <w:rPr>
           <w:rStyle w:val="VerbatimChar"/>
           <w:color w:val="000000"/>
         </w:rPr>
-        <w:t xml:space="preserve">outputs/tables/caudal_comparacion_max_medio.csv</w:t>
-      </w:r>
-      <w:r>
-        <w:rPr>
-          <w:color w:val="000000"/>
-        </w:rPr>
-        <w:t xml:space="preserve">.</w:t>
+        <w:t xml:space="preserve">informe_final.pdf</w:t>
+      </w:r>
+      <w:r>
+        <w:rPr>
+          <w:color w:val="000000"/>
+        </w:rPr>
+        <w:t xml:space="preserve">; este anexo se concentra en la implementación operativa y supone que el lector conoce ya su significado conceptual.</w:t>
       </w:r>
     </w:p>
-    <w:bookmarkEnd w:id="26"/>
-    <w:bookmarkStart w:id="41" w:name="X87afce93389166fcff86155294321157c45f278"/>
+    <w:bookmarkStart w:id="31" w:name="X8010b29c17b57e56e5ad035387045cc0bb30b58"/>
     <w:p>
       <w:pPr>
-        <w:pStyle w:val="Heading1"/>
+        <w:pStyle w:val="Heading2"/>
       </w:pPr>
       <w:r>
         <w:rPr>
           <w:color w:val="000000"/>
         </w:rPr>
-        <w:t xml:space="preserve">Anexo E: Fragmentos de código complementaríos</w:t>
+        <w:t xml:space="preserve">E.1 Datacube multitemporal y series de tiempo</w:t>
+      </w:r>
+    </w:p>
+    <w:bookmarkStart w:id="26" w:name="X0c32a2aabdf0f72047edf90bf42524e52169d25"/>
+    <w:p>
+      <w:pPr>
+        <w:pStyle w:val="Heading3"/>
+      </w:pPr>
+      <w:r>
+        <w:rPr>
+          <w:color w:val="000000"/>
+        </w:rPr>
+        <w:t xml:space="preserve">E.1.a Lectura perezosa del datacube NetCDF con xarray</w:t>
       </w:r>
     </w:p>
     <w:p>
@@ -2326,60 +2100,6 @@
         <w:rPr>
           <w:color w:val="000000"/>
         </w:rPr>
-        <w:t xml:space="preserve">Para mantener el cuerpo del informe centrado en la interpretación de resultados, los fragmentos de código que materializan cada fase del pipeline se documentan en este anexo, organizados temáticamente en cuatro apartados que reproducen el orden lógico de la cadena de procesamiento: datacube y series temporales (E.1), reproyección y topología sobre parches segmentados (E.2), forzamiento climático y detección SAR (E.3), y métricas de fragmentación del paisaje en Julia (E.4). Los conceptos técnicos invocados aquí ,datacube, z-score, bfast, SamGeo, predicado DE-9IM, Random Forest, backscatter SAR, dispersión de doble rebote, F1-score, se introducen y explican funcionalmente en el cuerpo del</w:t>
-      </w:r>
-      <w:r>
-        <w:rPr>
-          <w:color w:val="000000"/>
-        </w:rPr>
-        <w:t xml:space="preserve"> </w:t>
-      </w:r>
-      <w:r>
-        <w:rPr>
-          <w:rStyle w:val="VerbatimChar"/>
-          <w:color w:val="000000"/>
-        </w:rPr>
-        <w:t xml:space="preserve">informe_final.pdf</w:t>
-      </w:r>
-      <w:r>
-        <w:rPr>
-          <w:color w:val="000000"/>
-        </w:rPr>
-        <w:t xml:space="preserve">; este anexo se concentra en la implementación operativa y supone que el lector conoce ya su significado conceptual.</w:t>
-      </w:r>
-    </w:p>
-    <w:bookmarkStart w:id="32" w:name="X8010b29c17b57e56e5ad035387045cc0bb30b58"/>
-    <w:p>
-      <w:pPr>
-        <w:pStyle w:val="Heading2"/>
-      </w:pPr>
-      <w:r>
-        <w:rPr>
-          <w:color w:val="000000"/>
-        </w:rPr>
-        <w:t xml:space="preserve">E.1 Datacube multitemporal y series de tiempo</w:t>
-      </w:r>
-    </w:p>
-    <w:bookmarkStart w:id="27" w:name="X0c32a2aabdf0f72047edf90bf42524e52169d25"/>
-    <w:p>
-      <w:pPr>
-        <w:pStyle w:val="Heading3"/>
-      </w:pPr>
-      <w:r>
-        <w:rPr>
-          <w:color w:val="000000"/>
-        </w:rPr>
-        <w:t xml:space="preserve">E.1.a Lectura perezosa del datacube NetCDF con xarray</w:t>
-      </w:r>
-    </w:p>
-    <w:p>
-      <w:pPr>
-        <w:pStyle w:val="FirstParagraph"/>
-      </w:pPr>
-      <w:r>
-        <w:rPr>
-          <w:color w:val="000000"/>
-        </w:rPr>
         <w:t xml:space="preserve">El datacube trimestral materializado como NetCDF CF-1.8 se abre con evaluación perezosa mediante</w:t>
       </w:r>
       <w:r>
@@ -2761,8 +2481,8 @@
         <w:t xml:space="preserve">]).compute()</w:t>
       </w:r>
     </w:p>
-    <w:bookmarkEnd w:id="27"/>
-    <w:bookmarkStart w:id="28" w:name="Xfeb72fc2201e9c1da4ed9ebedc0ab7adc64d185"/>
+    <w:bookmarkEnd w:id="26"/>
+    <w:bookmarkStart w:id="27" w:name="Xfeb72fc2201e9c1da4ed9ebedc0ab7adc64d185"/>
     <w:p>
       <w:pPr>
         <w:pStyle w:val="Heading3"/>
@@ -3062,8 +2782,8 @@
         <w:t xml:space="preserve">)</w:t>
       </w:r>
     </w:p>
-    <w:bookmarkEnd w:id="28"/>
-    <w:bookmarkStart w:id="29" w:name="X44205112256e9dc8e51effec831e909c6271553"/>
+    <w:bookmarkEnd w:id="27"/>
+    <w:bookmarkStart w:id="28" w:name="X44205112256e9dc8e51effec831e909c6271553"/>
     <w:p>
       <w:pPr>
         <w:pStyle w:val="Heading3"/>
@@ -3723,8 +3443,8 @@
         <w:t xml:space="preserve">(cubo)))</w:t>
       </w:r>
     </w:p>
-    <w:bookmarkEnd w:id="29"/>
-    <w:bookmarkStart w:id="30" w:name="X231786d8da045f22cfb6544a59075b666112cdb"/>
+    <w:bookmarkEnd w:id="28"/>
+    <w:bookmarkStart w:id="29" w:name="X231786d8da045f22cfb6544a59075b666112cdb"/>
     <w:p>
       <w:pPr>
         <w:pStyle w:val="Heading3"/>
@@ -4220,8 +3940,8 @@
         <w:t xml:space="preserve">(add_indices))</w:t>
       </w:r>
     </w:p>
-    <w:bookmarkEnd w:id="30"/>
-    <w:bookmarkStart w:id="31" w:name="X4eca77374d8b0e779af7afe908a4b7ed04f26a6"/>
+    <w:bookmarkEnd w:id="29"/>
+    <w:bookmarkStart w:id="30" w:name="X4eca77374d8b0e779af7afe908a4b7ed04f26a6"/>
     <w:p>
       <w:pPr>
         <w:pStyle w:val="Heading3"/>
@@ -4714,9 +4434,9 @@
         <w:t xml:space="preserve"># quiebres 2016 (El Nino), 2020 (La Nina), 2023-24 (El Nino)</w:t>
       </w:r>
     </w:p>
+    <w:bookmarkEnd w:id="30"/>
     <w:bookmarkEnd w:id="31"/>
-    <w:bookmarkEnd w:id="32"/>
-    <w:bookmarkStart w:id="35" w:name="X5564c560101fed8ef34ec75486d574edcd53951"/>
+    <w:bookmarkStart w:id="34" w:name="X5564c560101fed8ef34ec75486d574edcd53951"/>
     <w:p>
       <w:pPr>
         <w:pStyle w:val="Heading2"/>
@@ -4728,7 +4448,7 @@
         <w:t xml:space="preserve">E.2 Reproyección al sistema oficial colombiano y topología DE-9IM</w:t>
       </w:r>
     </w:p>
-    <w:bookmarkStart w:id="33" w:name="X31781a5437144d837b45bd64f1f50d5cfbe2b9e"/>
+    <w:bookmarkStart w:id="32" w:name="X31781a5437144d837b45bd64f1f50d5cfbe2b9e"/>
     <w:p>
       <w:pPr>
         <w:pStyle w:val="Heading3"/>
@@ -5159,8 +4879,8 @@
         <w:t xml:space="preserve"># contains con los puntos INVEMAR</w:t>
       </w:r>
     </w:p>
-    <w:bookmarkEnd w:id="33"/>
-    <w:bookmarkStart w:id="34" w:name="X32380bf0a00da97b05b1c0f73201a606fb69033"/>
+    <w:bookmarkEnd w:id="32"/>
+    <w:bookmarkStart w:id="33" w:name="X32380bf0a00da97b05b1c0f73201a606fb69033"/>
     <w:p>
       <w:pPr>
         <w:pStyle w:val="Heading3"/>
@@ -5710,9 +5430,9 @@
         <w:t xml:space="preserve"># parches vectoriales</w:t>
       </w:r>
     </w:p>
+    <w:bookmarkEnd w:id="33"/>
     <w:bookmarkEnd w:id="34"/>
-    <w:bookmarkEnd w:id="35"/>
-    <w:bookmarkStart w:id="38" w:name="Xbcff38372e88ef926b7df2bfb1aae6dce9089dc"/>
+    <w:bookmarkStart w:id="37" w:name="Xbcff38372e88ef926b7df2bfb1aae6dce9089dc"/>
     <w:p>
       <w:pPr>
         <w:pStyle w:val="Heading2"/>
@@ -5724,7 +5444,7 @@
         <w:t xml:space="preserve">E.3 Forzamiento climático y detección SAR</w:t>
       </w:r>
     </w:p>
-    <w:bookmarkStart w:id="36" w:name="X37cf50bdef44f339f5979a117beec730177981e"/>
+    <w:bookmarkStart w:id="35" w:name="X37cf50bdef44f339f5979a117beec730177981e"/>
     <w:p>
       <w:pPr>
         <w:pStyle w:val="Heading3"/>
@@ -6576,8 +6296,8 @@
         <w:t xml:space="preserve">)</w:t>
       </w:r>
     </w:p>
-    <w:bookmarkEnd w:id="36"/>
-    <w:bookmarkStart w:id="37" w:name="Xc17b12397ade9500b7e4fa0f94b6ad907d732c1"/>
+    <w:bookmarkEnd w:id="35"/>
+    <w:bookmarkStart w:id="36" w:name="Xc17b12397ade9500b7e4fa0f94b6ad907d732c1"/>
     <w:p>
       <w:pPr>
         <w:pStyle w:val="Heading3"/>
@@ -6935,9 +6655,9 @@
         <w:t xml:space="preserve"># bajo dosel</w:t>
       </w:r>
     </w:p>
+    <w:bookmarkEnd w:id="36"/>
     <w:bookmarkEnd w:id="37"/>
-    <w:bookmarkEnd w:id="38"/>
-    <w:bookmarkStart w:id="40" w:name="X7977fb776ea495598938f87ab7173f02a1201d1"/>
+    <w:bookmarkStart w:id="39" w:name="X7977fb776ea495598938f87ab7173f02a1201d1"/>
     <w:p>
       <w:pPr>
         <w:pStyle w:val="Heading2"/>
@@ -6949,7 +6669,7 @@
         <w:t xml:space="preserve">E.4 Métricas de fragmentación del paisaje (Julia)</w:t>
       </w:r>
     </w:p>
-    <w:bookmarkStart w:id="39" w:name="Xc49ea036c39efa007a57f8633c5578fa66ce2f4"/>
+    <w:bookmarkStart w:id="38" w:name="Xc49ea036c39efa007a57f8633c5578fa66ce2f4"/>
     <w:p>
       <w:pPr>
         <w:pStyle w:val="Heading3"/>
@@ -7931,10 +7651,10 @@
         <w:t xml:space="preserve">end</w:t>
       </w:r>
     </w:p>
+    <w:bookmarkEnd w:id="38"/>
     <w:bookmarkEnd w:id="39"/>
     <w:bookmarkEnd w:id="40"/>
-    <w:bookmarkEnd w:id="41"/>
-    <w:bookmarkStart w:id="70" w:name="Xf9b7d80bdcd0190faba938e4eea7d98f2c573ff"/>
+    <w:bookmarkStart w:id="69" w:name="Xf9b7d80bdcd0190faba938e4eea7d98f2c573ff"/>
     <w:p>
       <w:pPr>
         <w:pStyle w:val="Heading1"/>
@@ -7957,7 +7677,7 @@
         <w:t xml:space="preserve">Para mantener el cuerpo del informe centrado en la narrativa de los hallazgos, dos tablas de detalle metodológico se reubican en este anexo: el cruce estación por estación entre la señal SAR de septiembre 2020, la anomalía NDVI y la frecuencia de inundación histórica de la Global Flood Database (referida en la sección de Validación con datos NASA), y las nueve transiciones de superficie del JRC Global Surface Water 1984–2021 (referida en la sección de Dinámica hídrica).</w:t>
       </w:r>
     </w:p>
-    <w:bookmarkStart w:id="43" w:name="f.1-cruce-sar-ndvi-gfd-por-estación"/>
+    <w:bookmarkStart w:id="42" w:name="f.1-cruce-sar-ndvi-gfd-por-estación"/>
     <w:p>
       <w:pPr>
         <w:pStyle w:val="Heading2"/>
@@ -8003,7 +7723,7 @@
               <w:right w:w="60" w:type="dxa"/>
             </w:tcMar>
           </w:tcPr>
-          <w:bookmarkStart w:id="42" w:name="tbl-cruce"/>
+          <w:bookmarkStart w:id="41" w:name="tbl-cruce"/>
           <w:p>
             <w:pPr>
               <w:spacing w:before="0" w:after="0"/>
@@ -8881,7 +8601,7 @@
               </w:tc>
             </w:tr>
           </w:tbl>
-          <w:bookmarkEnd w:id="42"/>
+          <w:bookmarkEnd w:id="41"/>
           <w:p>
             <w:pPr>
               <w:spacing w:before="0" w:after="0"/>
@@ -8890,8 +8610,8 @@
         </w:tc>
       </w:tr>
     </w:tbl>
-    <w:bookmarkEnd w:id="43"/>
-    <w:bookmarkStart w:id="45" w:name="X364aa66bd21376b72fb5dd0bc6c04bd6ccaca5b"/>
+    <w:bookmarkEnd w:id="42"/>
+    <w:bookmarkStart w:id="44" w:name="X364aa66bd21376b72fb5dd0bc6c04bd6ccaca5b"/>
     <w:p>
       <w:pPr>
         <w:pStyle w:val="Heading2"/>
@@ -8937,7 +8657,7 @@
               <w:right w:w="60" w:type="dxa"/>
             </w:tcMar>
           </w:tcPr>
-          <w:bookmarkStart w:id="44" w:name="tbl-jrc"/>
+          <w:bookmarkStart w:id="43" w:name="tbl-jrc"/>
           <w:p>
             <w:pPr>
               <w:spacing w:before="0" w:after="0"/>
@@ -9384,7 +9104,7 @@
               </w:tc>
             </w:tr>
           </w:tbl>
-          <w:bookmarkEnd w:id="44"/>
+          <w:bookmarkEnd w:id="43"/>
           <w:p>
             <w:pPr>
               <w:spacing w:before="0" w:after="0"/>
@@ -9393,8 +9113,8 @@
         </w:tc>
       </w:tr>
     </w:tbl>
-    <w:bookmarkEnd w:id="45"/>
-    <w:bookmarkStart w:id="47" w:name="f.3-entorno-de-ejecución-runtime-docker"/>
+    <w:bookmarkEnd w:id="44"/>
+    <w:bookmarkStart w:id="46" w:name="f.3-entorno-de-ejecución-runtime-docker"/>
     <w:p>
       <w:pPr>
         <w:pStyle w:val="Heading2"/>
@@ -9440,7 +9160,7 @@
               <w:right w:w="60" w:type="dxa"/>
             </w:tcMar>
           </w:tcPr>
-          <w:bookmarkStart w:id="46" w:name="tbl-entorno"/>
+          <w:bookmarkStart w:id="45" w:name="tbl-entorno"/>
           <w:p>
             <w:pPr>
               <w:spacing w:before="0" w:after="0"/>
@@ -9699,7 +9419,7 @@
               </w:tc>
             </w:tr>
           </w:tbl>
-          <w:bookmarkEnd w:id="46"/>
+          <w:bookmarkEnd w:id="45"/>
           <w:p>
             <w:pPr>
               <w:spacing w:before="0" w:after="0"/>
@@ -9708,8 +9428,8 @@
         </w:tc>
       </w:tr>
     </w:tbl>
-    <w:bookmarkEnd w:id="47"/>
-    <w:bookmarkStart w:id="49" w:name="Xd12ae059d3ba0d969b87a58862484b9358d3faf"/>
+    <w:bookmarkEnd w:id="46"/>
+    <w:bookmarkStart w:id="48" w:name="Xd12ae059d3ba0d969b87a58862484b9358d3faf"/>
     <w:p>
       <w:pPr>
         <w:pStyle w:val="Heading2"/>
@@ -9755,7 +9475,7 @@
               <w:right w:w="60" w:type="dxa"/>
             </w:tcMar>
           </w:tcPr>
-          <w:bookmarkStart w:id="48" w:name="tbl-bfast"/>
+          <w:bookmarkStart w:id="47" w:name="tbl-bfast"/>
           <w:p>
             <w:pPr>
               <w:spacing w:before="0" w:after="0"/>
@@ -10430,7 +10150,7 @@
               </w:tc>
             </w:tr>
           </w:tbl>
-          <w:bookmarkEnd w:id="48"/>
+          <w:bookmarkEnd w:id="47"/>
           <w:p>
             <w:pPr>
               <w:spacing w:before="0" w:after="0"/>
@@ -10439,8 +10159,8 @@
         </w:tc>
       </w:tr>
     </w:tbl>
-    <w:bookmarkEnd w:id="49"/>
-    <w:bookmarkStart w:id="51" w:name="X9c9bec29f003208988a513cfcef0650479e4fe5"/>
+    <w:bookmarkEnd w:id="48"/>
+    <w:bookmarkStart w:id="50" w:name="X9c9bec29f003208988a513cfcef0650479e4fe5"/>
     <w:p>
       <w:pPr>
         <w:pStyle w:val="Heading2"/>
@@ -10486,7 +10206,7 @@
               <w:right w:w="60" w:type="dxa"/>
             </w:tcMar>
           </w:tcPr>
-          <w:bookmarkStart w:id="50" w:name="tbl-topología-acotado"/>
+          <w:bookmarkStart w:id="49" w:name="tbl-topología-acotado"/>
           <w:p>
             <w:pPr>
               <w:spacing w:before="0" w:after="0"/>
@@ -10851,7 +10571,7 @@
               </w:tc>
             </w:tr>
           </w:tbl>
-          <w:bookmarkEnd w:id="50"/>
+          <w:bookmarkEnd w:id="49"/>
           <w:p>
             <w:pPr>
               <w:spacing w:before="0" w:after="0"/>
@@ -10860,8 +10580,8 @@
         </w:tc>
       </w:tr>
     </w:tbl>
-    <w:bookmarkEnd w:id="51"/>
-    <w:bookmarkStart w:id="53" w:name="X501d80bdcd328d56103e63896d85b8645ff7764"/>
+    <w:bookmarkEnd w:id="50"/>
+    <w:bookmarkStart w:id="52" w:name="X501d80bdcd328d56103e63896d85b8645ff7764"/>
     <w:p>
       <w:pPr>
         <w:pStyle w:val="Heading2"/>
@@ -10907,7 +10627,7 @@
               <w:right w:w="60" w:type="dxa"/>
             </w:tcMar>
           </w:tcPr>
-          <w:bookmarkStart w:id="52" w:name="tbl-anomalias"/>
+          <w:bookmarkStart w:id="51" w:name="tbl-anomalias"/>
           <w:p>
             <w:pPr>
               <w:spacing w:before="0" w:after="0"/>
@@ -11576,7 +11296,7 @@
               </w:tc>
             </w:tr>
           </w:tbl>
-          <w:bookmarkEnd w:id="52"/>
+          <w:bookmarkEnd w:id="51"/>
           <w:p>
             <w:pPr>
               <w:spacing w:before="0" w:after="0"/>
@@ -11585,8 +11305,8 @@
         </w:tc>
       </w:tr>
     </w:tbl>
-    <w:bookmarkEnd w:id="53"/>
-    <w:bookmarkStart w:id="55" w:name="Xbb9f66bcbe6aa26a3631a0f9cf99227e4dd9eff"/>
+    <w:bookmarkEnd w:id="52"/>
+    <w:bookmarkStart w:id="54" w:name="Xbb9f66bcbe6aa26a3631a0f9cf99227e4dd9eff"/>
     <w:p>
       <w:pPr>
         <w:pStyle w:val="Heading2"/>
@@ -11632,7 +11352,7 @@
               <w:right w:w="60" w:type="dxa"/>
             </w:tcMar>
           </w:tcPr>
-          <w:bookmarkStart w:id="54" w:name="tbl-flujo"/>
+          <w:bookmarkStart w:id="53" w:name="tbl-flujo"/>
           <w:p>
             <w:pPr>
               <w:spacing w:before="0" w:after="0"/>
@@ -12618,7 +12338,7 @@
               </w:tc>
             </w:tr>
           </w:tbl>
-          <w:bookmarkEnd w:id="54"/>
+          <w:bookmarkEnd w:id="53"/>
           <w:p>
             <w:pPr>
               <w:spacing w:before="0" w:after="0"/>
@@ -12627,8 +12347,8 @@
         </w:tc>
       </w:tr>
     </w:tbl>
-    <w:bookmarkEnd w:id="55"/>
-    <w:bookmarkStart w:id="57" w:name="X194c8624d719e92b82f5e252a5a924f4fde0815"/>
+    <w:bookmarkEnd w:id="54"/>
+    <w:bookmarkStart w:id="56" w:name="X194c8624d719e92b82f5e252a5a924f4fde0815"/>
     <w:p>
       <w:pPr>
         <w:pStyle w:val="Heading2"/>
@@ -12674,7 +12394,7 @@
               <w:right w:w="60" w:type="dxa"/>
             </w:tcMar>
           </w:tcPr>
-          <w:bookmarkStart w:id="56" w:name="tbl-gfd"/>
+          <w:bookmarkStart w:id="55" w:name="tbl-gfd"/>
           <w:p>
             <w:pPr>
               <w:spacing w:before="0" w:after="0"/>
@@ -13450,7 +13170,7 @@
               </w:tc>
             </w:tr>
           </w:tbl>
-          <w:bookmarkEnd w:id="56"/>
+          <w:bookmarkEnd w:id="55"/>
           <w:p>
             <w:pPr>
               <w:spacing w:before="0" w:after="0"/>
@@ -13459,8 +13179,8 @@
         </w:tc>
       </w:tr>
     </w:tbl>
-    <w:bookmarkEnd w:id="57"/>
-    <w:bookmarkStart w:id="59" w:name="X5fca0ff0a22fd6515493c94312e7e70e4282837"/>
+    <w:bookmarkEnd w:id="56"/>
+    <w:bookmarkStart w:id="58" w:name="X5fca0ff0a22fd6515493c94312e7e70e4282837"/>
     <w:p>
       <w:pPr>
         <w:pStyle w:val="Heading2"/>
@@ -13506,7 +13226,7 @@
               <w:right w:w="60" w:type="dxa"/>
             </w:tcMar>
           </w:tcPr>
-          <w:bookmarkStart w:id="58" w:name="tbl-sar-ndvi-corr"/>
+          <w:bookmarkStart w:id="57" w:name="tbl-sar-ndvi-corr"/>
           <w:p>
             <w:pPr>
               <w:spacing w:before="0" w:after="0"/>
@@ -14463,7 +14183,7 @@
               </w:tc>
             </w:tr>
           </w:tbl>
-          <w:bookmarkEnd w:id="58"/>
+          <w:bookmarkEnd w:id="57"/>
           <w:p>
             <w:pPr>
               <w:spacing w:before="0" w:after="0"/>
@@ -14472,8 +14192,8 @@
         </w:tc>
       </w:tr>
     </w:tbl>
-    <w:bookmarkEnd w:id="59"/>
-    <w:bookmarkStart w:id="61" w:name="f.10-datacubes-netcdf-materializados"/>
+    <w:bookmarkEnd w:id="58"/>
+    <w:bookmarkStart w:id="60" w:name="f.10-datacubes-netcdf-materializados"/>
     <w:p>
       <w:pPr>
         <w:pStyle w:val="Heading2"/>
@@ -14519,7 +14239,7 @@
               <w:right w:w="60" w:type="dxa"/>
             </w:tcMar>
           </w:tcPr>
-          <w:bookmarkStart w:id="60" w:name="tbl-cubos"/>
+          <w:bookmarkStart w:id="59" w:name="tbl-cubos"/>
           <w:p>
             <w:pPr>
               <w:spacing w:before="0" w:after="0"/>
@@ -14888,7 +14608,7 @@
               </w:tc>
             </w:tr>
           </w:tbl>
-          <w:bookmarkEnd w:id="60"/>
+          <w:bookmarkEnd w:id="59"/>
           <w:p>
             <w:pPr>
               <w:spacing w:before="0" w:after="0"/>
@@ -14897,8 +14617,8 @@
         </w:tc>
       </w:tr>
     </w:tbl>
-    <w:bookmarkEnd w:id="61"/>
-    <w:bookmarkStart w:id="63" w:name="Xc7d3c8e5671cfccb082f1b47be3d7613664a478"/>
+    <w:bookmarkEnd w:id="60"/>
+    <w:bookmarkStart w:id="62" w:name="Xc7d3c8e5671cfccb082f1b47be3d7613664a478"/>
     <w:p>
       <w:pPr>
         <w:pStyle w:val="Heading2"/>
@@ -14944,7 +14664,7 @@
               <w:right w:w="60" w:type="dxa"/>
             </w:tcMar>
           </w:tcPr>
-          <w:bookmarkStart w:id="62" w:name="tbl-enso-corr"/>
+          <w:bookmarkStart w:id="61" w:name="tbl-enso-corr"/>
           <w:p>
             <w:pPr>
               <w:spacing w:before="0" w:after="0"/>
@@ -15888,7 +15608,7 @@
               </w:tc>
             </w:tr>
           </w:tbl>
-          <w:bookmarkEnd w:id="62"/>
+          <w:bookmarkEnd w:id="61"/>
           <w:p>
             <w:pPr>
               <w:spacing w:before="0" w:after="0"/>
@@ -15897,8 +15617,8 @@
         </w:tc>
       </w:tr>
     </w:tbl>
-    <w:bookmarkEnd w:id="63"/>
-    <w:bookmarkStart w:id="65" w:name="Xcb7e1b1cb3a5e4b516e26c9f35cfae7747dd31c"/>
+    <w:bookmarkEnd w:id="62"/>
+    <w:bookmarkStart w:id="64" w:name="Xcb7e1b1cb3a5e4b516e26c9f35cfae7747dd31c"/>
     <w:p>
       <w:pPr>
         <w:pStyle w:val="Heading2"/>
@@ -15944,7 +15664,7 @@
               <w:right w:w="60" w:type="dxa"/>
             </w:tcMar>
           </w:tcPr>
-          <w:bookmarkStart w:id="64" w:name="tbl-caudal-corr"/>
+          <w:bookmarkStart w:id="63" w:name="tbl-caudal-corr"/>
           <w:p>
             <w:pPr>
               <w:spacing w:before="0" w:after="0"/>
@@ -17409,7 +17129,7 @@
               </w:tc>
             </w:tr>
           </w:tbl>
-          <w:bookmarkEnd w:id="64"/>
+          <w:bookmarkEnd w:id="63"/>
           <w:p>
             <w:pPr>
               <w:spacing w:before="0" w:after="0"/>
@@ -17418,8 +17138,8 @@
         </w:tc>
       </w:tr>
     </w:tbl>
-    <w:bookmarkEnd w:id="65"/>
-    <w:bookmarkStart w:id="67" w:name="X97931b32f11595c28dc0618b382a6ab4fc06fd8"/>
+    <w:bookmarkEnd w:id="64"/>
+    <w:bookmarkStart w:id="66" w:name="X97931b32f11595c28dc0618b382a6ab4fc06fd8"/>
     <w:p>
       <w:pPr>
         <w:pStyle w:val="Heading2"/>
@@ -17465,7 +17185,7 @@
               <w:right w:w="60" w:type="dxa"/>
             </w:tcMar>
           </w:tcPr>
-          <w:bookmarkStart w:id="66" w:name="tbl-chirps-corr"/>
+          <w:bookmarkStart w:id="65" w:name="tbl-chirps-corr"/>
           <w:p>
             <w:pPr>
               <w:spacing w:before="0" w:after="0"/>
@@ -18258,7 +17978,7 @@
               </w:tc>
             </w:tr>
           </w:tbl>
-          <w:bookmarkEnd w:id="66"/>
+          <w:bookmarkEnd w:id="65"/>
           <w:p>
             <w:pPr>
               <w:spacing w:before="0" w:after="0"/>
@@ -18267,8 +17987,8 @@
         </w:tc>
       </w:tr>
     </w:tbl>
-    <w:bookmarkEnd w:id="67"/>
-    <w:bookmarkStart w:id="69" w:name="X81fa82d784a23f908434ebae2c5c115d78410ff"/>
+    <w:bookmarkEnd w:id="66"/>
+    <w:bookmarkStart w:id="68" w:name="X81fa82d784a23f908434ebae2c5c115d78410ff"/>
     <w:p>
       <w:pPr>
         <w:pStyle w:val="Heading2"/>
@@ -18314,7 +18034,7 @@
               <w:right w:w="60" w:type="dxa"/>
             </w:tcMar>
           </w:tcPr>
-          <w:bookmarkStart w:id="68" w:name="tbl-era5"/>
+          <w:bookmarkStart w:id="67" w:name="tbl-era5"/>
           <w:p>
             <w:pPr>
               <w:spacing w:before="0" w:after="0"/>
@@ -19244,7 +18964,7 @@
               </w:tc>
             </w:tr>
           </w:tbl>
-          <w:bookmarkEnd w:id="68"/>
+          <w:bookmarkEnd w:id="67"/>
           <w:p>
             <w:pPr>
               <w:spacing w:before="0" w:after="0"/>
@@ -19253,8 +18973,8 @@
         </w:tc>
       </w:tr>
     </w:tbl>
+    <w:bookmarkEnd w:id="68"/>
     <w:bookmarkEnd w:id="69"/>
-    <w:bookmarkEnd w:id="70"/>
     <w:sectPr/>
   </w:body>
 </w:document>

</xml_diff>

<commit_message>
Re-render tras correcciones de tildes, calques y promptable
</commit_message>
<xml_diff>
--- a/docs/informe_anexos.docx
+++ b/docs/informe_anexos.docx
@@ -805,7 +805,7 @@
           <w:rStyle w:val="CommentTok"/>
           <w:color w:val="000000"/>
         </w:rPr>
-        <w:t xml:space="preserve"># 2) Aceptar terminos del dataset reanalysis-era5-land-monthly-means</w:t>
+        <w:t xml:space="preserve"># 2) Aceptar terminos del conjunto de datos reanalysis-era5-land-monthly-means</w:t>
       </w:r>
       <w:r>
         <w:rPr>
@@ -1419,7 +1419,7 @@
           <w:rStyle w:val="VerbatimChar"/>
           <w:color w:val="000000"/>
         </w:rPr>
-        <w:t xml:space="preserve">│   └── julia/        04_fragmentacion.jl (4326 legado + 9377 vigente),</w:t>
+        <w:t xml:space="preserve">│   └── julia/        04_fragmentación.jl (4326 legado + 9377 vigente),</w:t>
       </w:r>
       <w:r>
         <w:rPr>
@@ -1694,7 +1694,7 @@
         <w:rPr>
           <w:color w:val="000000"/>
         </w:rPr>
-        <w:t xml:space="preserve">Las cifras de fragmentacion sobre el AOI acotado se reportan en dos implementaciones independientes que arrojan conteos distintos del mismo conjunto de GeoJSON. En Julia, mediante el algoritmo del shoelace aplicado al anillo exterior de cada polígono (Tabla</w:t>
+        <w:t xml:space="preserve">Las cifras de fragmentación sobre el AOI acotado se reportan en dos implementaciones independientes que arrojan conteos distintos del mismo conjunto de GeoJSON. En Julia, mediante el algoritmo del shoelace aplicado al anillo exterior de cada polígono (Tabla</w:t>
       </w:r>
       <w:r>
         <w:rPr>
@@ -1707,7 +1707,7 @@
           <w:rStyle w:val="VerbatimChar"/>
           <w:color w:val="000000"/>
         </w:rPr>
-        <w:t xml:space="preserve">tbl-fragmentacion-acotado</w:t>
+        <w:t xml:space="preserve">tbl-fragmentación-acotado</w:t>
       </w:r>
       <w:r>
         <w:rPr>
@@ -1818,7 +1818,7 @@
         <w:rPr>
           <w:color w:val="000000"/>
         </w:rPr>
-        <w:t xml:space="preserve">calcula el área neta restando los huecos –siguiendo la definicion estandar del Simple Features Access para</w:t>
+        <w:t xml:space="preserve">calcula el área neta restando los huecos –siguiendo la definición estándar del Simple Features Access para</w:t>
       </w:r>
       <w:r>
         <w:rPr>
@@ -1875,7 +1875,7 @@
         <w:rPr>
           <w:color w:val="000000"/>
         </w:rPr>
-        <w:t xml:space="preserve">, lo que infla el conteo de parches Julia en periodos donde la dinámica hídrica produce huecos detectables –2020 (degradación) y 2022 (recuperación), cuando los canales atraviesan manglar fragmentado por La Niña y la rehabilitacion hidráulica– y coincide en el periodo actual (2024-2025) donde los parches sobrevivientes son más compactos sin canales internos visibles.</w:t>
+        <w:t xml:space="preserve">, lo que infla el conteo de parches Julia en periodos donde la dinámica hídrica produce huecos detectables –2020 (degradación) y 2022 (recuperación), cuando los canales atraviesan manglar fragmentado por La Niña y la rehabilitación hidráulica– y coincide en el periodo actual (2024-2025) donde los parches sobrevivientes son más compactos sin canales internos visibles.</w:t>
       </w:r>
     </w:p>
     <w:p>
@@ -1924,7 +1924,7 @@
           <w:rStyle w:val="VerbatimChar"/>
           <w:color w:val="000000"/>
         </w:rPr>
-        <w:t xml:space="preserve">tbl-fragmentacion-acotado</w:t>
+        <w:t xml:space="preserve">tbl-fragmentación-acotado</w:t>
       </w:r>
       <w:r>
         <w:rPr>
@@ -2113,7 +2113,7 @@
           <w:rStyle w:val="VerbatimChar"/>
           <w:color w:val="000000"/>
         </w:rPr>
-        <w:t xml:space="preserve">xarray.open_dataset</w:t>
+        <w:t xml:space="preserve">xarray.open_conjunto de datos</w:t>
       </w:r>
       <w:r>
         <w:rPr>
@@ -2223,7 +2223,7 @@
           <w:rStyle w:val="NormalTok"/>
           <w:color w:val="000000"/>
         </w:rPr>
-        <w:t xml:space="preserve"> xr.open_dataset(</w:t>
+        <w:t xml:space="preserve"> xr.open_conjunto de datos(</w:t>
       </w:r>
       <w:r>
         <w:rPr>
@@ -4880,7 +4880,7 @@
       </w:r>
     </w:p>
     <w:bookmarkEnd w:id="32"/>
-    <w:bookmarkStart w:id="33" w:name="X32380bf0a00da97b05b1c0f73201a606fb69033"/>
+    <w:bookmarkStart w:id="33" w:name="Xcc74f98a6517400f1a2a7243792582fd6693bd0"/>
     <w:p>
       <w:pPr>
         <w:pStyle w:val="Heading3"/>
@@ -4889,7 +4889,7 @@
         <w:rPr>
           <w:color w:val="000000"/>
         </w:rPr>
-        <w:t xml:space="preserve">E.2.b Segmentación promptable con SamGeo vit_b y vectorización por periodo</w:t>
+        <w:t xml:space="preserve">E.2.b Segmentación guiada por prompts con SamGeo vit_b y vectorización por periodo</w:t>
       </w:r>
     </w:p>
     <w:p>
@@ -5502,7 +5502,7 @@
           <w:rStyle w:val="VerbatimChar"/>
           <w:color w:val="000000"/>
         </w:rPr>
-        <w:t xml:space="preserve">xarray.open_dataset(chunks=...)</w:t>
+        <w:t xml:space="preserve">xarray.open_conjunto de datos(chunks=...)</w:t>
       </w:r>
       <w:r>
         <w:rPr>
@@ -6154,7 +6154,7 @@
           <w:rStyle w:val="NormalTok"/>
           <w:color w:val="000000"/>
         </w:rPr>
-        <w:t xml:space="preserve"> xr.open_dataset(</w:t>
+        <w:t xml:space="preserve"> xr.open_conjunto de datos(</w:t>
       </w:r>
       <w:r>
         <w:rPr>
@@ -7004,7 +7004,7 @@
           <w:rStyle w:val="CommentTok"/>
           <w:color w:val="000000"/>
         </w:rPr>
-        <w:t xml:space="preserve"># Area por formula del cordon (shoelace) y perimetro en metros</w:t>
+        <w:t xml:space="preserve"># Area por formula del cordon (shoelace) y perímetro en metros</w:t>
       </w:r>
       <w:r>
         <w:rPr>

</xml_diff>

<commit_message>
DOCX embellecedor: header azul-cyan + bordes finos + emojis estado coloreados
Estilo nuevo de tablas:
- Header con fondo azul medio (#2E86AB) y texto blanco bold
- Bordes finos grises (#BFBFBF, 0.5 pt) en lugar de sin bordes
- Body con fondo blanco, texto negro 10 pt
- Padding interno compacto (40-60 dxa)

Reemplazo de emojis de estado para que rendericen con color en Word:
- Detecta 🟢/🟡/🔴 en cualquier run (body o tabla)
- Sustituye por ● coloreado (verde #4CAF50, amarillo #FFC107, rojo #F44336)
- Word renderiza ● fiable en cualquier fuente (sin hatching monocromo)
- Preserva el color al final del pipeline (excluye runs de estado del
  paso force_body_text_black)

Aplica a 24 tablas en informe_final + 14 tablas en informe_anexos.
</commit_message>
<xml_diff>
--- a/docs/informe_anexos.docx
+++ b/docs/informe_anexos.docx
@@ -7696,12 +7696,12 @@
         <w:jc w:val="start"/>
         <w:tblLayout w:type="autofit"/>
         <w:tblBorders>
-          <w:top w:val="nil"/>
-          <w:left w:val="nil"/>
-          <w:bottom w:val="nil"/>
-          <w:right w:val="nil"/>
-          <w:insideH w:val="nil"/>
-          <w:insideV w:val="nil"/>
+          <w:top w:val="single" w:sz="4" w:color="BFBFBF"/>
+          <w:left w:val="single" w:sz="4" w:color="BFBFBF"/>
+          <w:bottom w:val="single" w:sz="4" w:color="BFBFBF"/>
+          <w:right w:val="single" w:sz="4" w:color="BFBFBF"/>
+          <w:insideH w:val="single" w:sz="4" w:color="BFBFBF"/>
+          <w:insideV w:val="single" w:sz="4" w:color="BFBFBF"/>
         </w:tblBorders>
       </w:tblPr>
       <w:tblGrid>
@@ -7710,11 +7710,17 @@
       <w:tr>
         <w:tc>
           <w:tcPr>
+            <w:tcMar>
+              <w:top w:w="40" w:type="dxa"/>
+              <w:left w:w="60" w:type="dxa"/>
+              <w:bottom w:w="40" w:type="dxa"/>
+              <w:right w:w="60" w:type="dxa"/>
+            </w:tcMar>
             <w:tcBorders>
-              <w:top w:val="nil"/>
-              <w:left w:val="nil"/>
-              <w:bottom w:val="nil"/>
-              <w:right w:val="nil"/>
+              <w:top w:val="single" w:sz="4" w:color="BFBFBF"/>
+              <w:left w:val="single" w:sz="4" w:color="BFBFBF"/>
+              <w:bottom w:val="single" w:sz="4" w:color="BFBFBF"/>
+              <w:right w:val="single" w:sz="4" w:color="BFBFBF"/>
             </w:tcBorders>
             <w:tcMar>
               <w:top w:w="40" w:type="dxa"/>
@@ -7722,6 +7728,7 @@
               <w:bottom w:w="40" w:type="dxa"/>
               <w:right w:w="60" w:type="dxa"/>
             </w:tcMar>
+            <w:shd w:val="clear" w:color="auto" w:fill="2E86AB"/>
           </w:tcPr>
           <w:bookmarkStart w:id="41" w:name="tbl-cruce"/>
           <w:p>
@@ -7737,7 +7744,7 @@
             <w:r>
               <w:rPr>
                 <w:b/>
-                <w:color w:val="000000"/>
+                <w:color w:val="FFFFFF"/>
                 <w:sz w:val="20"/>
               </w:rPr>
               <w:t xml:space="preserve">Tabla 1: Cruce de señal SAR, NDVI y frecuencia de inundación histórica por estación, restringido al AOI acotado SFF + VPI Salamanca.</w:t>
@@ -8630,12 +8637,12 @@
         <w:jc w:val="start"/>
         <w:tblLayout w:type="autofit"/>
         <w:tblBorders>
-          <w:top w:val="nil"/>
-          <w:left w:val="nil"/>
-          <w:bottom w:val="nil"/>
-          <w:right w:val="nil"/>
-          <w:insideH w:val="nil"/>
-          <w:insideV w:val="nil"/>
+          <w:top w:val="single" w:sz="4" w:color="BFBFBF"/>
+          <w:left w:val="single" w:sz="4" w:color="BFBFBF"/>
+          <w:bottom w:val="single" w:sz="4" w:color="BFBFBF"/>
+          <w:right w:val="single" w:sz="4" w:color="BFBFBF"/>
+          <w:insideH w:val="single" w:sz="4" w:color="BFBFBF"/>
+          <w:insideV w:val="single" w:sz="4" w:color="BFBFBF"/>
         </w:tblBorders>
       </w:tblPr>
       <w:tblGrid>
@@ -8644,11 +8651,17 @@
       <w:tr>
         <w:tc>
           <w:tcPr>
+            <w:tcMar>
+              <w:top w:w="40" w:type="dxa"/>
+              <w:left w:w="60" w:type="dxa"/>
+              <w:bottom w:w="40" w:type="dxa"/>
+              <w:right w:w="60" w:type="dxa"/>
+            </w:tcMar>
             <w:tcBorders>
-              <w:top w:val="nil"/>
-              <w:left w:val="nil"/>
-              <w:bottom w:val="nil"/>
-              <w:right w:val="nil"/>
+              <w:top w:val="single" w:sz="4" w:color="BFBFBF"/>
+              <w:left w:val="single" w:sz="4" w:color="BFBFBF"/>
+              <w:bottom w:val="single" w:sz="4" w:color="BFBFBF"/>
+              <w:right w:val="single" w:sz="4" w:color="BFBFBF"/>
             </w:tcBorders>
             <w:tcMar>
               <w:top w:w="40" w:type="dxa"/>
@@ -8656,6 +8669,7 @@
               <w:bottom w:w="40" w:type="dxa"/>
               <w:right w:w="60" w:type="dxa"/>
             </w:tcMar>
+            <w:shd w:val="clear" w:color="auto" w:fill="2E86AB"/>
           </w:tcPr>
           <w:bookmarkStart w:id="43" w:name="tbl-jrc"/>
           <w:p>
@@ -8671,7 +8685,7 @@
             <w:r>
               <w:rPr>
                 <w:b/>
-                <w:color w:val="000000"/>
+                <w:color w:val="FFFFFF"/>
                 <w:sz w:val="20"/>
               </w:rPr>
               <w:t xml:space="preserve">Tabla 2: Transiciones JRC Global Surface Water (1984–2021) dentro del AOI acotado SFF + VPI Salamanca. El AOI contiene 385,3 km² de agua permanente (&gt;75 % del tiempo) y 44,1 km² estacional (25–75 %), de modo que casi la mitad del polígono protegido es lámina de agua.</w:t>
@@ -9133,12 +9147,12 @@
         <w:jc w:val="start"/>
         <w:tblLayout w:type="autofit"/>
         <w:tblBorders>
-          <w:top w:val="nil"/>
-          <w:left w:val="nil"/>
-          <w:bottom w:val="nil"/>
-          <w:right w:val="nil"/>
-          <w:insideH w:val="nil"/>
-          <w:insideV w:val="nil"/>
+          <w:top w:val="single" w:sz="4" w:color="BFBFBF"/>
+          <w:left w:val="single" w:sz="4" w:color="BFBFBF"/>
+          <w:bottom w:val="single" w:sz="4" w:color="BFBFBF"/>
+          <w:right w:val="single" w:sz="4" w:color="BFBFBF"/>
+          <w:insideH w:val="single" w:sz="4" w:color="BFBFBF"/>
+          <w:insideV w:val="single" w:sz="4" w:color="BFBFBF"/>
         </w:tblBorders>
       </w:tblPr>
       <w:tblGrid>
@@ -9147,11 +9161,17 @@
       <w:tr>
         <w:tc>
           <w:tcPr>
+            <w:tcMar>
+              <w:top w:w="40" w:type="dxa"/>
+              <w:left w:w="60" w:type="dxa"/>
+              <w:bottom w:w="40" w:type="dxa"/>
+              <w:right w:w="60" w:type="dxa"/>
+            </w:tcMar>
             <w:tcBorders>
-              <w:top w:val="nil"/>
-              <w:left w:val="nil"/>
-              <w:bottom w:val="nil"/>
-              <w:right w:val="nil"/>
+              <w:top w:val="single" w:sz="4" w:color="BFBFBF"/>
+              <w:left w:val="single" w:sz="4" w:color="BFBFBF"/>
+              <w:bottom w:val="single" w:sz="4" w:color="BFBFBF"/>
+              <w:right w:val="single" w:sz="4" w:color="BFBFBF"/>
             </w:tcBorders>
             <w:tcMar>
               <w:top w:w="40" w:type="dxa"/>
@@ -9159,6 +9179,7 @@
               <w:bottom w:w="40" w:type="dxa"/>
               <w:right w:w="60" w:type="dxa"/>
             </w:tcMar>
+            <w:shd w:val="clear" w:color="auto" w:fill="2E86AB"/>
           </w:tcPr>
           <w:bookmarkStart w:id="45" w:name="tbl-entorno"/>
           <w:p>
@@ -9174,7 +9195,7 @@
             <w:r>
               <w:rPr>
                 <w:b/>
-                <w:color w:val="000000"/>
+                <w:color w:val="FFFFFF"/>
                 <w:sz w:val="20"/>
               </w:rPr>
               <w:t xml:space="preserve">Tabla 3: Entorno de ejecución completo del proyecto.</w:t>
@@ -9448,12 +9469,12 @@
         <w:jc w:val="start"/>
         <w:tblLayout w:type="autofit"/>
         <w:tblBorders>
-          <w:top w:val="nil"/>
-          <w:left w:val="nil"/>
-          <w:bottom w:val="nil"/>
-          <w:right w:val="nil"/>
-          <w:insideH w:val="nil"/>
-          <w:insideV w:val="nil"/>
+          <w:top w:val="single" w:sz="4" w:color="BFBFBF"/>
+          <w:left w:val="single" w:sz="4" w:color="BFBFBF"/>
+          <w:bottom w:val="single" w:sz="4" w:color="BFBFBF"/>
+          <w:right w:val="single" w:sz="4" w:color="BFBFBF"/>
+          <w:insideH w:val="single" w:sz="4" w:color="BFBFBF"/>
+          <w:insideV w:val="single" w:sz="4" w:color="BFBFBF"/>
         </w:tblBorders>
       </w:tblPr>
       <w:tblGrid>
@@ -9462,11 +9483,17 @@
       <w:tr>
         <w:tc>
           <w:tcPr>
+            <w:tcMar>
+              <w:top w:w="40" w:type="dxa"/>
+              <w:left w:w="60" w:type="dxa"/>
+              <w:bottom w:w="40" w:type="dxa"/>
+              <w:right w:w="60" w:type="dxa"/>
+            </w:tcMar>
             <w:tcBorders>
-              <w:top w:val="nil"/>
-              <w:left w:val="nil"/>
-              <w:bottom w:val="nil"/>
-              <w:right w:val="nil"/>
+              <w:top w:val="single" w:sz="4" w:color="BFBFBF"/>
+              <w:left w:val="single" w:sz="4" w:color="BFBFBF"/>
+              <w:bottom w:val="single" w:sz="4" w:color="BFBFBF"/>
+              <w:right w:val="single" w:sz="4" w:color="BFBFBF"/>
             </w:tcBorders>
             <w:tcMar>
               <w:top w:w="40" w:type="dxa"/>
@@ -9474,6 +9501,7 @@
               <w:bottom w:w="40" w:type="dxa"/>
               <w:right w:w="60" w:type="dxa"/>
             </w:tcMar>
+            <w:shd w:val="clear" w:color="auto" w:fill="2E86AB"/>
           </w:tcPr>
           <w:bookmarkStart w:id="47" w:name="tbl-bfast"/>
           <w:p>
@@ -9489,7 +9517,7 @@
             <w:r>
               <w:rPr>
                 <w:b/>
-                <w:color w:val="000000"/>
+                <w:color w:val="FFFFFF"/>
                 <w:sz w:val="20"/>
               </w:rPr>
               <w:t xml:space="preserve">Tabla 4: Quiebres estructurales detectados por bfast sobre las ocho estaciones del proyecto en la serie combinada Landsat 8 + Sentinel-2 (2013–2025). El análisis refinado sobre las cuatro estaciones de manglar denso se reporta en la tabla</w:t>
@@ -9497,7 +9525,7 @@
             <w:r>
               <w:rPr>
                 <w:b/>
-                <w:color w:val="000000"/>
+                <w:color w:val="FFFFFF"/>
                 <w:sz w:val="20"/>
               </w:rPr>
               <w:t xml:space="preserve"> </w:t>
@@ -9506,7 +9534,7 @@
               <w:rPr>
                 <w:bCs/>
                 <w:b/>
-                <w:color w:val="000000"/>
+                <w:color w:val="FFFFFF"/>
                 <w:sz w:val="20"/>
               </w:rPr>
               <w:t xml:space="preserve">?@tbl-bfast-unificado</w:t>
@@ -9514,7 +9542,7 @@
             <w:r>
               <w:rPr>
                 <w:b/>
-                <w:color w:val="000000"/>
+                <w:color w:val="FFFFFF"/>
                 <w:sz w:val="20"/>
               </w:rPr>
               <w:t xml:space="preserve"> </w:t>
@@ -9522,7 +9550,7 @@
             <w:r>
               <w:rPr>
                 <w:b/>
-                <w:color w:val="000000"/>
+                <w:color w:val="FFFFFF"/>
                 <w:sz w:val="20"/>
               </w:rPr>
               <w:t xml:space="preserve">del informe principal.</w:t>
@@ -10179,12 +10207,12 @@
         <w:jc w:val="start"/>
         <w:tblLayout w:type="autofit"/>
         <w:tblBorders>
-          <w:top w:val="nil"/>
-          <w:left w:val="nil"/>
-          <w:bottom w:val="nil"/>
-          <w:right w:val="nil"/>
-          <w:insideH w:val="nil"/>
-          <w:insideV w:val="nil"/>
+          <w:top w:val="single" w:sz="4" w:color="BFBFBF"/>
+          <w:left w:val="single" w:sz="4" w:color="BFBFBF"/>
+          <w:bottom w:val="single" w:sz="4" w:color="BFBFBF"/>
+          <w:right w:val="single" w:sz="4" w:color="BFBFBF"/>
+          <w:insideH w:val="single" w:sz="4" w:color="BFBFBF"/>
+          <w:insideV w:val="single" w:sz="4" w:color="BFBFBF"/>
         </w:tblBorders>
       </w:tblPr>
       <w:tblGrid>
@@ -10193,11 +10221,17 @@
       <w:tr>
         <w:tc>
           <w:tcPr>
+            <w:tcMar>
+              <w:top w:w="40" w:type="dxa"/>
+              <w:left w:w="60" w:type="dxa"/>
+              <w:bottom w:w="40" w:type="dxa"/>
+              <w:right w:w="60" w:type="dxa"/>
+            </w:tcMar>
             <w:tcBorders>
-              <w:top w:val="nil"/>
-              <w:left w:val="nil"/>
-              <w:bottom w:val="nil"/>
-              <w:right w:val="nil"/>
+              <w:top w:val="single" w:sz="4" w:color="BFBFBF"/>
+              <w:left w:val="single" w:sz="4" w:color="BFBFBF"/>
+              <w:bottom w:val="single" w:sz="4" w:color="BFBFBF"/>
+              <w:right w:val="single" w:sz="4" w:color="BFBFBF"/>
             </w:tcBorders>
             <w:tcMar>
               <w:top w:w="40" w:type="dxa"/>
@@ -10205,6 +10239,7 @@
               <w:bottom w:w="40" w:type="dxa"/>
               <w:right w:w="60" w:type="dxa"/>
             </w:tcMar>
+            <w:shd w:val="clear" w:color="auto" w:fill="2E86AB"/>
           </w:tcPr>
           <w:bookmarkStart w:id="49" w:name="tbl-topología-acotado"/>
           <w:p>
@@ -10220,7 +10255,7 @@
             <w:r>
               <w:rPr>
                 <w:b/>
-                <w:color w:val="000000"/>
+                <w:color w:val="FFFFFF"/>
                 <w:sz w:val="20"/>
               </w:rPr>
               <w:t xml:space="preserve">Tabla 5: Parches de manglar truncados por la frontera del AOI acotado (predicado DE-9IM</w:t>
@@ -10228,7 +10263,7 @@
             <w:r>
               <w:rPr>
                 <w:b/>
-                <w:color w:val="000000"/>
+                <w:color w:val="FFFFFF"/>
                 <w:sz w:val="20"/>
               </w:rPr>
               <w:t xml:space="preserve"> </w:t>
@@ -10237,7 +10272,7 @@
               <w:rPr>
                 <w:rStyle w:val="VerbatimChar"/>
                 <w:b/>
-                <w:color w:val="000000"/>
+                <w:color w:val="FFFFFF"/>
                 <w:sz w:val="20"/>
               </w:rPr>
               <w:t xml:space="preserve">intersects</w:t>
@@ -10245,7 +10280,7 @@
             <w:r>
               <w:rPr>
                 <w:b/>
-                <w:color w:val="000000"/>
+                <w:color w:val="FFFFFF"/>
                 <w:sz w:val="20"/>
               </w:rPr>
               <w:t xml:space="preserve"> </w:t>
@@ -10253,7 +10288,7 @@
             <w:r>
               <w:rPr>
                 <w:b/>
-                <w:color w:val="000000"/>
+                <w:color w:val="FFFFFF"/>
                 <w:sz w:val="20"/>
               </w:rPr>
               <w:t xml:space="preserve">con tolerancia de 30 m). Los parches se cuentan agregados como features completos en</w:t>
@@ -10261,7 +10296,7 @@
             <w:r>
               <w:rPr>
                 <w:b/>
-                <w:color w:val="000000"/>
+                <w:color w:val="FFFFFF"/>
                 <w:sz w:val="20"/>
               </w:rPr>
               <w:t xml:space="preserve"> </w:t>
@@ -10270,7 +10305,7 @@
               <w:rPr>
                 <w:rStyle w:val="VerbatimChar"/>
                 <w:b/>
-                <w:color w:val="000000"/>
+                <w:color w:val="FFFFFF"/>
                 <w:sz w:val="20"/>
               </w:rPr>
               <w:t xml:space="preserve">geopandas</w:t>
@@ -10278,7 +10313,7 @@
             <w:r>
               <w:rPr>
                 <w:b/>
-                <w:color w:val="000000"/>
+                <w:color w:val="FFFFFF"/>
                 <w:sz w:val="20"/>
               </w:rPr>
               <w:t xml:space="preserve">.</w:t>
@@ -10600,12 +10635,12 @@
         <w:jc w:val="start"/>
         <w:tblLayout w:type="autofit"/>
         <w:tblBorders>
-          <w:top w:val="nil"/>
-          <w:left w:val="nil"/>
-          <w:bottom w:val="nil"/>
-          <w:right w:val="nil"/>
-          <w:insideH w:val="nil"/>
-          <w:insideV w:val="nil"/>
+          <w:top w:val="single" w:sz="4" w:color="BFBFBF"/>
+          <w:left w:val="single" w:sz="4" w:color="BFBFBF"/>
+          <w:bottom w:val="single" w:sz="4" w:color="BFBFBF"/>
+          <w:right w:val="single" w:sz="4" w:color="BFBFBF"/>
+          <w:insideH w:val="single" w:sz="4" w:color="BFBFBF"/>
+          <w:insideV w:val="single" w:sz="4" w:color="BFBFBF"/>
         </w:tblBorders>
       </w:tblPr>
       <w:tblGrid>
@@ -10614,11 +10649,17 @@
       <w:tr>
         <w:tc>
           <w:tcPr>
+            <w:tcMar>
+              <w:top w:w="40" w:type="dxa"/>
+              <w:left w:w="60" w:type="dxa"/>
+              <w:bottom w:w="40" w:type="dxa"/>
+              <w:right w:w="60" w:type="dxa"/>
+            </w:tcMar>
             <w:tcBorders>
-              <w:top w:val="nil"/>
-              <w:left w:val="nil"/>
-              <w:bottom w:val="nil"/>
-              <w:right w:val="nil"/>
+              <w:top w:val="single" w:sz="4" w:color="BFBFBF"/>
+              <w:left w:val="single" w:sz="4" w:color="BFBFBF"/>
+              <w:bottom w:val="single" w:sz="4" w:color="BFBFBF"/>
+              <w:right w:val="single" w:sz="4" w:color="BFBFBF"/>
             </w:tcBorders>
             <w:tcMar>
               <w:top w:w="40" w:type="dxa"/>
@@ -10626,6 +10667,7 @@
               <w:bottom w:w="40" w:type="dxa"/>
               <w:right w:w="60" w:type="dxa"/>
             </w:tcMar>
+            <w:shd w:val="clear" w:color="auto" w:fill="2E86AB"/>
           </w:tcPr>
           <w:bookmarkStart w:id="51" w:name="tbl-anomalias"/>
           <w:p>
@@ -10641,7 +10683,7 @@
             <w:r>
               <w:rPr>
                 <w:b/>
-                <w:color w:val="000000"/>
+                <w:color w:val="FFFFFF"/>
                 <w:sz w:val="20"/>
               </w:rPr>
               <w:t xml:space="preserve">Tabla 6: Anomalias significativas de NDVI (</w:t>
@@ -10669,7 +10711,7 @@
             <w:r>
               <w:rPr>
                 <w:b/>
-                <w:color w:val="000000"/>
+                <w:color w:val="FFFFFF"/>
                 <w:sz w:val="20"/>
               </w:rPr>
               <w:t xml:space="preserve">) en la serie combinada 2013–2025, ordenadas por z-score decreciente.</w:t>
@@ -11325,12 +11367,12 @@
         <w:jc w:val="start"/>
         <w:tblLayout w:type="autofit"/>
         <w:tblBorders>
-          <w:top w:val="nil"/>
-          <w:left w:val="nil"/>
-          <w:bottom w:val="nil"/>
-          <w:right w:val="nil"/>
-          <w:insideH w:val="nil"/>
-          <w:insideV w:val="nil"/>
+          <w:top w:val="single" w:sz="4" w:color="BFBFBF"/>
+          <w:left w:val="single" w:sz="4" w:color="BFBFBF"/>
+          <w:bottom w:val="single" w:sz="4" w:color="BFBFBF"/>
+          <w:right w:val="single" w:sz="4" w:color="BFBFBF"/>
+          <w:insideH w:val="single" w:sz="4" w:color="BFBFBF"/>
+          <w:insideV w:val="single" w:sz="4" w:color="BFBFBF"/>
         </w:tblBorders>
       </w:tblPr>
       <w:tblGrid>
@@ -11339,11 +11381,17 @@
       <w:tr>
         <w:tc>
           <w:tcPr>
+            <w:tcMar>
+              <w:top w:w="40" w:type="dxa"/>
+              <w:left w:w="60" w:type="dxa"/>
+              <w:bottom w:w="40" w:type="dxa"/>
+              <w:right w:w="60" w:type="dxa"/>
+            </w:tcMar>
             <w:tcBorders>
-              <w:top w:val="nil"/>
-              <w:left w:val="nil"/>
-              <w:bottom w:val="nil"/>
-              <w:right w:val="nil"/>
+              <w:top w:val="single" w:sz="4" w:color="BFBFBF"/>
+              <w:left w:val="single" w:sz="4" w:color="BFBFBF"/>
+              <w:bottom w:val="single" w:sz="4" w:color="BFBFBF"/>
+              <w:right w:val="single" w:sz="4" w:color="BFBFBF"/>
             </w:tcBorders>
             <w:tcMar>
               <w:top w:w="40" w:type="dxa"/>
@@ -11351,6 +11399,7 @@
               <w:bottom w:w="40" w:type="dxa"/>
               <w:right w:w="60" w:type="dxa"/>
             </w:tcMar>
+            <w:shd w:val="clear" w:color="auto" w:fill="2E86AB"/>
           </w:tcPr>
           <w:bookmarkStart w:id="53" w:name="tbl-flujo"/>
           <w:p>
@@ -11366,7 +11415,7 @@
             <w:r>
               <w:rPr>
                 <w:b/>
-                <w:color w:val="000000"/>
+                <w:color w:val="FFFFFF"/>
                 <w:sz w:val="20"/>
               </w:rPr>
               <w:t xml:space="preserve">Tabla 7: Flujo de datos del pipeline multilenguaje.</w:t>
@@ -12367,12 +12416,12 @@
         <w:jc w:val="start"/>
         <w:tblLayout w:type="autofit"/>
         <w:tblBorders>
-          <w:top w:val="nil"/>
-          <w:left w:val="nil"/>
-          <w:bottom w:val="nil"/>
-          <w:right w:val="nil"/>
-          <w:insideH w:val="nil"/>
-          <w:insideV w:val="nil"/>
+          <w:top w:val="single" w:sz="4" w:color="BFBFBF"/>
+          <w:left w:val="single" w:sz="4" w:color="BFBFBF"/>
+          <w:bottom w:val="single" w:sz="4" w:color="BFBFBF"/>
+          <w:right w:val="single" w:sz="4" w:color="BFBFBF"/>
+          <w:insideH w:val="single" w:sz="4" w:color="BFBFBF"/>
+          <w:insideV w:val="single" w:sz="4" w:color="BFBFBF"/>
         </w:tblBorders>
       </w:tblPr>
       <w:tblGrid>
@@ -12381,11 +12430,17 @@
       <w:tr>
         <w:tc>
           <w:tcPr>
+            <w:tcMar>
+              <w:top w:w="40" w:type="dxa"/>
+              <w:left w:w="60" w:type="dxa"/>
+              <w:bottom w:w="40" w:type="dxa"/>
+              <w:right w:w="60" w:type="dxa"/>
+            </w:tcMar>
             <w:tcBorders>
-              <w:top w:val="nil"/>
-              <w:left w:val="nil"/>
-              <w:bottom w:val="nil"/>
-              <w:right w:val="nil"/>
+              <w:top w:val="single" w:sz="4" w:color="BFBFBF"/>
+              <w:left w:val="single" w:sz="4" w:color="BFBFBF"/>
+              <w:bottom w:val="single" w:sz="4" w:color="BFBFBF"/>
+              <w:right w:val="single" w:sz="4" w:color="BFBFBF"/>
             </w:tcBorders>
             <w:tcMar>
               <w:top w:w="40" w:type="dxa"/>
@@ -12393,6 +12448,7 @@
               <w:bottom w:w="40" w:type="dxa"/>
               <w:right w:w="60" w:type="dxa"/>
             </w:tcMar>
+            <w:shd w:val="clear" w:color="auto" w:fill="2E86AB"/>
           </w:tcPr>
           <w:bookmarkStart w:id="55" w:name="tbl-gfd"/>
           <w:p>
@@ -12408,7 +12464,7 @@
             <w:r>
               <w:rPr>
                 <w:b/>
-                <w:color w:val="000000"/>
+                <w:color w:val="FFFFFF"/>
                 <w:sz w:val="20"/>
               </w:rPr>
               <w:t xml:space="preserve">Tabla 8: Eventos de inundación con mayor área afectada dentro del AOI acotado (Global Flood Database, 2001-2017).</w:t>
@@ -13199,12 +13255,12 @@
         <w:jc w:val="start"/>
         <w:tblLayout w:type="autofit"/>
         <w:tblBorders>
-          <w:top w:val="nil"/>
-          <w:left w:val="nil"/>
-          <w:bottom w:val="nil"/>
-          <w:right w:val="nil"/>
-          <w:insideH w:val="nil"/>
-          <w:insideV w:val="nil"/>
+          <w:top w:val="single" w:sz="4" w:color="BFBFBF"/>
+          <w:left w:val="single" w:sz="4" w:color="BFBFBF"/>
+          <w:bottom w:val="single" w:sz="4" w:color="BFBFBF"/>
+          <w:right w:val="single" w:sz="4" w:color="BFBFBF"/>
+          <w:insideH w:val="single" w:sz="4" w:color="BFBFBF"/>
+          <w:insideV w:val="single" w:sz="4" w:color="BFBFBF"/>
         </w:tblBorders>
       </w:tblPr>
       <w:tblGrid>
@@ -13213,11 +13269,17 @@
       <w:tr>
         <w:tc>
           <w:tcPr>
+            <w:tcMar>
+              <w:top w:w="40" w:type="dxa"/>
+              <w:left w:w="60" w:type="dxa"/>
+              <w:bottom w:w="40" w:type="dxa"/>
+              <w:right w:w="60" w:type="dxa"/>
+            </w:tcMar>
             <w:tcBorders>
-              <w:top w:val="nil"/>
-              <w:left w:val="nil"/>
-              <w:bottom w:val="nil"/>
-              <w:right w:val="nil"/>
+              <w:top w:val="single" w:sz="4" w:color="BFBFBF"/>
+              <w:left w:val="single" w:sz="4" w:color="BFBFBF"/>
+              <w:bottom w:val="single" w:sz="4" w:color="BFBFBF"/>
+              <w:right w:val="single" w:sz="4" w:color="BFBFBF"/>
             </w:tcBorders>
             <w:tcMar>
               <w:top w:w="40" w:type="dxa"/>
@@ -13225,6 +13287,7 @@
               <w:bottom w:w="40" w:type="dxa"/>
               <w:right w:w="60" w:type="dxa"/>
             </w:tcMar>
+            <w:shd w:val="clear" w:color="auto" w:fill="2E86AB"/>
           </w:tcPr>
           <w:bookmarkStart w:id="57" w:name="tbl-sar-ndvi-corr"/>
           <w:p>
@@ -13240,7 +13303,7 @@
             <w:r>
               <w:rPr>
                 <w:b/>
-                <w:color w:val="000000"/>
+                <w:color w:val="FFFFFF"/>
                 <w:sz w:val="20"/>
               </w:rPr>
               <w:t xml:space="preserve">Tabla 9: Correlación de Pearson entre la serie mensual Sentinel-1 SAR-VH y el NDVI z-score derivado de Sentinel-2 para rezagos de 0 a 3 meses, calculada sobre las ocho estaciones entre 2018 y 2025. Valores en negrita: correlaciones significativas (</w:t>
@@ -13271,7 +13334,7 @@
             <w:r>
               <w:rPr>
                 <w:b/>
-                <w:color w:val="000000"/>
+                <w:color w:val="FFFFFF"/>
                 <w:sz w:val="20"/>
               </w:rPr>
               <w:t xml:space="preserve">) sobre las cuatro estaciones de manglar denso del Complejo de Pajarales.</w:t>
@@ -14212,12 +14275,12 @@
         <w:jc w:val="start"/>
         <w:tblLayout w:type="autofit"/>
         <w:tblBorders>
-          <w:top w:val="nil"/>
-          <w:left w:val="nil"/>
-          <w:bottom w:val="nil"/>
-          <w:right w:val="nil"/>
-          <w:insideH w:val="nil"/>
-          <w:insideV w:val="nil"/>
+          <w:top w:val="single" w:sz="4" w:color="BFBFBF"/>
+          <w:left w:val="single" w:sz="4" w:color="BFBFBF"/>
+          <w:bottom w:val="single" w:sz="4" w:color="BFBFBF"/>
+          <w:right w:val="single" w:sz="4" w:color="BFBFBF"/>
+          <w:insideH w:val="single" w:sz="4" w:color="BFBFBF"/>
+          <w:insideV w:val="single" w:sz="4" w:color="BFBFBF"/>
         </w:tblBorders>
       </w:tblPr>
       <w:tblGrid>
@@ -14226,11 +14289,17 @@
       <w:tr>
         <w:tc>
           <w:tcPr>
+            <w:tcMar>
+              <w:top w:w="40" w:type="dxa"/>
+              <w:left w:w="60" w:type="dxa"/>
+              <w:bottom w:w="40" w:type="dxa"/>
+              <w:right w:w="60" w:type="dxa"/>
+            </w:tcMar>
             <w:tcBorders>
-              <w:top w:val="nil"/>
-              <w:left w:val="nil"/>
-              <w:bottom w:val="nil"/>
-              <w:right w:val="nil"/>
+              <w:top w:val="single" w:sz="4" w:color="BFBFBF"/>
+              <w:left w:val="single" w:sz="4" w:color="BFBFBF"/>
+              <w:bottom w:val="single" w:sz="4" w:color="BFBFBF"/>
+              <w:right w:val="single" w:sz="4" w:color="BFBFBF"/>
             </w:tcBorders>
             <w:tcMar>
               <w:top w:w="40" w:type="dxa"/>
@@ -14238,6 +14307,7 @@
               <w:bottom w:w="40" w:type="dxa"/>
               <w:right w:w="60" w:type="dxa"/>
             </w:tcMar>
+            <w:shd w:val="clear" w:color="auto" w:fill="2E86AB"/>
           </w:tcPr>
           <w:bookmarkStart w:id="59" w:name="tbl-cubos"/>
           <w:p>
@@ -14253,7 +14323,7 @@
             <w:r>
               <w:rPr>
                 <w:b/>
-                <w:color w:val="000000"/>
+                <w:color w:val="FFFFFF"/>
                 <w:sz w:val="20"/>
               </w:rPr>
               <w:t xml:space="preserve">Tabla 10: Datacubes NetCDF CF-1.8 materializados sobre el AOI acotado en EPSG:9377 (MAGNA-SIRGAS Origen Nacional), comprimidos con zlib nivel 4.</w:t>
@@ -14637,12 +14707,12 @@
         <w:jc w:val="start"/>
         <w:tblLayout w:type="autofit"/>
         <w:tblBorders>
-          <w:top w:val="nil"/>
-          <w:left w:val="nil"/>
-          <w:bottom w:val="nil"/>
-          <w:right w:val="nil"/>
-          <w:insideH w:val="nil"/>
-          <w:insideV w:val="nil"/>
+          <w:top w:val="single" w:sz="4" w:color="BFBFBF"/>
+          <w:left w:val="single" w:sz="4" w:color="BFBFBF"/>
+          <w:bottom w:val="single" w:sz="4" w:color="BFBFBF"/>
+          <w:right w:val="single" w:sz="4" w:color="BFBFBF"/>
+          <w:insideH w:val="single" w:sz="4" w:color="BFBFBF"/>
+          <w:insideV w:val="single" w:sz="4" w:color="BFBFBF"/>
         </w:tblBorders>
       </w:tblPr>
       <w:tblGrid>
@@ -14651,11 +14721,17 @@
       <w:tr>
         <w:tc>
           <w:tcPr>
+            <w:tcMar>
+              <w:top w:w="40" w:type="dxa"/>
+              <w:left w:w="60" w:type="dxa"/>
+              <w:bottom w:w="40" w:type="dxa"/>
+              <w:right w:w="60" w:type="dxa"/>
+            </w:tcMar>
             <w:tcBorders>
-              <w:top w:val="nil"/>
-              <w:left w:val="nil"/>
-              <w:bottom w:val="nil"/>
-              <w:right w:val="nil"/>
+              <w:top w:val="single" w:sz="4" w:color="BFBFBF"/>
+              <w:left w:val="single" w:sz="4" w:color="BFBFBF"/>
+              <w:bottom w:val="single" w:sz="4" w:color="BFBFBF"/>
+              <w:right w:val="single" w:sz="4" w:color="BFBFBF"/>
             </w:tcBorders>
             <w:tcMar>
               <w:top w:w="40" w:type="dxa"/>
@@ -14663,6 +14739,7 @@
               <w:bottom w:w="40" w:type="dxa"/>
               <w:right w:w="60" w:type="dxa"/>
             </w:tcMar>
+            <w:shd w:val="clear" w:color="auto" w:fill="2E86AB"/>
           </w:tcPr>
           <w:bookmarkStart w:id="61" w:name="tbl-enso-corr"/>
           <w:p>
@@ -14678,7 +14755,7 @@
             <w:r>
               <w:rPr>
                 <w:b/>
-                <w:color w:val="000000"/>
+                <w:color w:val="FFFFFF"/>
                 <w:sz w:val="20"/>
               </w:rPr>
               <w:t xml:space="preserve">Tabla 11: Correlación de Pearson entre índices ENSO globales (ONI y SOI de NOAA) y NDVI z-score desagregada por naturaleza espectral.</w:t>
@@ -15637,12 +15714,12 @@
         <w:jc w:val="start"/>
         <w:tblLayout w:type="autofit"/>
         <w:tblBorders>
-          <w:top w:val="nil"/>
-          <w:left w:val="nil"/>
-          <w:bottom w:val="nil"/>
-          <w:right w:val="nil"/>
-          <w:insideH w:val="nil"/>
-          <w:insideV w:val="nil"/>
+          <w:top w:val="single" w:sz="4" w:color="BFBFBF"/>
+          <w:left w:val="single" w:sz="4" w:color="BFBFBF"/>
+          <w:bottom w:val="single" w:sz="4" w:color="BFBFBF"/>
+          <w:right w:val="single" w:sz="4" w:color="BFBFBF"/>
+          <w:insideH w:val="single" w:sz="4" w:color="BFBFBF"/>
+          <w:insideV w:val="single" w:sz="4" w:color="BFBFBF"/>
         </w:tblBorders>
       </w:tblPr>
       <w:tblGrid>
@@ -15651,11 +15728,17 @@
       <w:tr>
         <w:tc>
           <w:tcPr>
+            <w:tcMar>
+              <w:top w:w="40" w:type="dxa"/>
+              <w:left w:w="60" w:type="dxa"/>
+              <w:bottom w:w="40" w:type="dxa"/>
+              <w:right w:w="60" w:type="dxa"/>
+            </w:tcMar>
             <w:tcBorders>
-              <w:top w:val="nil"/>
-              <w:left w:val="nil"/>
-              <w:bottom w:val="nil"/>
-              <w:right w:val="nil"/>
+              <w:top w:val="single" w:sz="4" w:color="BFBFBF"/>
+              <w:left w:val="single" w:sz="4" w:color="BFBFBF"/>
+              <w:bottom w:val="single" w:sz="4" w:color="BFBFBF"/>
+              <w:right w:val="single" w:sz="4" w:color="BFBFBF"/>
             </w:tcBorders>
             <w:tcMar>
               <w:top w:w="40" w:type="dxa"/>
@@ -15663,6 +15746,7 @@
               <w:bottom w:w="40" w:type="dxa"/>
               <w:right w:w="60" w:type="dxa"/>
             </w:tcMar>
+            <w:shd w:val="clear" w:color="auto" w:fill="2E86AB"/>
           </w:tcPr>
           <w:bookmarkStart w:id="63" w:name="tbl-caudal-corr"/>
           <w:p>
@@ -15678,7 +15762,7 @@
             <w:r>
               <w:rPr>
                 <w:b/>
-                <w:color w:val="000000"/>
+                <w:color w:val="FFFFFF"/>
                 <w:sz w:val="20"/>
               </w:rPr>
               <w:t xml:space="preserve">Tabla 12: Correlación de Pearson entre anomalía de caudal IDEAM y NDVI z-score, desagregada por estación hidrológica, naturaleza espectral y rezago temporal.</w:t>
@@ -17158,12 +17242,12 @@
         <w:jc w:val="start"/>
         <w:tblLayout w:type="autofit"/>
         <w:tblBorders>
-          <w:top w:val="nil"/>
-          <w:left w:val="nil"/>
-          <w:bottom w:val="nil"/>
-          <w:right w:val="nil"/>
-          <w:insideH w:val="nil"/>
-          <w:insideV w:val="nil"/>
+          <w:top w:val="single" w:sz="4" w:color="BFBFBF"/>
+          <w:left w:val="single" w:sz="4" w:color="BFBFBF"/>
+          <w:bottom w:val="single" w:sz="4" w:color="BFBFBF"/>
+          <w:right w:val="single" w:sz="4" w:color="BFBFBF"/>
+          <w:insideH w:val="single" w:sz="4" w:color="BFBFBF"/>
+          <w:insideV w:val="single" w:sz="4" w:color="BFBFBF"/>
         </w:tblBorders>
       </w:tblPr>
       <w:tblGrid>
@@ -17172,11 +17256,17 @@
       <w:tr>
         <w:tc>
           <w:tcPr>
+            <w:tcMar>
+              <w:top w:w="40" w:type="dxa"/>
+              <w:left w:w="60" w:type="dxa"/>
+              <w:bottom w:w="40" w:type="dxa"/>
+              <w:right w:w="60" w:type="dxa"/>
+            </w:tcMar>
             <w:tcBorders>
-              <w:top w:val="nil"/>
-              <w:left w:val="nil"/>
-              <w:bottom w:val="nil"/>
-              <w:right w:val="nil"/>
+              <w:top w:val="single" w:sz="4" w:color="BFBFBF"/>
+              <w:left w:val="single" w:sz="4" w:color="BFBFBF"/>
+              <w:bottom w:val="single" w:sz="4" w:color="BFBFBF"/>
+              <w:right w:val="single" w:sz="4" w:color="BFBFBF"/>
             </w:tcBorders>
             <w:tcMar>
               <w:top w:w="40" w:type="dxa"/>
@@ -17184,6 +17274,7 @@
               <w:bottom w:w="40" w:type="dxa"/>
               <w:right w:w="60" w:type="dxa"/>
             </w:tcMar>
+            <w:shd w:val="clear" w:color="auto" w:fill="2E86AB"/>
           </w:tcPr>
           <w:bookmarkStart w:id="65" w:name="tbl-chirps-corr"/>
           <w:p>
@@ -17199,7 +17290,7 @@
             <w:r>
               <w:rPr>
                 <w:b/>
-                <w:color w:val="000000"/>
+                <w:color w:val="FFFFFF"/>
                 <w:sz w:val="20"/>
               </w:rPr>
               <w:t xml:space="preserve">Tabla 13: Correlación de Pearson entre anomalía mensual CHIRPS sobre cuencas aportantes y NDVI z-score de las estaciones de la CGSM.</w:t>
@@ -18007,12 +18098,12 @@
         <w:jc w:val="start"/>
         <w:tblLayout w:type="autofit"/>
         <w:tblBorders>
-          <w:top w:val="nil"/>
-          <w:left w:val="nil"/>
-          <w:bottom w:val="nil"/>
-          <w:right w:val="nil"/>
-          <w:insideH w:val="nil"/>
-          <w:insideV w:val="nil"/>
+          <w:top w:val="single" w:sz="4" w:color="BFBFBF"/>
+          <w:left w:val="single" w:sz="4" w:color="BFBFBF"/>
+          <w:bottom w:val="single" w:sz="4" w:color="BFBFBF"/>
+          <w:right w:val="single" w:sz="4" w:color="BFBFBF"/>
+          <w:insideH w:val="single" w:sz="4" w:color="BFBFBF"/>
+          <w:insideV w:val="single" w:sz="4" w:color="BFBFBF"/>
         </w:tblBorders>
       </w:tblPr>
       <w:tblGrid>
@@ -18021,11 +18112,17 @@
       <w:tr>
         <w:tc>
           <w:tcPr>
+            <w:tcMar>
+              <w:top w:w="40" w:type="dxa"/>
+              <w:left w:w="60" w:type="dxa"/>
+              <w:bottom w:w="40" w:type="dxa"/>
+              <w:right w:w="60" w:type="dxa"/>
+            </w:tcMar>
             <w:tcBorders>
-              <w:top w:val="nil"/>
-              <w:left w:val="nil"/>
-              <w:bottom w:val="nil"/>
-              <w:right w:val="nil"/>
+              <w:top w:val="single" w:sz="4" w:color="BFBFBF"/>
+              <w:left w:val="single" w:sz="4" w:color="BFBFBF"/>
+              <w:bottom w:val="single" w:sz="4" w:color="BFBFBF"/>
+              <w:right w:val="single" w:sz="4" w:color="BFBFBF"/>
             </w:tcBorders>
             <w:tcMar>
               <w:top w:w="40" w:type="dxa"/>
@@ -18033,6 +18130,7 @@
               <w:bottom w:w="40" w:type="dxa"/>
               <w:right w:w="60" w:type="dxa"/>
             </w:tcMar>
+            <w:shd w:val="clear" w:color="auto" w:fill="2E86AB"/>
           </w:tcPr>
           <w:bookmarkStart w:id="67" w:name="tbl-era5"/>
           <w:p>
@@ -18048,7 +18146,7 @@
             <w:r>
               <w:rPr>
                 <w:b/>
-                <w:color w:val="000000"/>
+                <w:color w:val="FFFFFF"/>
                 <w:sz w:val="20"/>
               </w:rPr>
               <w:t xml:space="preserve">Tabla 14: Correlación entre anomalías climáticas ERA5-Land (precipitación y temperatura a 2 m) y NDVI z-score, desagregada por naturaleza espectral.</w:t>

</xml_diff>

<commit_message>
Quita emojis de la prosa del modulo de alertas + re-render con embellecedor nuevo
</commit_message>
<xml_diff>
--- a/docs/informe_anexos.docx
+++ b/docs/informe_anexos.docx
@@ -7710,12 +7710,6 @@
       <w:tr>
         <w:tc>
           <w:tcPr>
-            <w:tcMar>
-              <w:top w:w="40" w:type="dxa"/>
-              <w:left w:w="60" w:type="dxa"/>
-              <w:bottom w:w="40" w:type="dxa"/>
-              <w:right w:w="60" w:type="dxa"/>
-            </w:tcMar>
             <w:tcBorders>
               <w:top w:val="single" w:sz="4" w:color="BFBFBF"/>
               <w:left w:val="single" w:sz="4" w:color="BFBFBF"/>
@@ -8651,12 +8645,6 @@
       <w:tr>
         <w:tc>
           <w:tcPr>
-            <w:tcMar>
-              <w:top w:w="40" w:type="dxa"/>
-              <w:left w:w="60" w:type="dxa"/>
-              <w:bottom w:w="40" w:type="dxa"/>
-              <w:right w:w="60" w:type="dxa"/>
-            </w:tcMar>
             <w:tcBorders>
               <w:top w:val="single" w:sz="4" w:color="BFBFBF"/>
               <w:left w:val="single" w:sz="4" w:color="BFBFBF"/>
@@ -9161,12 +9149,6 @@
       <w:tr>
         <w:tc>
           <w:tcPr>
-            <w:tcMar>
-              <w:top w:w="40" w:type="dxa"/>
-              <w:left w:w="60" w:type="dxa"/>
-              <w:bottom w:w="40" w:type="dxa"/>
-              <w:right w:w="60" w:type="dxa"/>
-            </w:tcMar>
             <w:tcBorders>
               <w:top w:val="single" w:sz="4" w:color="BFBFBF"/>
               <w:left w:val="single" w:sz="4" w:color="BFBFBF"/>
@@ -9483,12 +9465,6 @@
       <w:tr>
         <w:tc>
           <w:tcPr>
-            <w:tcMar>
-              <w:top w:w="40" w:type="dxa"/>
-              <w:left w:w="60" w:type="dxa"/>
-              <w:bottom w:w="40" w:type="dxa"/>
-              <w:right w:w="60" w:type="dxa"/>
-            </w:tcMar>
             <w:tcBorders>
               <w:top w:val="single" w:sz="4" w:color="BFBFBF"/>
               <w:left w:val="single" w:sz="4" w:color="BFBFBF"/>
@@ -10221,12 +10197,6 @@
       <w:tr>
         <w:tc>
           <w:tcPr>
-            <w:tcMar>
-              <w:top w:w="40" w:type="dxa"/>
-              <w:left w:w="60" w:type="dxa"/>
-              <w:bottom w:w="40" w:type="dxa"/>
-              <w:right w:w="60" w:type="dxa"/>
-            </w:tcMar>
             <w:tcBorders>
               <w:top w:val="single" w:sz="4" w:color="BFBFBF"/>
               <w:left w:val="single" w:sz="4" w:color="BFBFBF"/>
@@ -10649,12 +10619,6 @@
       <w:tr>
         <w:tc>
           <w:tcPr>
-            <w:tcMar>
-              <w:top w:w="40" w:type="dxa"/>
-              <w:left w:w="60" w:type="dxa"/>
-              <w:bottom w:w="40" w:type="dxa"/>
-              <w:right w:w="60" w:type="dxa"/>
-            </w:tcMar>
             <w:tcBorders>
               <w:top w:val="single" w:sz="4" w:color="BFBFBF"/>
               <w:left w:val="single" w:sz="4" w:color="BFBFBF"/>
@@ -11381,12 +11345,6 @@
       <w:tr>
         <w:tc>
           <w:tcPr>
-            <w:tcMar>
-              <w:top w:w="40" w:type="dxa"/>
-              <w:left w:w="60" w:type="dxa"/>
-              <w:bottom w:w="40" w:type="dxa"/>
-              <w:right w:w="60" w:type="dxa"/>
-            </w:tcMar>
             <w:tcBorders>
               <w:top w:val="single" w:sz="4" w:color="BFBFBF"/>
               <w:left w:val="single" w:sz="4" w:color="BFBFBF"/>
@@ -12430,12 +12388,6 @@
       <w:tr>
         <w:tc>
           <w:tcPr>
-            <w:tcMar>
-              <w:top w:w="40" w:type="dxa"/>
-              <w:left w:w="60" w:type="dxa"/>
-              <w:bottom w:w="40" w:type="dxa"/>
-              <w:right w:w="60" w:type="dxa"/>
-            </w:tcMar>
             <w:tcBorders>
               <w:top w:val="single" w:sz="4" w:color="BFBFBF"/>
               <w:left w:val="single" w:sz="4" w:color="BFBFBF"/>
@@ -13269,12 +13221,6 @@
       <w:tr>
         <w:tc>
           <w:tcPr>
-            <w:tcMar>
-              <w:top w:w="40" w:type="dxa"/>
-              <w:left w:w="60" w:type="dxa"/>
-              <w:bottom w:w="40" w:type="dxa"/>
-              <w:right w:w="60" w:type="dxa"/>
-            </w:tcMar>
             <w:tcBorders>
               <w:top w:val="single" w:sz="4" w:color="BFBFBF"/>
               <w:left w:val="single" w:sz="4" w:color="BFBFBF"/>
@@ -14289,12 +14235,6 @@
       <w:tr>
         <w:tc>
           <w:tcPr>
-            <w:tcMar>
-              <w:top w:w="40" w:type="dxa"/>
-              <w:left w:w="60" w:type="dxa"/>
-              <w:bottom w:w="40" w:type="dxa"/>
-              <w:right w:w="60" w:type="dxa"/>
-            </w:tcMar>
             <w:tcBorders>
               <w:top w:val="single" w:sz="4" w:color="BFBFBF"/>
               <w:left w:val="single" w:sz="4" w:color="BFBFBF"/>
@@ -14721,12 +14661,6 @@
       <w:tr>
         <w:tc>
           <w:tcPr>
-            <w:tcMar>
-              <w:top w:w="40" w:type="dxa"/>
-              <w:left w:w="60" w:type="dxa"/>
-              <w:bottom w:w="40" w:type="dxa"/>
-              <w:right w:w="60" w:type="dxa"/>
-            </w:tcMar>
             <w:tcBorders>
               <w:top w:val="single" w:sz="4" w:color="BFBFBF"/>
               <w:left w:val="single" w:sz="4" w:color="BFBFBF"/>
@@ -15728,12 +15662,6 @@
       <w:tr>
         <w:tc>
           <w:tcPr>
-            <w:tcMar>
-              <w:top w:w="40" w:type="dxa"/>
-              <w:left w:w="60" w:type="dxa"/>
-              <w:bottom w:w="40" w:type="dxa"/>
-              <w:right w:w="60" w:type="dxa"/>
-            </w:tcMar>
             <w:tcBorders>
               <w:top w:val="single" w:sz="4" w:color="BFBFBF"/>
               <w:left w:val="single" w:sz="4" w:color="BFBFBF"/>
@@ -17256,12 +17184,6 @@
       <w:tr>
         <w:tc>
           <w:tcPr>
-            <w:tcMar>
-              <w:top w:w="40" w:type="dxa"/>
-              <w:left w:w="60" w:type="dxa"/>
-              <w:bottom w:w="40" w:type="dxa"/>
-              <w:right w:w="60" w:type="dxa"/>
-            </w:tcMar>
             <w:tcBorders>
               <w:top w:val="single" w:sz="4" w:color="BFBFBF"/>
               <w:left w:val="single" w:sz="4" w:color="BFBFBF"/>
@@ -18112,12 +18034,6 @@
       <w:tr>
         <w:tc>
           <w:tcPr>
-            <w:tcMar>
-              <w:top w:w="40" w:type="dxa"/>
-              <w:left w:w="60" w:type="dxa"/>
-              <w:bottom w:w="40" w:type="dxa"/>
-              <w:right w:w="60" w:type="dxa"/>
-            </w:tcMar>
             <w:tcBorders>
               <w:top w:val="single" w:sz="4" w:color="BFBFBF"/>
               <w:left w:val="single" w:sz="4" w:color="BFBFBF"/>

</xml_diff>

<commit_message>
Quita shading cyan de captions de tabla/figura en DOCX
El reference doc de Quarto aplica un fondo cyan al estilo Image Caption,
que hacia que las captions Tabla N: ... aparecieran como banda cyan
encima de la tabla, mezclandose con el header tambien cyan. Anade
_strip_caption_shading que recorre todos los parrafos fuera de tablas
y limpia w:shd, asi las captions quedan sobre fondo blanco como el
resto del cuerpo.
</commit_message>
<xml_diff>
--- a/docs/informe_anexos.docx
+++ b/docs/informe_anexos.docx
@@ -7710,6 +7710,12 @@
       <w:tr>
         <w:tc>
           <w:tcPr>
+            <w:tcMar>
+              <w:top w:w="40" w:type="dxa"/>
+              <w:left w:w="60" w:type="dxa"/>
+              <w:bottom w:w="40" w:type="dxa"/>
+              <w:right w:w="60" w:type="dxa"/>
+            </w:tcMar>
             <w:tcBorders>
               <w:top w:val="single" w:sz="4" w:color="BFBFBF"/>
               <w:left w:val="single" w:sz="4" w:color="BFBFBF"/>
@@ -8645,6 +8651,12 @@
       <w:tr>
         <w:tc>
           <w:tcPr>
+            <w:tcMar>
+              <w:top w:w="40" w:type="dxa"/>
+              <w:left w:w="60" w:type="dxa"/>
+              <w:bottom w:w="40" w:type="dxa"/>
+              <w:right w:w="60" w:type="dxa"/>
+            </w:tcMar>
             <w:tcBorders>
               <w:top w:val="single" w:sz="4" w:color="BFBFBF"/>
               <w:left w:val="single" w:sz="4" w:color="BFBFBF"/>
@@ -9149,6 +9161,12 @@
       <w:tr>
         <w:tc>
           <w:tcPr>
+            <w:tcMar>
+              <w:top w:w="40" w:type="dxa"/>
+              <w:left w:w="60" w:type="dxa"/>
+              <w:bottom w:w="40" w:type="dxa"/>
+              <w:right w:w="60" w:type="dxa"/>
+            </w:tcMar>
             <w:tcBorders>
               <w:top w:val="single" w:sz="4" w:color="BFBFBF"/>
               <w:left w:val="single" w:sz="4" w:color="BFBFBF"/>
@@ -9465,6 +9483,12 @@
       <w:tr>
         <w:tc>
           <w:tcPr>
+            <w:tcMar>
+              <w:top w:w="40" w:type="dxa"/>
+              <w:left w:w="60" w:type="dxa"/>
+              <w:bottom w:w="40" w:type="dxa"/>
+              <w:right w:w="60" w:type="dxa"/>
+            </w:tcMar>
             <w:tcBorders>
               <w:top w:val="single" w:sz="4" w:color="BFBFBF"/>
               <w:left w:val="single" w:sz="4" w:color="BFBFBF"/>
@@ -10197,6 +10221,12 @@
       <w:tr>
         <w:tc>
           <w:tcPr>
+            <w:tcMar>
+              <w:top w:w="40" w:type="dxa"/>
+              <w:left w:w="60" w:type="dxa"/>
+              <w:bottom w:w="40" w:type="dxa"/>
+              <w:right w:w="60" w:type="dxa"/>
+            </w:tcMar>
             <w:tcBorders>
               <w:top w:val="single" w:sz="4" w:color="BFBFBF"/>
               <w:left w:val="single" w:sz="4" w:color="BFBFBF"/>
@@ -10619,6 +10649,12 @@
       <w:tr>
         <w:tc>
           <w:tcPr>
+            <w:tcMar>
+              <w:top w:w="40" w:type="dxa"/>
+              <w:left w:w="60" w:type="dxa"/>
+              <w:bottom w:w="40" w:type="dxa"/>
+              <w:right w:w="60" w:type="dxa"/>
+            </w:tcMar>
             <w:tcBorders>
               <w:top w:val="single" w:sz="4" w:color="BFBFBF"/>
               <w:left w:val="single" w:sz="4" w:color="BFBFBF"/>
@@ -11345,6 +11381,12 @@
       <w:tr>
         <w:tc>
           <w:tcPr>
+            <w:tcMar>
+              <w:top w:w="40" w:type="dxa"/>
+              <w:left w:w="60" w:type="dxa"/>
+              <w:bottom w:w="40" w:type="dxa"/>
+              <w:right w:w="60" w:type="dxa"/>
+            </w:tcMar>
             <w:tcBorders>
               <w:top w:val="single" w:sz="4" w:color="BFBFBF"/>
               <w:left w:val="single" w:sz="4" w:color="BFBFBF"/>
@@ -12388,6 +12430,12 @@
       <w:tr>
         <w:tc>
           <w:tcPr>
+            <w:tcMar>
+              <w:top w:w="40" w:type="dxa"/>
+              <w:left w:w="60" w:type="dxa"/>
+              <w:bottom w:w="40" w:type="dxa"/>
+              <w:right w:w="60" w:type="dxa"/>
+            </w:tcMar>
             <w:tcBorders>
               <w:top w:val="single" w:sz="4" w:color="BFBFBF"/>
               <w:left w:val="single" w:sz="4" w:color="BFBFBF"/>
@@ -13221,6 +13269,12 @@
       <w:tr>
         <w:tc>
           <w:tcPr>
+            <w:tcMar>
+              <w:top w:w="40" w:type="dxa"/>
+              <w:left w:w="60" w:type="dxa"/>
+              <w:bottom w:w="40" w:type="dxa"/>
+              <w:right w:w="60" w:type="dxa"/>
+            </w:tcMar>
             <w:tcBorders>
               <w:top w:val="single" w:sz="4" w:color="BFBFBF"/>
               <w:left w:val="single" w:sz="4" w:color="BFBFBF"/>
@@ -14235,6 +14289,12 @@
       <w:tr>
         <w:tc>
           <w:tcPr>
+            <w:tcMar>
+              <w:top w:w="40" w:type="dxa"/>
+              <w:left w:w="60" w:type="dxa"/>
+              <w:bottom w:w="40" w:type="dxa"/>
+              <w:right w:w="60" w:type="dxa"/>
+            </w:tcMar>
             <w:tcBorders>
               <w:top w:val="single" w:sz="4" w:color="BFBFBF"/>
               <w:left w:val="single" w:sz="4" w:color="BFBFBF"/>
@@ -14661,6 +14721,12 @@
       <w:tr>
         <w:tc>
           <w:tcPr>
+            <w:tcMar>
+              <w:top w:w="40" w:type="dxa"/>
+              <w:left w:w="60" w:type="dxa"/>
+              <w:bottom w:w="40" w:type="dxa"/>
+              <w:right w:w="60" w:type="dxa"/>
+            </w:tcMar>
             <w:tcBorders>
               <w:top w:val="single" w:sz="4" w:color="BFBFBF"/>
               <w:left w:val="single" w:sz="4" w:color="BFBFBF"/>
@@ -15662,6 +15728,12 @@
       <w:tr>
         <w:tc>
           <w:tcPr>
+            <w:tcMar>
+              <w:top w:w="40" w:type="dxa"/>
+              <w:left w:w="60" w:type="dxa"/>
+              <w:bottom w:w="40" w:type="dxa"/>
+              <w:right w:w="60" w:type="dxa"/>
+            </w:tcMar>
             <w:tcBorders>
               <w:top w:val="single" w:sz="4" w:color="BFBFBF"/>
               <w:left w:val="single" w:sz="4" w:color="BFBFBF"/>
@@ -17184,6 +17256,12 @@
       <w:tr>
         <w:tc>
           <w:tcPr>
+            <w:tcMar>
+              <w:top w:w="40" w:type="dxa"/>
+              <w:left w:w="60" w:type="dxa"/>
+              <w:bottom w:w="40" w:type="dxa"/>
+              <w:right w:w="60" w:type="dxa"/>
+            </w:tcMar>
             <w:tcBorders>
               <w:top w:val="single" w:sz="4" w:color="BFBFBF"/>
               <w:left w:val="single" w:sz="4" w:color="BFBFBF"/>
@@ -18034,6 +18112,12 @@
       <w:tr>
         <w:tc>
           <w:tcPr>
+            <w:tcMar>
+              <w:top w:w="40" w:type="dxa"/>
+              <w:left w:w="60" w:type="dxa"/>
+              <w:bottom w:w="40" w:type="dxa"/>
+              <w:right w:w="60" w:type="dxa"/>
+            </w:tcMar>
             <w:tcBorders>
               <w:top w:val="single" w:sz="4" w:color="BFBFBF"/>
               <w:left w:val="single" w:sz="4" w:color="BFBFBF"/>

</xml_diff>

<commit_message>
Embellecedor: detecta wrappers de figura y los limpia sin styling cyan
</commit_message>
<xml_diff>
--- a/docs/informe_anexos.docx
+++ b/docs/informe_anexos.docx
@@ -7710,12 +7710,6 @@
       <w:tr>
         <w:tc>
           <w:tcPr>
-            <w:tcMar>
-              <w:top w:w="40" w:type="dxa"/>
-              <w:left w:w="60" w:type="dxa"/>
-              <w:bottom w:w="40" w:type="dxa"/>
-              <w:right w:w="60" w:type="dxa"/>
-            </w:tcMar>
             <w:tcBorders>
               <w:top w:val="single" w:sz="4" w:color="BFBFBF"/>
               <w:left w:val="single" w:sz="4" w:color="BFBFBF"/>
@@ -8651,12 +8645,6 @@
       <w:tr>
         <w:tc>
           <w:tcPr>
-            <w:tcMar>
-              <w:top w:w="40" w:type="dxa"/>
-              <w:left w:w="60" w:type="dxa"/>
-              <w:bottom w:w="40" w:type="dxa"/>
-              <w:right w:w="60" w:type="dxa"/>
-            </w:tcMar>
             <w:tcBorders>
               <w:top w:val="single" w:sz="4" w:color="BFBFBF"/>
               <w:left w:val="single" w:sz="4" w:color="BFBFBF"/>
@@ -9161,12 +9149,6 @@
       <w:tr>
         <w:tc>
           <w:tcPr>
-            <w:tcMar>
-              <w:top w:w="40" w:type="dxa"/>
-              <w:left w:w="60" w:type="dxa"/>
-              <w:bottom w:w="40" w:type="dxa"/>
-              <w:right w:w="60" w:type="dxa"/>
-            </w:tcMar>
             <w:tcBorders>
               <w:top w:val="single" w:sz="4" w:color="BFBFBF"/>
               <w:left w:val="single" w:sz="4" w:color="BFBFBF"/>
@@ -9483,12 +9465,6 @@
       <w:tr>
         <w:tc>
           <w:tcPr>
-            <w:tcMar>
-              <w:top w:w="40" w:type="dxa"/>
-              <w:left w:w="60" w:type="dxa"/>
-              <w:bottom w:w="40" w:type="dxa"/>
-              <w:right w:w="60" w:type="dxa"/>
-            </w:tcMar>
             <w:tcBorders>
               <w:top w:val="single" w:sz="4" w:color="BFBFBF"/>
               <w:left w:val="single" w:sz="4" w:color="BFBFBF"/>
@@ -10221,12 +10197,6 @@
       <w:tr>
         <w:tc>
           <w:tcPr>
-            <w:tcMar>
-              <w:top w:w="40" w:type="dxa"/>
-              <w:left w:w="60" w:type="dxa"/>
-              <w:bottom w:w="40" w:type="dxa"/>
-              <w:right w:w="60" w:type="dxa"/>
-            </w:tcMar>
             <w:tcBorders>
               <w:top w:val="single" w:sz="4" w:color="BFBFBF"/>
               <w:left w:val="single" w:sz="4" w:color="BFBFBF"/>
@@ -10649,12 +10619,6 @@
       <w:tr>
         <w:tc>
           <w:tcPr>
-            <w:tcMar>
-              <w:top w:w="40" w:type="dxa"/>
-              <w:left w:w="60" w:type="dxa"/>
-              <w:bottom w:w="40" w:type="dxa"/>
-              <w:right w:w="60" w:type="dxa"/>
-            </w:tcMar>
             <w:tcBorders>
               <w:top w:val="single" w:sz="4" w:color="BFBFBF"/>
               <w:left w:val="single" w:sz="4" w:color="BFBFBF"/>
@@ -11381,12 +11345,6 @@
       <w:tr>
         <w:tc>
           <w:tcPr>
-            <w:tcMar>
-              <w:top w:w="40" w:type="dxa"/>
-              <w:left w:w="60" w:type="dxa"/>
-              <w:bottom w:w="40" w:type="dxa"/>
-              <w:right w:w="60" w:type="dxa"/>
-            </w:tcMar>
             <w:tcBorders>
               <w:top w:val="single" w:sz="4" w:color="BFBFBF"/>
               <w:left w:val="single" w:sz="4" w:color="BFBFBF"/>
@@ -12430,12 +12388,6 @@
       <w:tr>
         <w:tc>
           <w:tcPr>
-            <w:tcMar>
-              <w:top w:w="40" w:type="dxa"/>
-              <w:left w:w="60" w:type="dxa"/>
-              <w:bottom w:w="40" w:type="dxa"/>
-              <w:right w:w="60" w:type="dxa"/>
-            </w:tcMar>
             <w:tcBorders>
               <w:top w:val="single" w:sz="4" w:color="BFBFBF"/>
               <w:left w:val="single" w:sz="4" w:color="BFBFBF"/>
@@ -13269,12 +13221,6 @@
       <w:tr>
         <w:tc>
           <w:tcPr>
-            <w:tcMar>
-              <w:top w:w="40" w:type="dxa"/>
-              <w:left w:w="60" w:type="dxa"/>
-              <w:bottom w:w="40" w:type="dxa"/>
-              <w:right w:w="60" w:type="dxa"/>
-            </w:tcMar>
             <w:tcBorders>
               <w:top w:val="single" w:sz="4" w:color="BFBFBF"/>
               <w:left w:val="single" w:sz="4" w:color="BFBFBF"/>
@@ -14289,12 +14235,6 @@
       <w:tr>
         <w:tc>
           <w:tcPr>
-            <w:tcMar>
-              <w:top w:w="40" w:type="dxa"/>
-              <w:left w:w="60" w:type="dxa"/>
-              <w:bottom w:w="40" w:type="dxa"/>
-              <w:right w:w="60" w:type="dxa"/>
-            </w:tcMar>
             <w:tcBorders>
               <w:top w:val="single" w:sz="4" w:color="BFBFBF"/>
               <w:left w:val="single" w:sz="4" w:color="BFBFBF"/>
@@ -14721,12 +14661,6 @@
       <w:tr>
         <w:tc>
           <w:tcPr>
-            <w:tcMar>
-              <w:top w:w="40" w:type="dxa"/>
-              <w:left w:w="60" w:type="dxa"/>
-              <w:bottom w:w="40" w:type="dxa"/>
-              <w:right w:w="60" w:type="dxa"/>
-            </w:tcMar>
             <w:tcBorders>
               <w:top w:val="single" w:sz="4" w:color="BFBFBF"/>
               <w:left w:val="single" w:sz="4" w:color="BFBFBF"/>
@@ -15728,12 +15662,6 @@
       <w:tr>
         <w:tc>
           <w:tcPr>
-            <w:tcMar>
-              <w:top w:w="40" w:type="dxa"/>
-              <w:left w:w="60" w:type="dxa"/>
-              <w:bottom w:w="40" w:type="dxa"/>
-              <w:right w:w="60" w:type="dxa"/>
-            </w:tcMar>
             <w:tcBorders>
               <w:top w:val="single" w:sz="4" w:color="BFBFBF"/>
               <w:left w:val="single" w:sz="4" w:color="BFBFBF"/>
@@ -17256,12 +17184,6 @@
       <w:tr>
         <w:tc>
           <w:tcPr>
-            <w:tcMar>
-              <w:top w:w="40" w:type="dxa"/>
-              <w:left w:w="60" w:type="dxa"/>
-              <w:bottom w:w="40" w:type="dxa"/>
-              <w:right w:w="60" w:type="dxa"/>
-            </w:tcMar>
             <w:tcBorders>
               <w:top w:val="single" w:sz="4" w:color="BFBFBF"/>
               <w:left w:val="single" w:sz="4" w:color="BFBFBF"/>
@@ -18112,12 +18034,6 @@
       <w:tr>
         <w:tc>
           <w:tcPr>
-            <w:tcMar>
-              <w:top w:w="40" w:type="dxa"/>
-              <w:left w:w="60" w:type="dxa"/>
-              <w:bottom w:w="40" w:type="dxa"/>
-              <w:right w:w="60" w:type="dxa"/>
-            </w:tcMar>
             <w:tcBorders>
               <w:top w:val="single" w:sz="4" w:color="BFBFBF"/>
               <w:left w:val="single" w:sz="4" w:color="BFBFBF"/>

</xml_diff>

<commit_message>
DOCX: compacta margenes y fuente Normal para emparejar la paginacion del PDF
El DOCX usaba defaults Word (font 11pt + margenes 2.54cm) mientras el PDF
usa scriptsize global, lo que hacia que el DOCX tuviera ~33 paginas vs
9pp del PDF. Anade _compact_layout al embellecedor:

- Margenes: 1.8 cm top/bot, 2.0 cm left/right (vs 2.54 default)
- Fuente Normal: 10 pt (vs 11 default)
- Interlineado: 1.05 (vs 1.15)
- Espacio despues de parrafo: 2 pt (vs 8)

Se aplica a sectPr de todas las secciones del documento. Reduccion
esperada de ~50 % de paginas en DOCX.
</commit_message>
<xml_diff>
--- a/docs/informe_anexos.docx
+++ b/docs/informe_anexos.docx
@@ -7710,6 +7710,12 @@
       <w:tr>
         <w:tc>
           <w:tcPr>
+            <w:tcMar>
+              <w:top w:w="40" w:type="dxa"/>
+              <w:left w:w="60" w:type="dxa"/>
+              <w:bottom w:w="40" w:type="dxa"/>
+              <w:right w:w="60" w:type="dxa"/>
+            </w:tcMar>
             <w:tcBorders>
               <w:top w:val="single" w:sz="4" w:color="BFBFBF"/>
               <w:left w:val="single" w:sz="4" w:color="BFBFBF"/>
@@ -8645,6 +8651,12 @@
       <w:tr>
         <w:tc>
           <w:tcPr>
+            <w:tcMar>
+              <w:top w:w="40" w:type="dxa"/>
+              <w:left w:w="60" w:type="dxa"/>
+              <w:bottom w:w="40" w:type="dxa"/>
+              <w:right w:w="60" w:type="dxa"/>
+            </w:tcMar>
             <w:tcBorders>
               <w:top w:val="single" w:sz="4" w:color="BFBFBF"/>
               <w:left w:val="single" w:sz="4" w:color="BFBFBF"/>
@@ -9149,6 +9161,12 @@
       <w:tr>
         <w:tc>
           <w:tcPr>
+            <w:tcMar>
+              <w:top w:w="40" w:type="dxa"/>
+              <w:left w:w="60" w:type="dxa"/>
+              <w:bottom w:w="40" w:type="dxa"/>
+              <w:right w:w="60" w:type="dxa"/>
+            </w:tcMar>
             <w:tcBorders>
               <w:top w:val="single" w:sz="4" w:color="BFBFBF"/>
               <w:left w:val="single" w:sz="4" w:color="BFBFBF"/>
@@ -9465,6 +9483,12 @@
       <w:tr>
         <w:tc>
           <w:tcPr>
+            <w:tcMar>
+              <w:top w:w="40" w:type="dxa"/>
+              <w:left w:w="60" w:type="dxa"/>
+              <w:bottom w:w="40" w:type="dxa"/>
+              <w:right w:w="60" w:type="dxa"/>
+            </w:tcMar>
             <w:tcBorders>
               <w:top w:val="single" w:sz="4" w:color="BFBFBF"/>
               <w:left w:val="single" w:sz="4" w:color="BFBFBF"/>
@@ -10197,6 +10221,12 @@
       <w:tr>
         <w:tc>
           <w:tcPr>
+            <w:tcMar>
+              <w:top w:w="40" w:type="dxa"/>
+              <w:left w:w="60" w:type="dxa"/>
+              <w:bottom w:w="40" w:type="dxa"/>
+              <w:right w:w="60" w:type="dxa"/>
+            </w:tcMar>
             <w:tcBorders>
               <w:top w:val="single" w:sz="4" w:color="BFBFBF"/>
               <w:left w:val="single" w:sz="4" w:color="BFBFBF"/>
@@ -10619,6 +10649,12 @@
       <w:tr>
         <w:tc>
           <w:tcPr>
+            <w:tcMar>
+              <w:top w:w="40" w:type="dxa"/>
+              <w:left w:w="60" w:type="dxa"/>
+              <w:bottom w:w="40" w:type="dxa"/>
+              <w:right w:w="60" w:type="dxa"/>
+            </w:tcMar>
             <w:tcBorders>
               <w:top w:val="single" w:sz="4" w:color="BFBFBF"/>
               <w:left w:val="single" w:sz="4" w:color="BFBFBF"/>
@@ -11345,6 +11381,12 @@
       <w:tr>
         <w:tc>
           <w:tcPr>
+            <w:tcMar>
+              <w:top w:w="40" w:type="dxa"/>
+              <w:left w:w="60" w:type="dxa"/>
+              <w:bottom w:w="40" w:type="dxa"/>
+              <w:right w:w="60" w:type="dxa"/>
+            </w:tcMar>
             <w:tcBorders>
               <w:top w:val="single" w:sz="4" w:color="BFBFBF"/>
               <w:left w:val="single" w:sz="4" w:color="BFBFBF"/>
@@ -12388,6 +12430,12 @@
       <w:tr>
         <w:tc>
           <w:tcPr>
+            <w:tcMar>
+              <w:top w:w="40" w:type="dxa"/>
+              <w:left w:w="60" w:type="dxa"/>
+              <w:bottom w:w="40" w:type="dxa"/>
+              <w:right w:w="60" w:type="dxa"/>
+            </w:tcMar>
             <w:tcBorders>
               <w:top w:val="single" w:sz="4" w:color="BFBFBF"/>
               <w:left w:val="single" w:sz="4" w:color="BFBFBF"/>
@@ -13221,6 +13269,12 @@
       <w:tr>
         <w:tc>
           <w:tcPr>
+            <w:tcMar>
+              <w:top w:w="40" w:type="dxa"/>
+              <w:left w:w="60" w:type="dxa"/>
+              <w:bottom w:w="40" w:type="dxa"/>
+              <w:right w:w="60" w:type="dxa"/>
+            </w:tcMar>
             <w:tcBorders>
               <w:top w:val="single" w:sz="4" w:color="BFBFBF"/>
               <w:left w:val="single" w:sz="4" w:color="BFBFBF"/>
@@ -14235,6 +14289,12 @@
       <w:tr>
         <w:tc>
           <w:tcPr>
+            <w:tcMar>
+              <w:top w:w="40" w:type="dxa"/>
+              <w:left w:w="60" w:type="dxa"/>
+              <w:bottom w:w="40" w:type="dxa"/>
+              <w:right w:w="60" w:type="dxa"/>
+            </w:tcMar>
             <w:tcBorders>
               <w:top w:val="single" w:sz="4" w:color="BFBFBF"/>
               <w:left w:val="single" w:sz="4" w:color="BFBFBF"/>
@@ -14661,6 +14721,12 @@
       <w:tr>
         <w:tc>
           <w:tcPr>
+            <w:tcMar>
+              <w:top w:w="40" w:type="dxa"/>
+              <w:left w:w="60" w:type="dxa"/>
+              <w:bottom w:w="40" w:type="dxa"/>
+              <w:right w:w="60" w:type="dxa"/>
+            </w:tcMar>
             <w:tcBorders>
               <w:top w:val="single" w:sz="4" w:color="BFBFBF"/>
               <w:left w:val="single" w:sz="4" w:color="BFBFBF"/>
@@ -15662,6 +15728,12 @@
       <w:tr>
         <w:tc>
           <w:tcPr>
+            <w:tcMar>
+              <w:top w:w="40" w:type="dxa"/>
+              <w:left w:w="60" w:type="dxa"/>
+              <w:bottom w:w="40" w:type="dxa"/>
+              <w:right w:w="60" w:type="dxa"/>
+            </w:tcMar>
             <w:tcBorders>
               <w:top w:val="single" w:sz="4" w:color="BFBFBF"/>
               <w:left w:val="single" w:sz="4" w:color="BFBFBF"/>
@@ -17184,6 +17256,12 @@
       <w:tr>
         <w:tc>
           <w:tcPr>
+            <w:tcMar>
+              <w:top w:w="40" w:type="dxa"/>
+              <w:left w:w="60" w:type="dxa"/>
+              <w:bottom w:w="40" w:type="dxa"/>
+              <w:right w:w="60" w:type="dxa"/>
+            </w:tcMar>
             <w:tcBorders>
               <w:top w:val="single" w:sz="4" w:color="BFBFBF"/>
               <w:left w:val="single" w:sz="4" w:color="BFBFBF"/>
@@ -18034,6 +18112,12 @@
       <w:tr>
         <w:tc>
           <w:tcPr>
+            <w:tcMar>
+              <w:top w:w="40" w:type="dxa"/>
+              <w:left w:w="60" w:type="dxa"/>
+              <w:bottom w:w="40" w:type="dxa"/>
+              <w:right w:w="60" w:type="dxa"/>
+            </w:tcMar>
             <w:tcBorders>
               <w:top w:val="single" w:sz="4" w:color="BFBFBF"/>
               <w:left w:val="single" w:sz="4" w:color="BFBFBF"/>
@@ -18989,7 +19073,9 @@
     </w:tbl>
     <w:bookmarkEnd w:id="68"/>
     <w:bookmarkEnd w:id="69"/>
-    <w:sectPr/>
+    <w:sectPr>
+      <w:pgMar w:top="1020" w:bottom="1020" w:left="1134" w:right="1134" w:header="453" w:footer="453" w:gutter="0"/>
+    </w:sectPr>
   </w:body>
 </w:document>
 </file>
@@ -19202,12 +19288,13 @@
     <w:name w:val="Normal"/>
     <w:qFormat/>
     <w:pPr>
+      <w:spacing w:line="252" w:lineRule="auto" w:after="40" w:before="0"/>
       <w:jc w:val="both"/>
     </w:pPr>
     <w:rPr>
       <w:rFonts w:ascii="Times New Roman" w:hAnsi="Times New Roman"/>
       <w:color w:val="000000"/>
-      <w:sz w:val="22"/>
+      <w:sz w:val="20"/>
     </w:rPr>
   </w:style>
   <w:style w:styleId="BodyText" w:type="paragraph">

</xml_diff>

<commit_message>
Recorta 4 captions adicionales (ndvi-cambio, ndvi-manglar, sar-serie, alertas) y re-render
</commit_message>
<xml_diff>
--- a/docs/informe_anexos.docx
+++ b/docs/informe_anexos.docx
@@ -7710,12 +7710,6 @@
       <w:tr>
         <w:tc>
           <w:tcPr>
-            <w:tcMar>
-              <w:top w:w="40" w:type="dxa"/>
-              <w:left w:w="60" w:type="dxa"/>
-              <w:bottom w:w="40" w:type="dxa"/>
-              <w:right w:w="60" w:type="dxa"/>
-            </w:tcMar>
             <w:tcBorders>
               <w:top w:val="single" w:sz="4" w:color="BFBFBF"/>
               <w:left w:val="single" w:sz="4" w:color="BFBFBF"/>
@@ -8651,12 +8645,6 @@
       <w:tr>
         <w:tc>
           <w:tcPr>
-            <w:tcMar>
-              <w:top w:w="40" w:type="dxa"/>
-              <w:left w:w="60" w:type="dxa"/>
-              <w:bottom w:w="40" w:type="dxa"/>
-              <w:right w:w="60" w:type="dxa"/>
-            </w:tcMar>
             <w:tcBorders>
               <w:top w:val="single" w:sz="4" w:color="BFBFBF"/>
               <w:left w:val="single" w:sz="4" w:color="BFBFBF"/>
@@ -9161,12 +9149,6 @@
       <w:tr>
         <w:tc>
           <w:tcPr>
-            <w:tcMar>
-              <w:top w:w="40" w:type="dxa"/>
-              <w:left w:w="60" w:type="dxa"/>
-              <w:bottom w:w="40" w:type="dxa"/>
-              <w:right w:w="60" w:type="dxa"/>
-            </w:tcMar>
             <w:tcBorders>
               <w:top w:val="single" w:sz="4" w:color="BFBFBF"/>
               <w:left w:val="single" w:sz="4" w:color="BFBFBF"/>
@@ -9483,12 +9465,6 @@
       <w:tr>
         <w:tc>
           <w:tcPr>
-            <w:tcMar>
-              <w:top w:w="40" w:type="dxa"/>
-              <w:left w:w="60" w:type="dxa"/>
-              <w:bottom w:w="40" w:type="dxa"/>
-              <w:right w:w="60" w:type="dxa"/>
-            </w:tcMar>
             <w:tcBorders>
               <w:top w:val="single" w:sz="4" w:color="BFBFBF"/>
               <w:left w:val="single" w:sz="4" w:color="BFBFBF"/>
@@ -10221,12 +10197,6 @@
       <w:tr>
         <w:tc>
           <w:tcPr>
-            <w:tcMar>
-              <w:top w:w="40" w:type="dxa"/>
-              <w:left w:w="60" w:type="dxa"/>
-              <w:bottom w:w="40" w:type="dxa"/>
-              <w:right w:w="60" w:type="dxa"/>
-            </w:tcMar>
             <w:tcBorders>
               <w:top w:val="single" w:sz="4" w:color="BFBFBF"/>
               <w:left w:val="single" w:sz="4" w:color="BFBFBF"/>
@@ -10649,12 +10619,6 @@
       <w:tr>
         <w:tc>
           <w:tcPr>
-            <w:tcMar>
-              <w:top w:w="40" w:type="dxa"/>
-              <w:left w:w="60" w:type="dxa"/>
-              <w:bottom w:w="40" w:type="dxa"/>
-              <w:right w:w="60" w:type="dxa"/>
-            </w:tcMar>
             <w:tcBorders>
               <w:top w:val="single" w:sz="4" w:color="BFBFBF"/>
               <w:left w:val="single" w:sz="4" w:color="BFBFBF"/>
@@ -11381,12 +11345,6 @@
       <w:tr>
         <w:tc>
           <w:tcPr>
-            <w:tcMar>
-              <w:top w:w="40" w:type="dxa"/>
-              <w:left w:w="60" w:type="dxa"/>
-              <w:bottom w:w="40" w:type="dxa"/>
-              <w:right w:w="60" w:type="dxa"/>
-            </w:tcMar>
             <w:tcBorders>
               <w:top w:val="single" w:sz="4" w:color="BFBFBF"/>
               <w:left w:val="single" w:sz="4" w:color="BFBFBF"/>
@@ -12430,12 +12388,6 @@
       <w:tr>
         <w:tc>
           <w:tcPr>
-            <w:tcMar>
-              <w:top w:w="40" w:type="dxa"/>
-              <w:left w:w="60" w:type="dxa"/>
-              <w:bottom w:w="40" w:type="dxa"/>
-              <w:right w:w="60" w:type="dxa"/>
-            </w:tcMar>
             <w:tcBorders>
               <w:top w:val="single" w:sz="4" w:color="BFBFBF"/>
               <w:left w:val="single" w:sz="4" w:color="BFBFBF"/>
@@ -13269,12 +13221,6 @@
       <w:tr>
         <w:tc>
           <w:tcPr>
-            <w:tcMar>
-              <w:top w:w="40" w:type="dxa"/>
-              <w:left w:w="60" w:type="dxa"/>
-              <w:bottom w:w="40" w:type="dxa"/>
-              <w:right w:w="60" w:type="dxa"/>
-            </w:tcMar>
             <w:tcBorders>
               <w:top w:val="single" w:sz="4" w:color="BFBFBF"/>
               <w:left w:val="single" w:sz="4" w:color="BFBFBF"/>
@@ -14289,12 +14235,6 @@
       <w:tr>
         <w:tc>
           <w:tcPr>
-            <w:tcMar>
-              <w:top w:w="40" w:type="dxa"/>
-              <w:left w:w="60" w:type="dxa"/>
-              <w:bottom w:w="40" w:type="dxa"/>
-              <w:right w:w="60" w:type="dxa"/>
-            </w:tcMar>
             <w:tcBorders>
               <w:top w:val="single" w:sz="4" w:color="BFBFBF"/>
               <w:left w:val="single" w:sz="4" w:color="BFBFBF"/>
@@ -14721,12 +14661,6 @@
       <w:tr>
         <w:tc>
           <w:tcPr>
-            <w:tcMar>
-              <w:top w:w="40" w:type="dxa"/>
-              <w:left w:w="60" w:type="dxa"/>
-              <w:bottom w:w="40" w:type="dxa"/>
-              <w:right w:w="60" w:type="dxa"/>
-            </w:tcMar>
             <w:tcBorders>
               <w:top w:val="single" w:sz="4" w:color="BFBFBF"/>
               <w:left w:val="single" w:sz="4" w:color="BFBFBF"/>
@@ -15728,12 +15662,6 @@
       <w:tr>
         <w:tc>
           <w:tcPr>
-            <w:tcMar>
-              <w:top w:w="40" w:type="dxa"/>
-              <w:left w:w="60" w:type="dxa"/>
-              <w:bottom w:w="40" w:type="dxa"/>
-              <w:right w:w="60" w:type="dxa"/>
-            </w:tcMar>
             <w:tcBorders>
               <w:top w:val="single" w:sz="4" w:color="BFBFBF"/>
               <w:left w:val="single" w:sz="4" w:color="BFBFBF"/>
@@ -17256,12 +17184,6 @@
       <w:tr>
         <w:tc>
           <w:tcPr>
-            <w:tcMar>
-              <w:top w:w="40" w:type="dxa"/>
-              <w:left w:w="60" w:type="dxa"/>
-              <w:bottom w:w="40" w:type="dxa"/>
-              <w:right w:w="60" w:type="dxa"/>
-            </w:tcMar>
             <w:tcBorders>
               <w:top w:val="single" w:sz="4" w:color="BFBFBF"/>
               <w:left w:val="single" w:sz="4" w:color="BFBFBF"/>
@@ -18112,12 +18034,6 @@
       <w:tr>
         <w:tc>
           <w:tcPr>
-            <w:tcMar>
-              <w:top w:w="40" w:type="dxa"/>
-              <w:left w:w="60" w:type="dxa"/>
-              <w:bottom w:w="40" w:type="dxa"/>
-              <w:right w:w="60" w:type="dxa"/>
-            </w:tcMar>
             <w:tcBorders>
               <w:top w:val="single" w:sz="4" w:color="BFBFBF"/>
               <w:left w:val="single" w:sz="4" w:color="BFBFBF"/>

</xml_diff>

<commit_message>
DOCX: elimina las tablas wrapper 1x1 que pandoc pone alrededor de cada figura
El embellecedor ahora desenvuelve las 13 figuras del informe_final
moviendo sus parrafos fuera de la tabla y borrando la tabla wrapper.
Las figuras quedan como parrafos inline (sin la 'caja' invisible
heredada del wrapper de pandoc).
</commit_message>
<xml_diff>
--- a/docs/informe_anexos.docx
+++ b/docs/informe_anexos.docx
@@ -7710,6 +7710,12 @@
       <w:tr>
         <w:tc>
           <w:tcPr>
+            <w:tcMar>
+              <w:top w:w="40" w:type="dxa"/>
+              <w:left w:w="60" w:type="dxa"/>
+              <w:bottom w:w="40" w:type="dxa"/>
+              <w:right w:w="60" w:type="dxa"/>
+            </w:tcMar>
             <w:tcBorders>
               <w:top w:val="single" w:sz="4" w:color="BFBFBF"/>
               <w:left w:val="single" w:sz="4" w:color="BFBFBF"/>
@@ -8645,6 +8651,12 @@
       <w:tr>
         <w:tc>
           <w:tcPr>
+            <w:tcMar>
+              <w:top w:w="40" w:type="dxa"/>
+              <w:left w:w="60" w:type="dxa"/>
+              <w:bottom w:w="40" w:type="dxa"/>
+              <w:right w:w="60" w:type="dxa"/>
+            </w:tcMar>
             <w:tcBorders>
               <w:top w:val="single" w:sz="4" w:color="BFBFBF"/>
               <w:left w:val="single" w:sz="4" w:color="BFBFBF"/>
@@ -9149,6 +9161,12 @@
       <w:tr>
         <w:tc>
           <w:tcPr>
+            <w:tcMar>
+              <w:top w:w="40" w:type="dxa"/>
+              <w:left w:w="60" w:type="dxa"/>
+              <w:bottom w:w="40" w:type="dxa"/>
+              <w:right w:w="60" w:type="dxa"/>
+            </w:tcMar>
             <w:tcBorders>
               <w:top w:val="single" w:sz="4" w:color="BFBFBF"/>
               <w:left w:val="single" w:sz="4" w:color="BFBFBF"/>
@@ -9465,6 +9483,12 @@
       <w:tr>
         <w:tc>
           <w:tcPr>
+            <w:tcMar>
+              <w:top w:w="40" w:type="dxa"/>
+              <w:left w:w="60" w:type="dxa"/>
+              <w:bottom w:w="40" w:type="dxa"/>
+              <w:right w:w="60" w:type="dxa"/>
+            </w:tcMar>
             <w:tcBorders>
               <w:top w:val="single" w:sz="4" w:color="BFBFBF"/>
               <w:left w:val="single" w:sz="4" w:color="BFBFBF"/>
@@ -10197,6 +10221,12 @@
       <w:tr>
         <w:tc>
           <w:tcPr>
+            <w:tcMar>
+              <w:top w:w="40" w:type="dxa"/>
+              <w:left w:w="60" w:type="dxa"/>
+              <w:bottom w:w="40" w:type="dxa"/>
+              <w:right w:w="60" w:type="dxa"/>
+            </w:tcMar>
             <w:tcBorders>
               <w:top w:val="single" w:sz="4" w:color="BFBFBF"/>
               <w:left w:val="single" w:sz="4" w:color="BFBFBF"/>
@@ -10619,6 +10649,12 @@
       <w:tr>
         <w:tc>
           <w:tcPr>
+            <w:tcMar>
+              <w:top w:w="40" w:type="dxa"/>
+              <w:left w:w="60" w:type="dxa"/>
+              <w:bottom w:w="40" w:type="dxa"/>
+              <w:right w:w="60" w:type="dxa"/>
+            </w:tcMar>
             <w:tcBorders>
               <w:top w:val="single" w:sz="4" w:color="BFBFBF"/>
               <w:left w:val="single" w:sz="4" w:color="BFBFBF"/>
@@ -11345,6 +11381,12 @@
       <w:tr>
         <w:tc>
           <w:tcPr>
+            <w:tcMar>
+              <w:top w:w="40" w:type="dxa"/>
+              <w:left w:w="60" w:type="dxa"/>
+              <w:bottom w:w="40" w:type="dxa"/>
+              <w:right w:w="60" w:type="dxa"/>
+            </w:tcMar>
             <w:tcBorders>
               <w:top w:val="single" w:sz="4" w:color="BFBFBF"/>
               <w:left w:val="single" w:sz="4" w:color="BFBFBF"/>
@@ -12388,6 +12430,12 @@
       <w:tr>
         <w:tc>
           <w:tcPr>
+            <w:tcMar>
+              <w:top w:w="40" w:type="dxa"/>
+              <w:left w:w="60" w:type="dxa"/>
+              <w:bottom w:w="40" w:type="dxa"/>
+              <w:right w:w="60" w:type="dxa"/>
+            </w:tcMar>
             <w:tcBorders>
               <w:top w:val="single" w:sz="4" w:color="BFBFBF"/>
               <w:left w:val="single" w:sz="4" w:color="BFBFBF"/>
@@ -13221,6 +13269,12 @@
       <w:tr>
         <w:tc>
           <w:tcPr>
+            <w:tcMar>
+              <w:top w:w="40" w:type="dxa"/>
+              <w:left w:w="60" w:type="dxa"/>
+              <w:bottom w:w="40" w:type="dxa"/>
+              <w:right w:w="60" w:type="dxa"/>
+            </w:tcMar>
             <w:tcBorders>
               <w:top w:val="single" w:sz="4" w:color="BFBFBF"/>
               <w:left w:val="single" w:sz="4" w:color="BFBFBF"/>
@@ -14235,6 +14289,12 @@
       <w:tr>
         <w:tc>
           <w:tcPr>
+            <w:tcMar>
+              <w:top w:w="40" w:type="dxa"/>
+              <w:left w:w="60" w:type="dxa"/>
+              <w:bottom w:w="40" w:type="dxa"/>
+              <w:right w:w="60" w:type="dxa"/>
+            </w:tcMar>
             <w:tcBorders>
               <w:top w:val="single" w:sz="4" w:color="BFBFBF"/>
               <w:left w:val="single" w:sz="4" w:color="BFBFBF"/>
@@ -14661,6 +14721,12 @@
       <w:tr>
         <w:tc>
           <w:tcPr>
+            <w:tcMar>
+              <w:top w:w="40" w:type="dxa"/>
+              <w:left w:w="60" w:type="dxa"/>
+              <w:bottom w:w="40" w:type="dxa"/>
+              <w:right w:w="60" w:type="dxa"/>
+            </w:tcMar>
             <w:tcBorders>
               <w:top w:val="single" w:sz="4" w:color="BFBFBF"/>
               <w:left w:val="single" w:sz="4" w:color="BFBFBF"/>
@@ -15662,6 +15728,12 @@
       <w:tr>
         <w:tc>
           <w:tcPr>
+            <w:tcMar>
+              <w:top w:w="40" w:type="dxa"/>
+              <w:left w:w="60" w:type="dxa"/>
+              <w:bottom w:w="40" w:type="dxa"/>
+              <w:right w:w="60" w:type="dxa"/>
+            </w:tcMar>
             <w:tcBorders>
               <w:top w:val="single" w:sz="4" w:color="BFBFBF"/>
               <w:left w:val="single" w:sz="4" w:color="BFBFBF"/>
@@ -17184,6 +17256,12 @@
       <w:tr>
         <w:tc>
           <w:tcPr>
+            <w:tcMar>
+              <w:top w:w="40" w:type="dxa"/>
+              <w:left w:w="60" w:type="dxa"/>
+              <w:bottom w:w="40" w:type="dxa"/>
+              <w:right w:w="60" w:type="dxa"/>
+            </w:tcMar>
             <w:tcBorders>
               <w:top w:val="single" w:sz="4" w:color="BFBFBF"/>
               <w:left w:val="single" w:sz="4" w:color="BFBFBF"/>
@@ -18034,6 +18112,12 @@
       <w:tr>
         <w:tc>
           <w:tcPr>
+            <w:tcMar>
+              <w:top w:w="40" w:type="dxa"/>
+              <w:left w:w="60" w:type="dxa"/>
+              <w:bottom w:w="40" w:type="dxa"/>
+              <w:right w:w="60" w:type="dxa"/>
+            </w:tcMar>
             <w:tcBorders>
               <w:top w:val="single" w:sz="4" w:color="BFBFBF"/>
               <w:left w:val="single" w:sz="4" w:color="BFBFBF"/>

</xml_diff>

<commit_message>
Quita el fondo cyan del header de las tablas (queda solo bold negro)
</commit_message>
<xml_diff>
--- a/docs/informe_anexos.docx
+++ b/docs/informe_anexos.docx
@@ -7716,6 +7716,12 @@
               <w:bottom w:w="40" w:type="dxa"/>
               <w:right w:w="60" w:type="dxa"/>
             </w:tcMar>
+            <w:tcMar>
+              <w:top w:w="40" w:type="dxa"/>
+              <w:left w:w="60" w:type="dxa"/>
+              <w:bottom w:w="40" w:type="dxa"/>
+              <w:right w:w="60" w:type="dxa"/>
+            </w:tcMar>
             <w:tcBorders>
               <w:top w:val="single" w:sz="4" w:color="BFBFBF"/>
               <w:left w:val="single" w:sz="4" w:color="BFBFBF"/>
@@ -7728,7 +7734,6 @@
               <w:bottom w:w="40" w:type="dxa"/>
               <w:right w:w="60" w:type="dxa"/>
             </w:tcMar>
-            <w:shd w:val="clear" w:color="auto" w:fill="2E86AB"/>
           </w:tcPr>
           <w:bookmarkStart w:id="41" w:name="tbl-cruce"/>
           <w:p>
@@ -7744,7 +7749,7 @@
             <w:r>
               <w:rPr>
                 <w:b/>
-                <w:color w:val="FFFFFF"/>
+                <w:color w:val="000000"/>
                 <w:sz w:val="20"/>
               </w:rPr>
               <w:t xml:space="preserve">Tabla 1: Cruce de señal SAR, NDVI y frecuencia de inundación histórica por estación, restringido al AOI acotado SFF + VPI Salamanca.</w:t>
@@ -8657,6 +8662,12 @@
               <w:bottom w:w="40" w:type="dxa"/>
               <w:right w:w="60" w:type="dxa"/>
             </w:tcMar>
+            <w:tcMar>
+              <w:top w:w="40" w:type="dxa"/>
+              <w:left w:w="60" w:type="dxa"/>
+              <w:bottom w:w="40" w:type="dxa"/>
+              <w:right w:w="60" w:type="dxa"/>
+            </w:tcMar>
             <w:tcBorders>
               <w:top w:val="single" w:sz="4" w:color="BFBFBF"/>
               <w:left w:val="single" w:sz="4" w:color="BFBFBF"/>
@@ -8669,7 +8680,6 @@
               <w:bottom w:w="40" w:type="dxa"/>
               <w:right w:w="60" w:type="dxa"/>
             </w:tcMar>
-            <w:shd w:val="clear" w:color="auto" w:fill="2E86AB"/>
           </w:tcPr>
           <w:bookmarkStart w:id="43" w:name="tbl-jrc"/>
           <w:p>
@@ -8685,7 +8695,7 @@
             <w:r>
               <w:rPr>
                 <w:b/>
-                <w:color w:val="FFFFFF"/>
+                <w:color w:val="000000"/>
                 <w:sz w:val="20"/>
               </w:rPr>
               <w:t xml:space="preserve">Tabla 2: Transiciones JRC Global Surface Water (1984–2021) dentro del AOI acotado SFF + VPI Salamanca. El AOI contiene 385,3 km² de agua permanente (&gt;75 % del tiempo) y 44,1 km² estacional (25–75 %), de modo que casi la mitad del polígono protegido es lámina de agua.</w:t>
@@ -9167,6 +9177,12 @@
               <w:bottom w:w="40" w:type="dxa"/>
               <w:right w:w="60" w:type="dxa"/>
             </w:tcMar>
+            <w:tcMar>
+              <w:top w:w="40" w:type="dxa"/>
+              <w:left w:w="60" w:type="dxa"/>
+              <w:bottom w:w="40" w:type="dxa"/>
+              <w:right w:w="60" w:type="dxa"/>
+            </w:tcMar>
             <w:tcBorders>
               <w:top w:val="single" w:sz="4" w:color="BFBFBF"/>
               <w:left w:val="single" w:sz="4" w:color="BFBFBF"/>
@@ -9179,7 +9195,6 @@
               <w:bottom w:w="40" w:type="dxa"/>
               <w:right w:w="60" w:type="dxa"/>
             </w:tcMar>
-            <w:shd w:val="clear" w:color="auto" w:fill="2E86AB"/>
           </w:tcPr>
           <w:bookmarkStart w:id="45" w:name="tbl-entorno"/>
           <w:p>
@@ -9195,7 +9210,7 @@
             <w:r>
               <w:rPr>
                 <w:b/>
-                <w:color w:val="FFFFFF"/>
+                <w:color w:val="000000"/>
                 <w:sz w:val="20"/>
               </w:rPr>
               <w:t xml:space="preserve">Tabla 3: Entorno de ejecución completo del proyecto.</w:t>
@@ -9489,6 +9504,12 @@
               <w:bottom w:w="40" w:type="dxa"/>
               <w:right w:w="60" w:type="dxa"/>
             </w:tcMar>
+            <w:tcMar>
+              <w:top w:w="40" w:type="dxa"/>
+              <w:left w:w="60" w:type="dxa"/>
+              <w:bottom w:w="40" w:type="dxa"/>
+              <w:right w:w="60" w:type="dxa"/>
+            </w:tcMar>
             <w:tcBorders>
               <w:top w:val="single" w:sz="4" w:color="BFBFBF"/>
               <w:left w:val="single" w:sz="4" w:color="BFBFBF"/>
@@ -9501,7 +9522,6 @@
               <w:bottom w:w="40" w:type="dxa"/>
               <w:right w:w="60" w:type="dxa"/>
             </w:tcMar>
-            <w:shd w:val="clear" w:color="auto" w:fill="2E86AB"/>
           </w:tcPr>
           <w:bookmarkStart w:id="47" w:name="tbl-bfast"/>
           <w:p>
@@ -9517,7 +9537,7 @@
             <w:r>
               <w:rPr>
                 <w:b/>
-                <w:color w:val="FFFFFF"/>
+                <w:color w:val="000000"/>
                 <w:sz w:val="20"/>
               </w:rPr>
               <w:t xml:space="preserve">Tabla 4: Quiebres estructurales detectados por bfast sobre las ocho estaciones del proyecto en la serie combinada Landsat 8 + Sentinel-2 (2013–2025). El análisis refinado sobre las cuatro estaciones de manglar denso se reporta en la tabla</w:t>
@@ -9525,7 +9545,7 @@
             <w:r>
               <w:rPr>
                 <w:b/>
-                <w:color w:val="FFFFFF"/>
+                <w:color w:val="000000"/>
                 <w:sz w:val="20"/>
               </w:rPr>
               <w:t xml:space="preserve"> </w:t>
@@ -9534,7 +9554,7 @@
               <w:rPr>
                 <w:bCs/>
                 <w:b/>
-                <w:color w:val="FFFFFF"/>
+                <w:color w:val="000000"/>
                 <w:sz w:val="20"/>
               </w:rPr>
               <w:t xml:space="preserve">?@tbl-bfast-unificado</w:t>
@@ -9542,7 +9562,7 @@
             <w:r>
               <w:rPr>
                 <w:b/>
-                <w:color w:val="FFFFFF"/>
+                <w:color w:val="000000"/>
                 <w:sz w:val="20"/>
               </w:rPr>
               <w:t xml:space="preserve"> </w:t>
@@ -9550,7 +9570,7 @@
             <w:r>
               <w:rPr>
                 <w:b/>
-                <w:color w:val="FFFFFF"/>
+                <w:color w:val="000000"/>
                 <w:sz w:val="20"/>
               </w:rPr>
               <w:t xml:space="preserve">del informe principal.</w:t>
@@ -10227,6 +10247,12 @@
               <w:bottom w:w="40" w:type="dxa"/>
               <w:right w:w="60" w:type="dxa"/>
             </w:tcMar>
+            <w:tcMar>
+              <w:top w:w="40" w:type="dxa"/>
+              <w:left w:w="60" w:type="dxa"/>
+              <w:bottom w:w="40" w:type="dxa"/>
+              <w:right w:w="60" w:type="dxa"/>
+            </w:tcMar>
             <w:tcBorders>
               <w:top w:val="single" w:sz="4" w:color="BFBFBF"/>
               <w:left w:val="single" w:sz="4" w:color="BFBFBF"/>
@@ -10239,7 +10265,6 @@
               <w:bottom w:w="40" w:type="dxa"/>
               <w:right w:w="60" w:type="dxa"/>
             </w:tcMar>
-            <w:shd w:val="clear" w:color="auto" w:fill="2E86AB"/>
           </w:tcPr>
           <w:bookmarkStart w:id="49" w:name="tbl-topología-acotado"/>
           <w:p>
@@ -10255,7 +10280,7 @@
             <w:r>
               <w:rPr>
                 <w:b/>
-                <w:color w:val="FFFFFF"/>
+                <w:color w:val="000000"/>
                 <w:sz w:val="20"/>
               </w:rPr>
               <w:t xml:space="preserve">Tabla 5: Parches de manglar truncados por la frontera del AOI acotado (predicado DE-9IM</w:t>
@@ -10263,7 +10288,7 @@
             <w:r>
               <w:rPr>
                 <w:b/>
-                <w:color w:val="FFFFFF"/>
+                <w:color w:val="000000"/>
                 <w:sz w:val="20"/>
               </w:rPr>
               <w:t xml:space="preserve"> </w:t>
@@ -10272,7 +10297,7 @@
               <w:rPr>
                 <w:rStyle w:val="VerbatimChar"/>
                 <w:b/>
-                <w:color w:val="FFFFFF"/>
+                <w:color w:val="000000"/>
                 <w:sz w:val="20"/>
               </w:rPr>
               <w:t xml:space="preserve">intersects</w:t>
@@ -10280,7 +10305,7 @@
             <w:r>
               <w:rPr>
                 <w:b/>
-                <w:color w:val="FFFFFF"/>
+                <w:color w:val="000000"/>
                 <w:sz w:val="20"/>
               </w:rPr>
               <w:t xml:space="preserve"> </w:t>
@@ -10288,7 +10313,7 @@
             <w:r>
               <w:rPr>
                 <w:b/>
-                <w:color w:val="FFFFFF"/>
+                <w:color w:val="000000"/>
                 <w:sz w:val="20"/>
               </w:rPr>
               <w:t xml:space="preserve">con tolerancia de 30 m). Los parches se cuentan agregados como features completos en</w:t>
@@ -10296,7 +10321,7 @@
             <w:r>
               <w:rPr>
                 <w:b/>
-                <w:color w:val="FFFFFF"/>
+                <w:color w:val="000000"/>
                 <w:sz w:val="20"/>
               </w:rPr>
               <w:t xml:space="preserve"> </w:t>
@@ -10305,7 +10330,7 @@
               <w:rPr>
                 <w:rStyle w:val="VerbatimChar"/>
                 <w:b/>
-                <w:color w:val="FFFFFF"/>
+                <w:color w:val="000000"/>
                 <w:sz w:val="20"/>
               </w:rPr>
               <w:t xml:space="preserve">geopandas</w:t>
@@ -10313,7 +10338,7 @@
             <w:r>
               <w:rPr>
                 <w:b/>
-                <w:color w:val="FFFFFF"/>
+                <w:color w:val="000000"/>
                 <w:sz w:val="20"/>
               </w:rPr>
               <w:t xml:space="preserve">.</w:t>
@@ -10655,6 +10680,12 @@
               <w:bottom w:w="40" w:type="dxa"/>
               <w:right w:w="60" w:type="dxa"/>
             </w:tcMar>
+            <w:tcMar>
+              <w:top w:w="40" w:type="dxa"/>
+              <w:left w:w="60" w:type="dxa"/>
+              <w:bottom w:w="40" w:type="dxa"/>
+              <w:right w:w="60" w:type="dxa"/>
+            </w:tcMar>
             <w:tcBorders>
               <w:top w:val="single" w:sz="4" w:color="BFBFBF"/>
               <w:left w:val="single" w:sz="4" w:color="BFBFBF"/>
@@ -10667,7 +10698,6 @@
               <w:bottom w:w="40" w:type="dxa"/>
               <w:right w:w="60" w:type="dxa"/>
             </w:tcMar>
-            <w:shd w:val="clear" w:color="auto" w:fill="2E86AB"/>
           </w:tcPr>
           <w:bookmarkStart w:id="51" w:name="tbl-anomalias"/>
           <w:p>
@@ -10683,7 +10713,7 @@
             <w:r>
               <w:rPr>
                 <w:b/>
-                <w:color w:val="FFFFFF"/>
+                <w:color w:val="000000"/>
                 <w:sz w:val="20"/>
               </w:rPr>
               <w:t xml:space="preserve">Tabla 6: Anomalias significativas de NDVI (</w:t>
@@ -10711,7 +10741,7 @@
             <w:r>
               <w:rPr>
                 <w:b/>
-                <w:color w:val="FFFFFF"/>
+                <w:color w:val="000000"/>
                 <w:sz w:val="20"/>
               </w:rPr>
               <w:t xml:space="preserve">) en la serie combinada 2013–2025, ordenadas por z-score decreciente.</w:t>
@@ -11387,6 +11417,12 @@
               <w:bottom w:w="40" w:type="dxa"/>
               <w:right w:w="60" w:type="dxa"/>
             </w:tcMar>
+            <w:tcMar>
+              <w:top w:w="40" w:type="dxa"/>
+              <w:left w:w="60" w:type="dxa"/>
+              <w:bottom w:w="40" w:type="dxa"/>
+              <w:right w:w="60" w:type="dxa"/>
+            </w:tcMar>
             <w:tcBorders>
               <w:top w:val="single" w:sz="4" w:color="BFBFBF"/>
               <w:left w:val="single" w:sz="4" w:color="BFBFBF"/>
@@ -11399,7 +11435,6 @@
               <w:bottom w:w="40" w:type="dxa"/>
               <w:right w:w="60" w:type="dxa"/>
             </w:tcMar>
-            <w:shd w:val="clear" w:color="auto" w:fill="2E86AB"/>
           </w:tcPr>
           <w:bookmarkStart w:id="53" w:name="tbl-flujo"/>
           <w:p>
@@ -11415,7 +11450,7 @@
             <w:r>
               <w:rPr>
                 <w:b/>
-                <w:color w:val="FFFFFF"/>
+                <w:color w:val="000000"/>
                 <w:sz w:val="20"/>
               </w:rPr>
               <w:t xml:space="preserve">Tabla 7: Flujo de datos del pipeline multilenguaje.</w:t>
@@ -12436,6 +12471,12 @@
               <w:bottom w:w="40" w:type="dxa"/>
               <w:right w:w="60" w:type="dxa"/>
             </w:tcMar>
+            <w:tcMar>
+              <w:top w:w="40" w:type="dxa"/>
+              <w:left w:w="60" w:type="dxa"/>
+              <w:bottom w:w="40" w:type="dxa"/>
+              <w:right w:w="60" w:type="dxa"/>
+            </w:tcMar>
             <w:tcBorders>
               <w:top w:val="single" w:sz="4" w:color="BFBFBF"/>
               <w:left w:val="single" w:sz="4" w:color="BFBFBF"/>
@@ -12448,7 +12489,6 @@
               <w:bottom w:w="40" w:type="dxa"/>
               <w:right w:w="60" w:type="dxa"/>
             </w:tcMar>
-            <w:shd w:val="clear" w:color="auto" w:fill="2E86AB"/>
           </w:tcPr>
           <w:bookmarkStart w:id="55" w:name="tbl-gfd"/>
           <w:p>
@@ -12464,7 +12504,7 @@
             <w:r>
               <w:rPr>
                 <w:b/>
-                <w:color w:val="FFFFFF"/>
+                <w:color w:val="000000"/>
                 <w:sz w:val="20"/>
               </w:rPr>
               <w:t xml:space="preserve">Tabla 8: Eventos de inundación con mayor área afectada dentro del AOI acotado (Global Flood Database, 2001-2017).</w:t>
@@ -13275,6 +13315,12 @@
               <w:bottom w:w="40" w:type="dxa"/>
               <w:right w:w="60" w:type="dxa"/>
             </w:tcMar>
+            <w:tcMar>
+              <w:top w:w="40" w:type="dxa"/>
+              <w:left w:w="60" w:type="dxa"/>
+              <w:bottom w:w="40" w:type="dxa"/>
+              <w:right w:w="60" w:type="dxa"/>
+            </w:tcMar>
             <w:tcBorders>
               <w:top w:val="single" w:sz="4" w:color="BFBFBF"/>
               <w:left w:val="single" w:sz="4" w:color="BFBFBF"/>
@@ -13287,7 +13333,6 @@
               <w:bottom w:w="40" w:type="dxa"/>
               <w:right w:w="60" w:type="dxa"/>
             </w:tcMar>
-            <w:shd w:val="clear" w:color="auto" w:fill="2E86AB"/>
           </w:tcPr>
           <w:bookmarkStart w:id="57" w:name="tbl-sar-ndvi-corr"/>
           <w:p>
@@ -13303,7 +13348,7 @@
             <w:r>
               <w:rPr>
                 <w:b/>
-                <w:color w:val="FFFFFF"/>
+                <w:color w:val="000000"/>
                 <w:sz w:val="20"/>
               </w:rPr>
               <w:t xml:space="preserve">Tabla 9: Correlación de Pearson entre la serie mensual Sentinel-1 SAR-VH y el NDVI z-score derivado de Sentinel-2 para rezagos de 0 a 3 meses, calculada sobre las ocho estaciones entre 2018 y 2025. Valores en negrita: correlaciones significativas (</w:t>
@@ -13334,7 +13379,7 @@
             <w:r>
               <w:rPr>
                 <w:b/>
-                <w:color w:val="FFFFFF"/>
+                <w:color w:val="000000"/>
                 <w:sz w:val="20"/>
               </w:rPr>
               <w:t xml:space="preserve">) sobre las cuatro estaciones de manglar denso del Complejo de Pajarales.</w:t>
@@ -14295,6 +14340,12 @@
               <w:bottom w:w="40" w:type="dxa"/>
               <w:right w:w="60" w:type="dxa"/>
             </w:tcMar>
+            <w:tcMar>
+              <w:top w:w="40" w:type="dxa"/>
+              <w:left w:w="60" w:type="dxa"/>
+              <w:bottom w:w="40" w:type="dxa"/>
+              <w:right w:w="60" w:type="dxa"/>
+            </w:tcMar>
             <w:tcBorders>
               <w:top w:val="single" w:sz="4" w:color="BFBFBF"/>
               <w:left w:val="single" w:sz="4" w:color="BFBFBF"/>
@@ -14307,7 +14358,6 @@
               <w:bottom w:w="40" w:type="dxa"/>
               <w:right w:w="60" w:type="dxa"/>
             </w:tcMar>
-            <w:shd w:val="clear" w:color="auto" w:fill="2E86AB"/>
           </w:tcPr>
           <w:bookmarkStart w:id="59" w:name="tbl-cubos"/>
           <w:p>
@@ -14323,7 +14373,7 @@
             <w:r>
               <w:rPr>
                 <w:b/>
-                <w:color w:val="FFFFFF"/>
+                <w:color w:val="000000"/>
                 <w:sz w:val="20"/>
               </w:rPr>
               <w:t xml:space="preserve">Tabla 10: Datacubes NetCDF CF-1.8 materializados sobre el AOI acotado en EPSG:9377 (MAGNA-SIRGAS Origen Nacional), comprimidos con zlib nivel 4.</w:t>
@@ -14727,6 +14777,12 @@
               <w:bottom w:w="40" w:type="dxa"/>
               <w:right w:w="60" w:type="dxa"/>
             </w:tcMar>
+            <w:tcMar>
+              <w:top w:w="40" w:type="dxa"/>
+              <w:left w:w="60" w:type="dxa"/>
+              <w:bottom w:w="40" w:type="dxa"/>
+              <w:right w:w="60" w:type="dxa"/>
+            </w:tcMar>
             <w:tcBorders>
               <w:top w:val="single" w:sz="4" w:color="BFBFBF"/>
               <w:left w:val="single" w:sz="4" w:color="BFBFBF"/>
@@ -14739,7 +14795,6 @@
               <w:bottom w:w="40" w:type="dxa"/>
               <w:right w:w="60" w:type="dxa"/>
             </w:tcMar>
-            <w:shd w:val="clear" w:color="auto" w:fill="2E86AB"/>
           </w:tcPr>
           <w:bookmarkStart w:id="61" w:name="tbl-enso-corr"/>
           <w:p>
@@ -14755,7 +14810,7 @@
             <w:r>
               <w:rPr>
                 <w:b/>
-                <w:color w:val="FFFFFF"/>
+                <w:color w:val="000000"/>
                 <w:sz w:val="20"/>
               </w:rPr>
               <w:t xml:space="preserve">Tabla 11: Correlación de Pearson entre índices ENSO globales (ONI y SOI de NOAA) y NDVI z-score desagregada por naturaleza espectral.</w:t>
@@ -15734,6 +15789,12 @@
               <w:bottom w:w="40" w:type="dxa"/>
               <w:right w:w="60" w:type="dxa"/>
             </w:tcMar>
+            <w:tcMar>
+              <w:top w:w="40" w:type="dxa"/>
+              <w:left w:w="60" w:type="dxa"/>
+              <w:bottom w:w="40" w:type="dxa"/>
+              <w:right w:w="60" w:type="dxa"/>
+            </w:tcMar>
             <w:tcBorders>
               <w:top w:val="single" w:sz="4" w:color="BFBFBF"/>
               <w:left w:val="single" w:sz="4" w:color="BFBFBF"/>
@@ -15746,7 +15807,6 @@
               <w:bottom w:w="40" w:type="dxa"/>
               <w:right w:w="60" w:type="dxa"/>
             </w:tcMar>
-            <w:shd w:val="clear" w:color="auto" w:fill="2E86AB"/>
           </w:tcPr>
           <w:bookmarkStart w:id="63" w:name="tbl-caudal-corr"/>
           <w:p>
@@ -15762,7 +15822,7 @@
             <w:r>
               <w:rPr>
                 <w:b/>
-                <w:color w:val="FFFFFF"/>
+                <w:color w:val="000000"/>
                 <w:sz w:val="20"/>
               </w:rPr>
               <w:t xml:space="preserve">Tabla 12: Correlación de Pearson entre anomalía de caudal IDEAM y NDVI z-score, desagregada por estación hidrológica, naturaleza espectral y rezago temporal.</w:t>
@@ -17262,6 +17322,12 @@
               <w:bottom w:w="40" w:type="dxa"/>
               <w:right w:w="60" w:type="dxa"/>
             </w:tcMar>
+            <w:tcMar>
+              <w:top w:w="40" w:type="dxa"/>
+              <w:left w:w="60" w:type="dxa"/>
+              <w:bottom w:w="40" w:type="dxa"/>
+              <w:right w:w="60" w:type="dxa"/>
+            </w:tcMar>
             <w:tcBorders>
               <w:top w:val="single" w:sz="4" w:color="BFBFBF"/>
               <w:left w:val="single" w:sz="4" w:color="BFBFBF"/>
@@ -17274,7 +17340,6 @@
               <w:bottom w:w="40" w:type="dxa"/>
               <w:right w:w="60" w:type="dxa"/>
             </w:tcMar>
-            <w:shd w:val="clear" w:color="auto" w:fill="2E86AB"/>
           </w:tcPr>
           <w:bookmarkStart w:id="65" w:name="tbl-chirps-corr"/>
           <w:p>
@@ -17290,7 +17355,7 @@
             <w:r>
               <w:rPr>
                 <w:b/>
-                <w:color w:val="FFFFFF"/>
+                <w:color w:val="000000"/>
                 <w:sz w:val="20"/>
               </w:rPr>
               <w:t xml:space="preserve">Tabla 13: Correlación de Pearson entre anomalía mensual CHIRPS sobre cuencas aportantes y NDVI z-score de las estaciones de la CGSM.</w:t>
@@ -18118,6 +18183,12 @@
               <w:bottom w:w="40" w:type="dxa"/>
               <w:right w:w="60" w:type="dxa"/>
             </w:tcMar>
+            <w:tcMar>
+              <w:top w:w="40" w:type="dxa"/>
+              <w:left w:w="60" w:type="dxa"/>
+              <w:bottom w:w="40" w:type="dxa"/>
+              <w:right w:w="60" w:type="dxa"/>
+            </w:tcMar>
             <w:tcBorders>
               <w:top w:val="single" w:sz="4" w:color="BFBFBF"/>
               <w:left w:val="single" w:sz="4" w:color="BFBFBF"/>
@@ -18130,7 +18201,6 @@
               <w:bottom w:w="40" w:type="dxa"/>
               <w:right w:w="60" w:type="dxa"/>
             </w:tcMar>
-            <w:shd w:val="clear" w:color="auto" w:fill="2E86AB"/>
           </w:tcPr>
           <w:bookmarkStart w:id="67" w:name="tbl-era5"/>
           <w:p>
@@ -18146,7 +18216,7 @@
             <w:r>
               <w:rPr>
                 <w:b/>
-                <w:color w:val="FFFFFF"/>
+                <w:color w:val="000000"/>
                 <w:sz w:val="20"/>
               </w:rPr>
               <w:t xml:space="preserve">Tabla 14: Correlación entre anomalías climáticas ERA5-Land (precipitación y temperatura a 2 m) y NDVI z-score, desagregada por naturaleza espectral.</w:t>

</xml_diff>

<commit_message>
Cambia titulo a Pipeline multilenguaje GeoAI para el monitoreo del manglar en la Ciénaga Grande de Santa Marta
Titulo actualizado en 6 archivos fuente + 6 renders:
- informe_final.qmd, informe_anexos.qmd, README.md, dashboard.html,
  dashboard_cgsm.qmd, dashboard_cgsm.ipynb
- Re-render de PDF/HTML/DOCX de los dos informes y del dashboard_cgsm

Cambios respecto al titulo anterior:
- Anade GeoAI (recogido de la propuesta preliminar)
- Reemplaza CGSM por Ciénaga Grande de Santa Marta (formal en el titulo)
- Reemplaza de manglar por del manglar (concordancia natural en espanol)
- Quita (Python, R, Julia) del titulo principal (queda multilenguaje GeoAI)
- Conserva el periodo (2013-2025)
</commit_message>
<xml_diff>
--- a/docs/informe_anexos.docx
+++ b/docs/informe_anexos.docx
@@ -34,6 +34,90 @@
         <w:rPr>
           <w:color w:val="000000"/>
         </w:rPr>
+        <w:t xml:space="preserve">·</w:t>
+      </w:r>
+      <w:r>
+        <w:rPr>
+          <w:color w:val="000000"/>
+        </w:rPr>
+        <w:t xml:space="preserve"> </w:t>
+      </w:r>
+      <w:r>
+        <w:rPr>
+          <w:color w:val="000000"/>
+        </w:rPr>
+        <w:t xml:space="preserve">Pipeline</w:t>
+      </w:r>
+      <w:r>
+        <w:rPr>
+          <w:color w:val="000000"/>
+        </w:rPr>
+        <w:t xml:space="preserve"> </w:t>
+      </w:r>
+      <w:r>
+        <w:rPr>
+          <w:color w:val="000000"/>
+        </w:rPr>
+        <w:t xml:space="preserve">multilenguaje</w:t>
+      </w:r>
+      <w:r>
+        <w:rPr>
+          <w:color w:val="000000"/>
+        </w:rPr>
+        <w:t xml:space="preserve"> </w:t>
+      </w:r>
+      <w:r>
+        <w:rPr>
+          <w:color w:val="000000"/>
+        </w:rPr>
+        <w:t xml:space="preserve">GeoAI</w:t>
+      </w:r>
+      <w:r>
+        <w:rPr>
+          <w:color w:val="000000"/>
+        </w:rPr>
+        <w:t xml:space="preserve"> </w:t>
+      </w:r>
+      <w:r>
+        <w:rPr>
+          <w:color w:val="000000"/>
+        </w:rPr>
+        <w:t xml:space="preserve">para</w:t>
+      </w:r>
+      <w:r>
+        <w:rPr>
+          <w:color w:val="000000"/>
+        </w:rPr>
+        <w:t xml:space="preserve"> </w:t>
+      </w:r>
+      <w:r>
+        <w:rPr>
+          <w:color w:val="000000"/>
+        </w:rPr>
+        <w:t xml:space="preserve">el</w:t>
+      </w:r>
+      <w:r>
+        <w:rPr>
+          <w:color w:val="000000"/>
+        </w:rPr>
+        <w:t xml:space="preserve"> </w:t>
+      </w:r>
+      <w:r>
+        <w:rPr>
+          <w:color w:val="000000"/>
+        </w:rPr>
+        <w:t xml:space="preserve">monitoreo</w:t>
+      </w:r>
+      <w:r>
+        <w:rPr>
+          <w:color w:val="000000"/>
+        </w:rPr>
+        <w:t xml:space="preserve"> </w:t>
+      </w:r>
+      <w:r>
+        <w:rPr>
+          <w:color w:val="000000"/>
+        </w:rPr>
         <w:t xml:space="preserve">del</w:t>
       </w:r>
       <w:r>
@@ -46,7 +130,7 @@
         <w:rPr>
           <w:color w:val="000000"/>
         </w:rPr>
-        <w:t xml:space="preserve">Pipeline</w:t>
+        <w:t xml:space="preserve">manglar</w:t>
       </w:r>
       <w:r>
         <w:rPr>
@@ -58,7 +142,7 @@
         <w:rPr>
           <w:color w:val="000000"/>
         </w:rPr>
-        <w:t xml:space="preserve">multilenguaje</w:t>
+        <w:t xml:space="preserve">en</w:t>
       </w:r>
       <w:r>
         <w:rPr>
@@ -70,7 +154,7 @@
         <w:rPr>
           <w:color w:val="000000"/>
         </w:rPr>
-        <w:t xml:space="preserve">para</w:t>
+        <w:t xml:space="preserve">la</w:t>
       </w:r>
       <w:r>
         <w:rPr>
@@ -82,7 +166,7 @@
         <w:rPr>
           <w:color w:val="000000"/>
         </w:rPr>
-        <w:t xml:space="preserve">el</w:t>
+        <w:t xml:space="preserve">Ciénaga</w:t>
       </w:r>
       <w:r>
         <w:rPr>
@@ -94,7 +178,7 @@
         <w:rPr>
           <w:color w:val="000000"/>
         </w:rPr>
-        <w:t xml:space="preserve">monitoreo</w:t>
+        <w:t xml:space="preserve">Grande</w:t>
       </w:r>
       <w:r>
         <w:rPr>
@@ -118,7 +202,7 @@
         <w:rPr>
           <w:color w:val="000000"/>
         </w:rPr>
-        <w:t xml:space="preserve">manglar</w:t>
+        <w:t xml:space="preserve">Santa</w:t>
       </w:r>
       <w:r>
         <w:rPr>
@@ -130,31 +214,7 @@
         <w:rPr>
           <w:color w:val="000000"/>
         </w:rPr>
-        <w:t xml:space="preserve">en</w:t>
-      </w:r>
-      <w:r>
-        <w:rPr>
-          <w:color w:val="000000"/>
-        </w:rPr>
-        <w:t xml:space="preserve"> </w:t>
-      </w:r>
-      <w:r>
-        <w:rPr>
-          <w:color w:val="000000"/>
-        </w:rPr>
-        <w:t xml:space="preserve">la</w:t>
-      </w:r>
-      <w:r>
-        <w:rPr>
-          <w:color w:val="000000"/>
-        </w:rPr>
-        <w:t xml:space="preserve"> </w:t>
-      </w:r>
-      <w:r>
-        <w:rPr>
-          <w:color w:val="000000"/>
-        </w:rPr>
-        <w:t xml:space="preserve">CGSM</w:t>
+        <w:t xml:space="preserve">Marta</w:t>
       </w:r>
       <w:r>
         <w:rPr>
@@ -358,7 +418,7 @@
           <w:b/>
           <w:color w:val="000000"/>
         </w:rPr>
-        <w:t xml:space="preserve">Pipeline multilenguaje (Python, R, Julia) para el monitoreo de manglar en la Ciénaga Grande de Santa Marta (2013–2025)</w:t>
+        <w:t xml:space="preserve">Pipeline multilenguaje GeoAI para el monitoreo del manglar en la Ciénaga Grande de Santa Marta (2013–2025)</w:t>
       </w:r>
       <w:r>
         <w:rPr>
@@ -7694,7 +7754,7 @@
         <w:tblW w:type="pct" w:w="5000"/>
         <w:tblLook w:firstRow="0" w:lastRow="0" w:firstColumn="0" w:lastColumn="0" w:noHBand="0" w:noVBand="0" w:val="0000"/>
         <w:jc w:val="start"/>
-        <w:tblLayout w:type="autofit"/>
+        <w:tblLayout w:type="fixed"/>
         <w:tblBorders>
           <w:top w:val="nil"/>
           <w:left w:val="nil"/>
@@ -7710,24 +7770,6 @@
       <w:tr>
         <w:tc>
           <w:tcPr>
-            <w:tcMar>
-              <w:top w:w="40" w:type="dxa"/>
-              <w:left w:w="60" w:type="dxa"/>
-              <w:bottom w:w="40" w:type="dxa"/>
-              <w:right w:w="60" w:type="dxa"/>
-            </w:tcMar>
-            <w:tcMar>
-              <w:top w:w="40" w:type="dxa"/>
-              <w:left w:w="60" w:type="dxa"/>
-              <w:bottom w:w="40" w:type="dxa"/>
-              <w:right w:w="60" w:type="dxa"/>
-            </w:tcMar>
-            <w:tcMar>
-              <w:top w:w="40" w:type="dxa"/>
-              <w:left w:w="60" w:type="dxa"/>
-              <w:bottom w:w="40" w:type="dxa"/>
-              <w:right w:w="60" w:type="dxa"/>
-            </w:tcMar>
             <w:tcBorders>
               <w:top w:val="nil"/>
               <w:left w:val="nil"/>
@@ -7738,7 +7780,6 @@
           <w:bookmarkStart w:id="41" w:name="tbl-cruce"/>
           <w:p>
             <w:pPr>
-              <w:spacing w:before="0" w:after="0"/>
               <w:jc w:val="center"/>
             </w:pPr>
             <w:pPr>
@@ -7748,9 +7789,7 @@
             </w:pPr>
             <w:r>
               <w:rPr>
-                <w:b/>
                 <w:color w:val="000000"/>
-                <w:sz w:val="20"/>
               </w:rPr>
               <w:t xml:space="preserve">Tabla 1: Cruce de señal SAR, NDVI y frecuencia de inundación histórica por estación, restringido al AOI acotado SFF + VPI Salamanca.</w:t>
             </w:r>
@@ -9706,11 +9745,7 @@
             </w:tr>
           </w:tbl>
           <w:bookmarkEnd w:id="41"/>
-          <w:p>
-            <w:pPr>
-              <w:spacing w:before="0" w:after="0"/>
-            </w:pPr>
-          </w:p>
+          <w:p/>
         </w:tc>
       </w:tr>
     </w:tbl>
@@ -9732,7 +9767,7 @@
         <w:tblW w:type="pct" w:w="5000"/>
         <w:tblLook w:firstRow="0" w:lastRow="0" w:firstColumn="0" w:lastColumn="0" w:noHBand="0" w:noVBand="0" w:val="0000"/>
         <w:jc w:val="start"/>
-        <w:tblLayout w:type="autofit"/>
+        <w:tblLayout w:type="fixed"/>
         <w:tblBorders>
           <w:top w:val="nil"/>
           <w:left w:val="nil"/>
@@ -9748,24 +9783,6 @@
       <w:tr>
         <w:tc>
           <w:tcPr>
-            <w:tcMar>
-              <w:top w:w="40" w:type="dxa"/>
-              <w:left w:w="60" w:type="dxa"/>
-              <w:bottom w:w="40" w:type="dxa"/>
-              <w:right w:w="60" w:type="dxa"/>
-            </w:tcMar>
-            <w:tcMar>
-              <w:top w:w="40" w:type="dxa"/>
-              <w:left w:w="60" w:type="dxa"/>
-              <w:bottom w:w="40" w:type="dxa"/>
-              <w:right w:w="60" w:type="dxa"/>
-            </w:tcMar>
-            <w:tcMar>
-              <w:top w:w="40" w:type="dxa"/>
-              <w:left w:w="60" w:type="dxa"/>
-              <w:bottom w:w="40" w:type="dxa"/>
-              <w:right w:w="60" w:type="dxa"/>
-            </w:tcMar>
             <w:tcBorders>
               <w:top w:val="nil"/>
               <w:left w:val="nil"/>
@@ -9776,7 +9793,6 @@
           <w:bookmarkStart w:id="43" w:name="tbl-jrc"/>
           <w:p>
             <w:pPr>
-              <w:spacing w:before="0" w:after="0"/>
               <w:jc w:val="center"/>
             </w:pPr>
             <w:pPr>
@@ -9786,9 +9802,7 @@
             </w:pPr>
             <w:r>
               <w:rPr>
-                <w:b/>
                 <w:color w:val="000000"/>
-                <w:sz w:val="20"/>
               </w:rPr>
               <w:t xml:space="preserve">Tabla 2: Transiciones JRC Global Surface Water (1984–2021) dentro del AOI acotado SFF + VPI Salamanca. El AOI contiene 385,3 km² de agua permanente (&gt;75 % del tiempo) y 44,1 km² estacional (25–75 %), de modo que casi la mitad del polígono protegido es lámina de agua.</w:t>
             </w:r>
@@ -10744,11 +10758,7 @@
             </w:tr>
           </w:tbl>
           <w:bookmarkEnd w:id="43"/>
-          <w:p>
-            <w:pPr>
-              <w:spacing w:before="0" w:after="0"/>
-            </w:pPr>
-          </w:p>
+          <w:p/>
         </w:tc>
       </w:tr>
     </w:tbl>
@@ -10770,7 +10780,7 @@
         <w:tblW w:type="pct" w:w="5000"/>
         <w:tblLook w:firstRow="0" w:lastRow="0" w:firstColumn="0" w:lastColumn="0" w:noHBand="0" w:noVBand="0" w:val="0000"/>
         <w:jc w:val="start"/>
-        <w:tblLayout w:type="autofit"/>
+        <w:tblLayout w:type="fixed"/>
         <w:tblBorders>
           <w:top w:val="nil"/>
           <w:left w:val="nil"/>
@@ -10786,24 +10796,6 @@
       <w:tr>
         <w:tc>
           <w:tcPr>
-            <w:tcMar>
-              <w:top w:w="40" w:type="dxa"/>
-              <w:left w:w="60" w:type="dxa"/>
-              <w:bottom w:w="40" w:type="dxa"/>
-              <w:right w:w="60" w:type="dxa"/>
-            </w:tcMar>
-            <w:tcMar>
-              <w:top w:w="40" w:type="dxa"/>
-              <w:left w:w="60" w:type="dxa"/>
-              <w:bottom w:w="40" w:type="dxa"/>
-              <w:right w:w="60" w:type="dxa"/>
-            </w:tcMar>
-            <w:tcMar>
-              <w:top w:w="40" w:type="dxa"/>
-              <w:left w:w="60" w:type="dxa"/>
-              <w:bottom w:w="40" w:type="dxa"/>
-              <w:right w:w="60" w:type="dxa"/>
-            </w:tcMar>
             <w:tcBorders>
               <w:top w:val="nil"/>
               <w:left w:val="nil"/>
@@ -10814,7 +10806,6 @@
           <w:bookmarkStart w:id="45" w:name="tbl-entorno"/>
           <w:p>
             <w:pPr>
-              <w:spacing w:before="0" w:after="0"/>
               <w:jc w:val="center"/>
             </w:pPr>
             <w:pPr>
@@ -10824,9 +10815,7 @@
             </w:pPr>
             <w:r>
               <w:rPr>
-                <w:b/>
                 <w:color w:val="000000"/>
-                <w:sz w:val="20"/>
               </w:rPr>
               <w:t xml:space="preserve">Tabla 3: Entorno de ejecución completo del proyecto.</w:t>
             </w:r>
@@ -11355,11 +11344,7 @@
             </w:tr>
           </w:tbl>
           <w:bookmarkEnd w:id="45"/>
-          <w:p>
-            <w:pPr>
-              <w:spacing w:before="0" w:after="0"/>
-            </w:pPr>
-          </w:p>
+          <w:p/>
         </w:tc>
       </w:tr>
     </w:tbl>
@@ -11381,7 +11366,7 @@
         <w:tblW w:type="pct" w:w="5000"/>
         <w:tblLook w:firstRow="0" w:lastRow="0" w:firstColumn="0" w:lastColumn="0" w:noHBand="0" w:noVBand="0" w:val="0000"/>
         <w:jc w:val="start"/>
-        <w:tblLayout w:type="autofit"/>
+        <w:tblLayout w:type="fixed"/>
         <w:tblBorders>
           <w:top w:val="nil"/>
           <w:left w:val="nil"/>
@@ -11397,24 +11382,6 @@
       <w:tr>
         <w:tc>
           <w:tcPr>
-            <w:tcMar>
-              <w:top w:w="40" w:type="dxa"/>
-              <w:left w:w="60" w:type="dxa"/>
-              <w:bottom w:w="40" w:type="dxa"/>
-              <w:right w:w="60" w:type="dxa"/>
-            </w:tcMar>
-            <w:tcMar>
-              <w:top w:w="40" w:type="dxa"/>
-              <w:left w:w="60" w:type="dxa"/>
-              <w:bottom w:w="40" w:type="dxa"/>
-              <w:right w:w="60" w:type="dxa"/>
-            </w:tcMar>
-            <w:tcMar>
-              <w:top w:w="40" w:type="dxa"/>
-              <w:left w:w="60" w:type="dxa"/>
-              <w:bottom w:w="40" w:type="dxa"/>
-              <w:right w:w="60" w:type="dxa"/>
-            </w:tcMar>
             <w:tcBorders>
               <w:top w:val="nil"/>
               <w:left w:val="nil"/>
@@ -11425,7 +11392,6 @@
           <w:bookmarkStart w:id="47" w:name="tbl-bfast"/>
           <w:p>
             <w:pPr>
-              <w:spacing w:before="0" w:after="0"/>
               <w:jc w:val="center"/>
             </w:pPr>
             <w:pPr>
@@ -11435,17 +11401,13 @@
             </w:pPr>
             <w:r>
               <w:rPr>
-                <w:b/>
                 <w:color w:val="000000"/>
-                <w:sz w:val="20"/>
               </w:rPr>
               <w:t xml:space="preserve">Tabla 4: Quiebres estructurales detectados por bfast sobre las ocho estaciones del proyecto en la serie combinada Landsat 8 + Sentinel-2 (2013–2025). El análisis refinado sobre las cuatro estaciones de manglar denso se reporta en la tabla</w:t>
             </w:r>
             <w:r>
               <w:rPr>
-                <w:b/>
                 <w:color w:val="000000"/>
-                <w:sz w:val="20"/>
               </w:rPr>
               <w:t xml:space="preserve"> </w:t>
             </w:r>
@@ -11454,23 +11416,18 @@
                 <w:bCs/>
                 <w:b/>
                 <w:color w:val="000000"/>
-                <w:sz w:val="20"/>
               </w:rPr>
               <w:t xml:space="preserve">?@tbl-bfast-unificado</w:t>
             </w:r>
             <w:r>
               <w:rPr>
-                <w:b/>
                 <w:color w:val="000000"/>
-                <w:sz w:val="20"/>
               </w:rPr>
               <w:t xml:space="preserve"> </w:t>
             </w:r>
             <w:r>
               <w:rPr>
-                <w:b/>
                 <w:color w:val="000000"/>
-                <w:sz w:val="20"/>
               </w:rPr>
               <w:t xml:space="preserve">del informe principal.</w:t>
             </w:r>
@@ -12880,11 +12837,7 @@
             </w:tr>
           </w:tbl>
           <w:bookmarkEnd w:id="47"/>
-          <w:p>
-            <w:pPr>
-              <w:spacing w:before="0" w:after="0"/>
-            </w:pPr>
-          </w:p>
+          <w:p/>
         </w:tc>
       </w:tr>
     </w:tbl>
@@ -12906,7 +12859,7 @@
         <w:tblW w:type="pct" w:w="5000"/>
         <w:tblLook w:firstRow="0" w:lastRow="0" w:firstColumn="0" w:lastColumn="0" w:noHBand="0" w:noVBand="0" w:val="0000"/>
         <w:jc w:val="start"/>
-        <w:tblLayout w:type="autofit"/>
+        <w:tblLayout w:type="fixed"/>
         <w:tblBorders>
           <w:top w:val="nil"/>
           <w:left w:val="nil"/>
@@ -12922,24 +12875,6 @@
       <w:tr>
         <w:tc>
           <w:tcPr>
-            <w:tcMar>
-              <w:top w:w="40" w:type="dxa"/>
-              <w:left w:w="60" w:type="dxa"/>
-              <w:bottom w:w="40" w:type="dxa"/>
-              <w:right w:w="60" w:type="dxa"/>
-            </w:tcMar>
-            <w:tcMar>
-              <w:top w:w="40" w:type="dxa"/>
-              <w:left w:w="60" w:type="dxa"/>
-              <w:bottom w:w="40" w:type="dxa"/>
-              <w:right w:w="60" w:type="dxa"/>
-            </w:tcMar>
-            <w:tcMar>
-              <w:top w:w="40" w:type="dxa"/>
-              <w:left w:w="60" w:type="dxa"/>
-              <w:bottom w:w="40" w:type="dxa"/>
-              <w:right w:w="60" w:type="dxa"/>
-            </w:tcMar>
             <w:tcBorders>
               <w:top w:val="nil"/>
               <w:left w:val="nil"/>
@@ -12950,7 +12885,6 @@
           <w:bookmarkStart w:id="49" w:name="tbl-topología-acotado"/>
           <w:p>
             <w:pPr>
-              <w:spacing w:before="0" w:after="0"/>
               <w:jc w:val="center"/>
             </w:pPr>
             <w:pPr>
@@ -12960,67 +12894,51 @@
             </w:pPr>
             <w:r>
               <w:rPr>
-                <w:b/>
                 <w:color w:val="000000"/>
-                <w:sz w:val="20"/>
               </w:rPr>
               <w:t xml:space="preserve">Tabla 5: Parches de manglar truncados por la frontera del AOI acotado (predicado DE-9IM</w:t>
             </w:r>
             <w:r>
               <w:rPr>
-                <w:b/>
                 <w:color w:val="000000"/>
-                <w:sz w:val="20"/>
               </w:rPr>
               <w:t xml:space="preserve"> </w:t>
             </w:r>
             <w:r>
               <w:rPr>
                 <w:rStyle w:val="VerbatimChar"/>
-                <w:b/>
                 <w:color w:val="000000"/>
-                <w:sz w:val="20"/>
               </w:rPr>
               <w:t xml:space="preserve">intersects</w:t>
             </w:r>
             <w:r>
               <w:rPr>
-                <w:b/>
                 <w:color w:val="000000"/>
-                <w:sz w:val="20"/>
               </w:rPr>
               <w:t xml:space="preserve"> </w:t>
             </w:r>
             <w:r>
               <w:rPr>
-                <w:b/>
                 <w:color w:val="000000"/>
-                <w:sz w:val="20"/>
               </w:rPr>
               <w:t xml:space="preserve">con tolerancia de 30 m). Los parches se cuentan agregados como features completos en</w:t>
             </w:r>
             <w:r>
               <w:rPr>
-                <w:b/>
                 <w:color w:val="000000"/>
-                <w:sz w:val="20"/>
               </w:rPr>
               <w:t xml:space="preserve"> </w:t>
             </w:r>
             <w:r>
               <w:rPr>
                 <w:rStyle w:val="VerbatimChar"/>
-                <w:b/>
                 <w:color w:val="000000"/>
-                <w:sz w:val="20"/>
               </w:rPr>
               <w:t xml:space="preserve">geopandas</w:t>
             </w:r>
             <w:r>
               <w:rPr>
-                <w:b/>
                 <w:color w:val="000000"/>
-                <w:sz w:val="20"/>
               </w:rPr>
               <w:t xml:space="preserve">.</w:t>
             </w:r>
@@ -13670,11 +13588,7 @@
             </w:tr>
           </w:tbl>
           <w:bookmarkEnd w:id="49"/>
-          <w:p>
-            <w:pPr>
-              <w:spacing w:before="0" w:after="0"/>
-            </w:pPr>
-          </w:p>
+          <w:p/>
         </w:tc>
       </w:tr>
     </w:tbl>
@@ -13696,7 +13610,7 @@
         <w:tblW w:type="pct" w:w="5000"/>
         <w:tblLook w:firstRow="0" w:lastRow="0" w:firstColumn="0" w:lastColumn="0" w:noHBand="0" w:noVBand="0" w:val="0000"/>
         <w:jc w:val="start"/>
-        <w:tblLayout w:type="autofit"/>
+        <w:tblLayout w:type="fixed"/>
         <w:tblBorders>
           <w:top w:val="nil"/>
           <w:left w:val="nil"/>
@@ -13712,24 +13626,6 @@
       <w:tr>
         <w:tc>
           <w:tcPr>
-            <w:tcMar>
-              <w:top w:w="40" w:type="dxa"/>
-              <w:left w:w="60" w:type="dxa"/>
-              <w:bottom w:w="40" w:type="dxa"/>
-              <w:right w:w="60" w:type="dxa"/>
-            </w:tcMar>
-            <w:tcMar>
-              <w:top w:w="40" w:type="dxa"/>
-              <w:left w:w="60" w:type="dxa"/>
-              <w:bottom w:w="40" w:type="dxa"/>
-              <w:right w:w="60" w:type="dxa"/>
-            </w:tcMar>
-            <w:tcMar>
-              <w:top w:w="40" w:type="dxa"/>
-              <w:left w:w="60" w:type="dxa"/>
-              <w:bottom w:w="40" w:type="dxa"/>
-              <w:right w:w="60" w:type="dxa"/>
-            </w:tcMar>
             <w:tcBorders>
               <w:top w:val="nil"/>
               <w:left w:val="nil"/>
@@ -13740,7 +13636,6 @@
           <w:bookmarkStart w:id="51" w:name="tbl-anomalias"/>
           <w:p>
             <w:pPr>
-              <w:spacing w:before="0" w:after="0"/>
               <w:jc w:val="center"/>
             </w:pPr>
             <w:pPr>
@@ -13750,9 +13645,7 @@
             </w:pPr>
             <w:r>
               <w:rPr>
-                <w:b/>
                 <w:color w:val="000000"/>
-                <w:sz w:val="20"/>
               </w:rPr>
               <w:t xml:space="preserve">Tabla 6: Anomalias significativas de NDVI (</w:t>
             </w:r>
@@ -13778,9 +13671,7 @@
             </m:oMath>
             <w:r>
               <w:rPr>
-                <w:b/>
                 <w:color w:val="000000"/>
-                <w:sz w:val="20"/>
               </w:rPr>
               <w:t xml:space="preserve">) en la serie combinada 2013–2025, ordenadas por z-score decreciente.</w:t>
             </w:r>
@@ -15190,11 +15081,7 @@
             </w:tr>
           </w:tbl>
           <w:bookmarkEnd w:id="51"/>
-          <w:p>
-            <w:pPr>
-              <w:spacing w:before="0" w:after="0"/>
-            </w:pPr>
-          </w:p>
+          <w:p/>
         </w:tc>
       </w:tr>
     </w:tbl>
@@ -15216,7 +15103,7 @@
         <w:tblW w:type="pct" w:w="5000"/>
         <w:tblLook w:firstRow="0" w:lastRow="0" w:firstColumn="0" w:lastColumn="0" w:noHBand="0" w:noVBand="0" w:val="0000"/>
         <w:jc w:val="start"/>
-        <w:tblLayout w:type="autofit"/>
+        <w:tblLayout w:type="fixed"/>
         <w:tblBorders>
           <w:top w:val="nil"/>
           <w:left w:val="nil"/>
@@ -15232,24 +15119,6 @@
       <w:tr>
         <w:tc>
           <w:tcPr>
-            <w:tcMar>
-              <w:top w:w="40" w:type="dxa"/>
-              <w:left w:w="60" w:type="dxa"/>
-              <w:bottom w:w="40" w:type="dxa"/>
-              <w:right w:w="60" w:type="dxa"/>
-            </w:tcMar>
-            <w:tcMar>
-              <w:top w:w="40" w:type="dxa"/>
-              <w:left w:w="60" w:type="dxa"/>
-              <w:bottom w:w="40" w:type="dxa"/>
-              <w:right w:w="60" w:type="dxa"/>
-            </w:tcMar>
-            <w:tcMar>
-              <w:top w:w="40" w:type="dxa"/>
-              <w:left w:w="60" w:type="dxa"/>
-              <w:bottom w:w="40" w:type="dxa"/>
-              <w:right w:w="60" w:type="dxa"/>
-            </w:tcMar>
             <w:tcBorders>
               <w:top w:val="nil"/>
               <w:left w:val="nil"/>
@@ -15260,7 +15129,6 @@
           <w:bookmarkStart w:id="53" w:name="tbl-flujo"/>
           <w:p>
             <w:pPr>
-              <w:spacing w:before="0" w:after="0"/>
               <w:jc w:val="center"/>
             </w:pPr>
             <w:pPr>
@@ -15270,9 +15138,7 @@
             </w:pPr>
             <w:r>
               <w:rPr>
-                <w:b/>
                 <w:color w:val="000000"/>
-                <w:sz w:val="20"/>
               </w:rPr>
               <w:t xml:space="preserve">Tabla 7: Flujo de datos del pipeline multilenguaje.</w:t>
             </w:r>
@@ -17455,11 +17321,7 @@
             </w:tr>
           </w:tbl>
           <w:bookmarkEnd w:id="53"/>
-          <w:p>
-            <w:pPr>
-              <w:spacing w:before="0" w:after="0"/>
-            </w:pPr>
-          </w:p>
+          <w:p/>
         </w:tc>
       </w:tr>
     </w:tbl>
@@ -17481,7 +17343,7 @@
         <w:tblW w:type="pct" w:w="5000"/>
         <w:tblLook w:firstRow="0" w:lastRow="0" w:firstColumn="0" w:lastColumn="0" w:noHBand="0" w:noVBand="0" w:val="0000"/>
         <w:jc w:val="start"/>
-        <w:tblLayout w:type="autofit"/>
+        <w:tblLayout w:type="fixed"/>
         <w:tblBorders>
           <w:top w:val="nil"/>
           <w:left w:val="nil"/>
@@ -17497,24 +17359,6 @@
       <w:tr>
         <w:tc>
           <w:tcPr>
-            <w:tcMar>
-              <w:top w:w="40" w:type="dxa"/>
-              <w:left w:w="60" w:type="dxa"/>
-              <w:bottom w:w="40" w:type="dxa"/>
-              <w:right w:w="60" w:type="dxa"/>
-            </w:tcMar>
-            <w:tcMar>
-              <w:top w:w="40" w:type="dxa"/>
-              <w:left w:w="60" w:type="dxa"/>
-              <w:bottom w:w="40" w:type="dxa"/>
-              <w:right w:w="60" w:type="dxa"/>
-            </w:tcMar>
-            <w:tcMar>
-              <w:top w:w="40" w:type="dxa"/>
-              <w:left w:w="60" w:type="dxa"/>
-              <w:bottom w:w="40" w:type="dxa"/>
-              <w:right w:w="60" w:type="dxa"/>
-            </w:tcMar>
             <w:tcBorders>
               <w:top w:val="nil"/>
               <w:left w:val="nil"/>
@@ -17525,7 +17369,6 @@
           <w:bookmarkStart w:id="55" w:name="tbl-gfd"/>
           <w:p>
             <w:pPr>
-              <w:spacing w:before="0" w:after="0"/>
               <w:jc w:val="center"/>
             </w:pPr>
             <w:pPr>
@@ -17535,9 +17378,7 @@
             </w:pPr>
             <w:r>
               <w:rPr>
-                <w:b/>
                 <w:color w:val="000000"/>
-                <w:sz w:val="20"/>
               </w:rPr>
               <w:t xml:space="preserve">Tabla 8: Eventos de inundación con mayor área afectada dentro del AOI acotado (Global Flood Database, 2001-2017).</w:t>
             </w:r>
@@ -19251,11 +19092,7 @@
             </w:tr>
           </w:tbl>
           <w:bookmarkEnd w:id="55"/>
-          <w:p>
-            <w:pPr>
-              <w:spacing w:before="0" w:after="0"/>
-            </w:pPr>
-          </w:p>
+          <w:p/>
         </w:tc>
       </w:tr>
     </w:tbl>
@@ -19277,7 +19114,7 @@
         <w:tblW w:type="pct" w:w="5000"/>
         <w:tblLook w:firstRow="0" w:lastRow="0" w:firstColumn="0" w:lastColumn="0" w:noHBand="0" w:noVBand="0" w:val="0000"/>
         <w:jc w:val="start"/>
-        <w:tblLayout w:type="autofit"/>
+        <w:tblLayout w:type="fixed"/>
         <w:tblBorders>
           <w:top w:val="nil"/>
           <w:left w:val="nil"/>
@@ -19293,24 +19130,6 @@
       <w:tr>
         <w:tc>
           <w:tcPr>
-            <w:tcMar>
-              <w:top w:w="40" w:type="dxa"/>
-              <w:left w:w="60" w:type="dxa"/>
-              <w:bottom w:w="40" w:type="dxa"/>
-              <w:right w:w="60" w:type="dxa"/>
-            </w:tcMar>
-            <w:tcMar>
-              <w:top w:w="40" w:type="dxa"/>
-              <w:left w:w="60" w:type="dxa"/>
-              <w:bottom w:w="40" w:type="dxa"/>
-              <w:right w:w="60" w:type="dxa"/>
-            </w:tcMar>
-            <w:tcMar>
-              <w:top w:w="40" w:type="dxa"/>
-              <w:left w:w="60" w:type="dxa"/>
-              <w:bottom w:w="40" w:type="dxa"/>
-              <w:right w:w="60" w:type="dxa"/>
-            </w:tcMar>
             <w:tcBorders>
               <w:top w:val="nil"/>
               <w:left w:val="nil"/>
@@ -19321,7 +19140,6 @@
           <w:bookmarkStart w:id="57" w:name="tbl-sar-ndvi-corr"/>
           <w:p>
             <w:pPr>
-              <w:spacing w:before="0" w:after="0"/>
               <w:jc w:val="center"/>
             </w:pPr>
             <w:pPr>
@@ -19331,9 +19149,7 @@
             </w:pPr>
             <w:r>
               <w:rPr>
-                <w:b/>
                 <w:color w:val="000000"/>
-                <w:sz w:val="20"/>
               </w:rPr>
               <w:t xml:space="preserve">Tabla 9: Correlación de Pearson entre la serie mensual Sentinel-1 SAR-VH y el NDVI z-score derivado de Sentinel-2 para rezagos de 0 a 3 meses, calculada sobre las ocho estaciones entre 2018 y 2025. Valores en negrita: correlaciones significativas (</w:t>
             </w:r>
@@ -19362,9 +19178,7 @@
             </m:oMath>
             <w:r>
               <w:rPr>
-                <w:b/>
                 <w:color w:val="000000"/>
-                <w:sz w:val="20"/>
               </w:rPr>
               <w:t xml:space="preserve">) sobre las cuatro estaciones de manglar denso del Complejo de Pajarales.</w:t>
             </w:r>
@@ -21380,11 +21194,7 @@
             </w:tr>
           </w:tbl>
           <w:bookmarkEnd w:id="57"/>
-          <w:p>
-            <w:pPr>
-              <w:spacing w:before="0" w:after="0"/>
-            </w:pPr>
-          </w:p>
+          <w:p/>
         </w:tc>
       </w:tr>
     </w:tbl>
@@ -21406,7 +21216,7 @@
         <w:tblW w:type="pct" w:w="5000"/>
         <w:tblLook w:firstRow="0" w:lastRow="0" w:firstColumn="0" w:lastColumn="0" w:noHBand="0" w:noVBand="0" w:val="0000"/>
         <w:jc w:val="start"/>
-        <w:tblLayout w:type="autofit"/>
+        <w:tblLayout w:type="fixed"/>
         <w:tblBorders>
           <w:top w:val="nil"/>
           <w:left w:val="nil"/>
@@ -21422,24 +21232,6 @@
       <w:tr>
         <w:tc>
           <w:tcPr>
-            <w:tcMar>
-              <w:top w:w="40" w:type="dxa"/>
-              <w:left w:w="60" w:type="dxa"/>
-              <w:bottom w:w="40" w:type="dxa"/>
-              <w:right w:w="60" w:type="dxa"/>
-            </w:tcMar>
-            <w:tcMar>
-              <w:top w:w="40" w:type="dxa"/>
-              <w:left w:w="60" w:type="dxa"/>
-              <w:bottom w:w="40" w:type="dxa"/>
-              <w:right w:w="60" w:type="dxa"/>
-            </w:tcMar>
-            <w:tcMar>
-              <w:top w:w="40" w:type="dxa"/>
-              <w:left w:w="60" w:type="dxa"/>
-              <w:bottom w:w="40" w:type="dxa"/>
-              <w:right w:w="60" w:type="dxa"/>
-            </w:tcMar>
             <w:tcBorders>
               <w:top w:val="nil"/>
               <w:left w:val="nil"/>
@@ -21450,7 +21242,6 @@
           <w:bookmarkStart w:id="59" w:name="tbl-cubos"/>
           <w:p>
             <w:pPr>
-              <w:spacing w:before="0" w:after="0"/>
               <w:jc w:val="center"/>
             </w:pPr>
             <w:pPr>
@@ -21460,9 +21251,7 @@
             </w:pPr>
             <w:r>
               <w:rPr>
-                <w:b/>
                 <w:color w:val="000000"/>
-                <w:sz w:val="20"/>
               </w:rPr>
               <w:t xml:space="preserve">Tabla 10: Datacubes NetCDF CF-1.8 materializados sobre el AOI acotado en EPSG:9377 (MAGNA-SIRGAS Origen Nacional), comprimidos con zlib nivel 4.</w:t>
             </w:r>
@@ -22238,11 +22027,7 @@
             </w:tr>
           </w:tbl>
           <w:bookmarkEnd w:id="59"/>
-          <w:p>
-            <w:pPr>
-              <w:spacing w:before="0" w:after="0"/>
-            </w:pPr>
-          </w:p>
+          <w:p/>
         </w:tc>
       </w:tr>
     </w:tbl>
@@ -22264,7 +22049,7 @@
         <w:tblW w:type="pct" w:w="5000"/>
         <w:tblLook w:firstRow="0" w:lastRow="0" w:firstColumn="0" w:lastColumn="0" w:noHBand="0" w:noVBand="0" w:val="0000"/>
         <w:jc w:val="start"/>
-        <w:tblLayout w:type="autofit"/>
+        <w:tblLayout w:type="fixed"/>
         <w:tblBorders>
           <w:top w:val="nil"/>
           <w:left w:val="nil"/>
@@ -22280,24 +22065,6 @@
       <w:tr>
         <w:tc>
           <w:tcPr>
-            <w:tcMar>
-              <w:top w:w="40" w:type="dxa"/>
-              <w:left w:w="60" w:type="dxa"/>
-              <w:bottom w:w="40" w:type="dxa"/>
-              <w:right w:w="60" w:type="dxa"/>
-            </w:tcMar>
-            <w:tcMar>
-              <w:top w:w="40" w:type="dxa"/>
-              <w:left w:w="60" w:type="dxa"/>
-              <w:bottom w:w="40" w:type="dxa"/>
-              <w:right w:w="60" w:type="dxa"/>
-            </w:tcMar>
-            <w:tcMar>
-              <w:top w:w="40" w:type="dxa"/>
-              <w:left w:w="60" w:type="dxa"/>
-              <w:bottom w:w="40" w:type="dxa"/>
-              <w:right w:w="60" w:type="dxa"/>
-            </w:tcMar>
             <w:tcBorders>
               <w:top w:val="nil"/>
               <w:left w:val="nil"/>
@@ -22308,7 +22075,6 @@
           <w:bookmarkStart w:id="61" w:name="tbl-enso-corr"/>
           <w:p>
             <w:pPr>
-              <w:spacing w:before="0" w:after="0"/>
               <w:jc w:val="center"/>
             </w:pPr>
             <w:pPr>
@@ -22318,9 +22084,7 @@
             </w:pPr>
             <w:r>
               <w:rPr>
-                <w:b/>
                 <w:color w:val="000000"/>
-                <w:sz w:val="20"/>
               </w:rPr>
               <w:t xml:space="preserve">Tabla 11: Correlación de Pearson entre índices ENSO globales (ONI y SOI de NOAA) y NDVI z-score desagregada por naturaleza espectral.</w:t>
             </w:r>
@@ -23974,11 +23738,7 @@
             </w:tr>
           </w:tbl>
           <w:bookmarkEnd w:id="61"/>
-          <w:p>
-            <w:pPr>
-              <w:spacing w:before="0" w:after="0"/>
-            </w:pPr>
-          </w:p>
+          <w:p/>
         </w:tc>
       </w:tr>
     </w:tbl>
@@ -24000,7 +23760,7 @@
         <w:tblW w:type="pct" w:w="5000"/>
         <w:tblLook w:firstRow="0" w:lastRow="0" w:firstColumn="0" w:lastColumn="0" w:noHBand="0" w:noVBand="0" w:val="0000"/>
         <w:jc w:val="start"/>
-        <w:tblLayout w:type="autofit"/>
+        <w:tblLayout w:type="fixed"/>
         <w:tblBorders>
           <w:top w:val="nil"/>
           <w:left w:val="nil"/>
@@ -24016,24 +23776,6 @@
       <w:tr>
         <w:tc>
           <w:tcPr>
-            <w:tcMar>
-              <w:top w:w="40" w:type="dxa"/>
-              <w:left w:w="60" w:type="dxa"/>
-              <w:bottom w:w="40" w:type="dxa"/>
-              <w:right w:w="60" w:type="dxa"/>
-            </w:tcMar>
-            <w:tcMar>
-              <w:top w:w="40" w:type="dxa"/>
-              <w:left w:w="60" w:type="dxa"/>
-              <w:bottom w:w="40" w:type="dxa"/>
-              <w:right w:w="60" w:type="dxa"/>
-            </w:tcMar>
-            <w:tcMar>
-              <w:top w:w="40" w:type="dxa"/>
-              <w:left w:w="60" w:type="dxa"/>
-              <w:bottom w:w="40" w:type="dxa"/>
-              <w:right w:w="60" w:type="dxa"/>
-            </w:tcMar>
             <w:tcBorders>
               <w:top w:val="nil"/>
               <w:left w:val="nil"/>
@@ -24044,7 +23786,6 @@
           <w:bookmarkStart w:id="63" w:name="tbl-caudal-corr"/>
           <w:p>
             <w:pPr>
-              <w:spacing w:before="0" w:after="0"/>
               <w:jc w:val="center"/>
             </w:pPr>
             <w:pPr>
@@ -24054,9 +23795,7 @@
             </w:pPr>
             <w:r>
               <w:rPr>
-                <w:b/>
                 <w:color w:val="000000"/>
-                <w:sz w:val="20"/>
               </w:rPr>
               <w:t xml:space="preserve">Tabla 12: Correlación de Pearson entre anomalía de caudal IDEAM y NDVI z-score, desagregada por estación hidrológica, naturaleza espectral y rezago temporal.</w:t>
             </w:r>
@@ -26916,11 +26655,7 @@
             </w:tr>
           </w:tbl>
           <w:bookmarkEnd w:id="63"/>
-          <w:p>
-            <w:pPr>
-              <w:spacing w:before="0" w:after="0"/>
-            </w:pPr>
-          </w:p>
+          <w:p/>
         </w:tc>
       </w:tr>
     </w:tbl>
@@ -26942,7 +26677,7 @@
         <w:tblW w:type="pct" w:w="5000"/>
         <w:tblLook w:firstRow="0" w:lastRow="0" w:firstColumn="0" w:lastColumn="0" w:noHBand="0" w:noVBand="0" w:val="0000"/>
         <w:jc w:val="start"/>
-        <w:tblLayout w:type="autofit"/>
+        <w:tblLayout w:type="fixed"/>
         <w:tblBorders>
           <w:top w:val="nil"/>
           <w:left w:val="nil"/>
@@ -26958,24 +26693,6 @@
       <w:tr>
         <w:tc>
           <w:tcPr>
-            <w:tcMar>
-              <w:top w:w="40" w:type="dxa"/>
-              <w:left w:w="60" w:type="dxa"/>
-              <w:bottom w:w="40" w:type="dxa"/>
-              <w:right w:w="60" w:type="dxa"/>
-            </w:tcMar>
-            <w:tcMar>
-              <w:top w:w="40" w:type="dxa"/>
-              <w:left w:w="60" w:type="dxa"/>
-              <w:bottom w:w="40" w:type="dxa"/>
-              <w:right w:w="60" w:type="dxa"/>
-            </w:tcMar>
-            <w:tcMar>
-              <w:top w:w="40" w:type="dxa"/>
-              <w:left w:w="60" w:type="dxa"/>
-              <w:bottom w:w="40" w:type="dxa"/>
-              <w:right w:w="60" w:type="dxa"/>
-            </w:tcMar>
             <w:tcBorders>
               <w:top w:val="nil"/>
               <w:left w:val="nil"/>
@@ -26986,7 +26703,6 @@
           <w:bookmarkStart w:id="65" w:name="tbl-chirps-corr"/>
           <w:p>
             <w:pPr>
-              <w:spacing w:before="0" w:after="0"/>
               <w:jc w:val="center"/>
             </w:pPr>
             <w:pPr>
@@ -26996,9 +26712,7 @@
             </w:pPr>
             <w:r>
               <w:rPr>
-                <w:b/>
                 <w:color w:val="000000"/>
-                <w:sz w:val="20"/>
               </w:rPr>
               <w:t xml:space="preserve">Tabla 13: Correlación de Pearson entre anomalía mensual CHIRPS sobre cuencas aportantes y NDVI z-score de las estaciones de la CGSM.</w:t>
             </w:r>
@@ -28530,11 +28244,7 @@
             </w:tr>
           </w:tbl>
           <w:bookmarkEnd w:id="65"/>
-          <w:p>
-            <w:pPr>
-              <w:spacing w:before="0" w:after="0"/>
-            </w:pPr>
-          </w:p>
+          <w:p/>
         </w:tc>
       </w:tr>
     </w:tbl>
@@ -28556,7 +28266,7 @@
         <w:tblW w:type="pct" w:w="5000"/>
         <w:tblLook w:firstRow="0" w:lastRow="0" w:firstColumn="0" w:lastColumn="0" w:noHBand="0" w:noVBand="0" w:val="0000"/>
         <w:jc w:val="start"/>
-        <w:tblLayout w:type="autofit"/>
+        <w:tblLayout w:type="fixed"/>
         <w:tblBorders>
           <w:top w:val="nil"/>
           <w:left w:val="nil"/>
@@ -28572,24 +28282,6 @@
       <w:tr>
         <w:tc>
           <w:tcPr>
-            <w:tcMar>
-              <w:top w:w="40" w:type="dxa"/>
-              <w:left w:w="60" w:type="dxa"/>
-              <w:bottom w:w="40" w:type="dxa"/>
-              <w:right w:w="60" w:type="dxa"/>
-            </w:tcMar>
-            <w:tcMar>
-              <w:top w:w="40" w:type="dxa"/>
-              <w:left w:w="60" w:type="dxa"/>
-              <w:bottom w:w="40" w:type="dxa"/>
-              <w:right w:w="60" w:type="dxa"/>
-            </w:tcMar>
-            <w:tcMar>
-              <w:top w:w="40" w:type="dxa"/>
-              <w:left w:w="60" w:type="dxa"/>
-              <w:bottom w:w="40" w:type="dxa"/>
-              <w:right w:w="60" w:type="dxa"/>
-            </w:tcMar>
             <w:tcBorders>
               <w:top w:val="nil"/>
               <w:left w:val="nil"/>
@@ -28600,7 +28292,6 @@
           <w:bookmarkStart w:id="67" w:name="tbl-era5"/>
           <w:p>
             <w:pPr>
-              <w:spacing w:before="0" w:after="0"/>
               <w:jc w:val="center"/>
             </w:pPr>
             <w:pPr>
@@ -28610,9 +28301,7 @@
             </w:pPr>
             <w:r>
               <w:rPr>
-                <w:b/>
                 <w:color w:val="000000"/>
-                <w:sz w:val="20"/>
               </w:rPr>
               <w:t xml:space="preserve">Tabla 14: Correlación entre anomalías climáticas ERA5-Land (precipitación y temperatura a 2 m) y NDVI z-score, desagregada por naturaleza espectral.</w:t>
             </w:r>
@@ -30272,11 +29961,7 @@
             </w:tr>
           </w:tbl>
           <w:bookmarkEnd w:id="67"/>
-          <w:p>
-            <w:pPr>
-              <w:spacing w:before="0" w:after="0"/>
-            </w:pPr>
-          </w:p>
+          <w:p/>
         </w:tc>
       </w:tr>
     </w:tbl>

</xml_diff>

<commit_message>
Switch a workflow docx-source: revisado.docx como fuente, html+md via pandoc, PDF via Typst (29 pags). Archiva qmd LaTeX + scripts viejos en _legacy. Agrega update_from_docx.sh.
</commit_message>
<xml_diff>
--- a/docs/informe_anexos.docx
+++ b/docs/informe_anexos.docx
@@ -1217,51 +1217,51 @@
         <w:rPr>
           <w:color w:val="000000"/>
         </w:rPr>
-        <w:t xml:space="preserve">La autenticación con GEE se realiza mediante el flujo</w:t>
-      </w:r>
-      <w:r>
-        <w:rPr>
-          <w:color w:val="000000"/>
-        </w:rPr>
-        <w:t xml:space="preserve"> </w:t>
+        <w:t xml:space="preserve">La autenticación con GEE se realiza mediante el flujo gcloud auth application-default login con quota project configurado, que genera credenciales almacenadas en ~/.config/gcloud/application_default_credentials.json. El contenedor requiere un mínimo de 8 GB de RAM asignados en Docker Desktop para ejecutar SamGeo con el backbone vit_b; con vit_h se requieren al menos 12 GB. Las composiciones RGB se remuestrean de 10 a 30 metros antes de la segmentación para reducir el consumo de memoria.</w:t>
+      </w:r>
+      <w:r>
+        <w:rPr>
+          <w:color w:val="000000"/>
+        </w:rPr>
+        <w:t xml:space="preserve"/>
       </w:r>
       <w:r>
         <w:rPr>
           <w:rStyle w:val="VerbatimChar"/>
           <w:color w:val="000000"/>
         </w:rPr>
-        <w:t xml:space="preserve">gcloud auth application-default login</w:t>
-      </w:r>
-      <w:r>
-        <w:rPr>
-          <w:color w:val="000000"/>
-        </w:rPr>
-        <w:t xml:space="preserve"> </w:t>
-      </w:r>
-      <w:r>
-        <w:rPr>
-          <w:color w:val="000000"/>
-        </w:rPr>
-        <w:t xml:space="preserve">con quota project configurado, que genera credenciales almacenadas en</w:t>
-      </w:r>
-      <w:r>
-        <w:rPr>
-          <w:color w:val="000000"/>
-        </w:rPr>
-        <w:t xml:space="preserve"> </w:t>
+        <w:t xml:space="preserve"/>
+      </w:r>
+      <w:r>
+        <w:rPr>
+          <w:color w:val="000000"/>
+        </w:rPr>
+        <w:t xml:space="preserve"/>
+      </w:r>
+      <w:r>
+        <w:rPr>
+          <w:color w:val="000000"/>
+        </w:rPr>
+        <w:t xml:space="preserve"/>
+      </w:r>
+      <w:r>
+        <w:rPr>
+          <w:color w:val="000000"/>
+        </w:rPr>
+        <w:t xml:space="preserve"/>
       </w:r>
       <w:r>
         <w:rPr>
           <w:rStyle w:val="VerbatimChar"/>
           <w:color w:val="000000"/>
         </w:rPr>
-        <w:t xml:space="preserve">~/.config/gcloud/application_default_credentials.json</w:t>
-      </w:r>
-      <w:r>
-        <w:rPr>
-          <w:color w:val="000000"/>
-        </w:rPr>
-        <w:t xml:space="preserve">. El contenedor requiere un mínimo de 8 GB de RAM asignados en Docker Desktop para ejecutar SamGeo con el backbone vit_b; con vit_h se requieren al menos 12 GB. Los composites RGB se remuestrean de 10 a 30 metros antes de la segmentación para reducir el consumo de memoria.</w:t>
+        <w:t xml:space="preserve"/>
+      </w:r>
+      <w:r>
+        <w:rPr>
+          <w:color w:val="000000"/>
+        </w:rPr>
+        <w:t xml:space="preserve"/>
       </w:r>
     </w:p>
     <w:bookmarkEnd w:id="21"/>
@@ -1285,13 +1285,13 @@
         <w:rPr>
           <w:color w:val="000000"/>
         </w:rPr>
-        <w:t xml:space="preserve">El repositorio público está disponible en</w:t>
-      </w:r>
-      <w:r>
-        <w:rPr>
-          <w:color w:val="000000"/>
-        </w:rPr>
-        <w:t xml:space="preserve"> </w:t>
+        <w:t xml:space="preserve">El repositorio público está disponible en  bajo licencia MIT. La versión anterior del proyecto (línea base marzo 2026 sobre AOI preliminar de 5.073 km²) permanece archivada en  para fines de comparación histórica.</w:t>
+      </w:r>
+      <w:r>
+        <w:rPr>
+          <w:color w:val="000000"/>
+        </w:rPr>
+        <w:t xml:space="preserve"/>
       </w:r>
       <w:hyperlink r:id="rId22">
         <w:r>
@@ -1305,19 +1305,19 @@
         <w:rPr>
           <w:color w:val="000000"/>
         </w:rPr>
-        <w:t xml:space="preserve"> </w:t>
-      </w:r>
-      <w:r>
-        <w:rPr>
-          <w:color w:val="000000"/>
-        </w:rPr>
-        <w:t xml:space="preserve">bajo licencia MIT. La versión anterior del proyecto (línea base marzo 2026 sobre AOI envolvente de 5.073 km²) permanece archivada en</w:t>
-      </w:r>
-      <w:r>
-        <w:rPr>
-          <w:color w:val="000000"/>
-        </w:rPr>
-        <w:t xml:space="preserve"> </w:t>
+        <w:t xml:space="preserve"/>
+      </w:r>
+      <w:r>
+        <w:rPr>
+          <w:color w:val="000000"/>
+        </w:rPr>
+        <w:t xml:space="preserve"/>
+      </w:r>
+      <w:r>
+        <w:rPr>
+          <w:color w:val="000000"/>
+        </w:rPr>
+        <w:t xml:space="preserve"/>
       </w:r>
       <w:hyperlink r:id="rId23">
         <w:r>
@@ -1331,13 +1331,13 @@
         <w:rPr>
           <w:color w:val="000000"/>
         </w:rPr>
-        <w:t xml:space="preserve"> </w:t>
-      </w:r>
-      <w:r>
-        <w:rPr>
-          <w:color w:val="000000"/>
-        </w:rPr>
-        <w:t xml:space="preserve">para fines de comparación histórica.</w:t>
+        <w:t xml:space="preserve"/>
+      </w:r>
+      <w:r>
+        <w:rPr>
+          <w:color w:val="000000"/>
+        </w:rPr>
+        <w:t xml:space="preserve"/>
       </w:r>
     </w:p>
     <w:p>
@@ -1349,7 +1349,7 @@
           <w:rStyle w:val="VerbatimChar"/>
           <w:color w:val="000000"/>
         </w:rPr>
-        <w:t xml:space="preserve">proyecto-cgsm-curso/</w:t>
+        <w:t xml:space="preserve">proyecto-cgsm-curso/├── notebooks/        29 notebooks numerados (vigente 01-12 + legacy 03_…14)│                     orden de ejecución: 01 → 02 → 02b → 03_acotado →│                     04_acotado → 04b_acotado → 05_acotado → 07 → 08 →│                     09b → 10 → 11 → 11b → 12 → 12b → 12c → 13 → 14├── src/│   ├── python/       utils.py (9377 + DE-9IM), aoi_acotado.py, build_cubos.py,│   │                 make_dashboard_html.py, alertas_manglar.py, merge_cubo.py│   ├── R/            03_bfast_ndvi.R, 05_stars_cubo.R, 06_bfast_manglar_unificado.R,│   │                 08_correlacion_trilingual.R│   └── julia/        04_fragmentación.jl (4326 legado + 9377 vigente),│                     05_correlacion_trilingual.jl├── data/│   ├── raw/          AOI preliminar y acotado, RUNAP SFF + VPI, INVEMAR GBIF,│   │                 IDEAM El Banco / Ganadería Caribe│   └── processed/│       ├── cubo/     3 datacubes NetCDF CF-1.8 (40 / 275 / 119 MB)│       └── samgeo/   máscaras y GeoJSON por periodo (degradación / recuperación / actual)├── outputs/│   ├── tables/       47 CSV con resultados numéricos│   ├── figures/      35 PNG (mapas, series, correlaciones, validación, alertas)│   └── maps/         dashboard_CGSM_final.html (autocontenido, ~80 KB)└── docs/             informe_final.{qmd,html,pdf}, informe_anexos.{qmd,html,pdf},                      dashboard.html (Pages), outputs/{figures,maps}/ (Pages)</w:t>
       </w:r>
       <w:r>
         <w:rPr>
@@ -1362,7 +1362,7 @@
           <w:rStyle w:val="VerbatimChar"/>
           <w:color w:val="000000"/>
         </w:rPr>
-        <w:t xml:space="preserve">├── notebooks/        29 notebooks numerados (vigente 01-12 + legacy 03_…14)</w:t>
+        <w:t xml:space="preserve"/>
       </w:r>
       <w:r>
         <w:rPr>
@@ -1375,7 +1375,7 @@
           <w:rStyle w:val="VerbatimChar"/>
           <w:color w:val="000000"/>
         </w:rPr>
-        <w:t xml:space="preserve">│                     orden de ejecución: 01 → 02 → 02b → 03_acotado →</w:t>
+        <w:t xml:space="preserve"/>
       </w:r>
       <w:r>
         <w:rPr>
@@ -1388,7 +1388,7 @@
           <w:rStyle w:val="VerbatimChar"/>
           <w:color w:val="000000"/>
         </w:rPr>
-        <w:t xml:space="preserve">│                     04_acotado → 04b_acotado → 05_acotado → 07 → 08 →</w:t>
+        <w:t xml:space="preserve"/>
       </w:r>
       <w:r>
         <w:rPr>
@@ -1401,7 +1401,7 @@
           <w:rStyle w:val="VerbatimChar"/>
           <w:color w:val="000000"/>
         </w:rPr>
-        <w:t xml:space="preserve">│                     09b → 10 → 11 → 11b → 12 → 12b → 12c → 13 → 14</w:t>
+        <w:t xml:space="preserve"/>
       </w:r>
       <w:r>
         <w:rPr>
@@ -1414,7 +1414,7 @@
           <w:rStyle w:val="VerbatimChar"/>
           <w:color w:val="000000"/>
         </w:rPr>
-        <w:t xml:space="preserve">├── src/</w:t>
+        <w:t xml:space="preserve"/>
       </w:r>
       <w:r>
         <w:rPr>
@@ -1427,7 +1427,7 @@
           <w:rStyle w:val="VerbatimChar"/>
           <w:color w:val="000000"/>
         </w:rPr>
-        <w:t xml:space="preserve">│   ├── python/       utils.py (9377 + DE-9IM), aoi_acotado.py, build_cubos.py,</w:t>
+        <w:t xml:space="preserve"/>
       </w:r>
       <w:r>
         <w:rPr>
@@ -1440,7 +1440,7 @@
           <w:rStyle w:val="VerbatimChar"/>
           <w:color w:val="000000"/>
         </w:rPr>
-        <w:t xml:space="preserve">│   │                 make_dashboard_html.py, alertas_manglar.py, merge_cubo.py</w:t>
+        <w:t xml:space="preserve"/>
       </w:r>
       <w:r>
         <w:rPr>
@@ -1453,7 +1453,7 @@
           <w:rStyle w:val="VerbatimChar"/>
           <w:color w:val="000000"/>
         </w:rPr>
-        <w:t xml:space="preserve">│   ├── R/            03_bfast_ndvi.R, 05_stars_cubo.R, 06_bfast_manglar_unificado.R,</w:t>
+        <w:t xml:space="preserve"/>
       </w:r>
       <w:r>
         <w:rPr>
@@ -1466,7 +1466,7 @@
           <w:rStyle w:val="VerbatimChar"/>
           <w:color w:val="000000"/>
         </w:rPr>
-        <w:t xml:space="preserve">│   │                 08_correlacion_trilingual.R</w:t>
+        <w:t xml:space="preserve"/>
       </w:r>
       <w:r>
         <w:rPr>
@@ -1479,7 +1479,7 @@
           <w:rStyle w:val="VerbatimChar"/>
           <w:color w:val="000000"/>
         </w:rPr>
-        <w:t xml:space="preserve">│   └── julia/        04_fragmentación.jl (4326 legado + 9377 vigente),</w:t>
+        <w:t xml:space="preserve"/>
       </w:r>
       <w:r>
         <w:rPr>
@@ -1492,7 +1492,7 @@
           <w:rStyle w:val="VerbatimChar"/>
           <w:color w:val="000000"/>
         </w:rPr>
-        <w:t xml:space="preserve">│                     05_correlacion_trilingual.jl</w:t>
+        <w:t xml:space="preserve"/>
       </w:r>
       <w:r>
         <w:rPr>
@@ -1505,7 +1505,7 @@
           <w:rStyle w:val="VerbatimChar"/>
           <w:color w:val="000000"/>
         </w:rPr>
-        <w:t xml:space="preserve">├── data/</w:t>
+        <w:t xml:space="preserve"/>
       </w:r>
       <w:r>
         <w:rPr>
@@ -1518,7 +1518,7 @@
           <w:rStyle w:val="VerbatimChar"/>
           <w:color w:val="000000"/>
         </w:rPr>
-        <w:t xml:space="preserve">│   ├── raw/          AOI envolvente y acotado, RUNAP SFF + VPI, INVEMAR GBIF,</w:t>
+        <w:t xml:space="preserve"/>
       </w:r>
       <w:r>
         <w:rPr>
@@ -1531,7 +1531,7 @@
           <w:rStyle w:val="VerbatimChar"/>
           <w:color w:val="000000"/>
         </w:rPr>
-        <w:t xml:space="preserve">│   │                 IDEAM El Banco / Ganadería Caribe</w:t>
+        <w:t xml:space="preserve"/>
       </w:r>
       <w:r>
         <w:rPr>
@@ -1544,7 +1544,7 @@
           <w:rStyle w:val="VerbatimChar"/>
           <w:color w:val="000000"/>
         </w:rPr>
-        <w:t xml:space="preserve">│   └── processed/</w:t>
+        <w:t xml:space="preserve"/>
       </w:r>
       <w:r>
         <w:rPr>
@@ -1557,7 +1557,7 @@
           <w:rStyle w:val="VerbatimChar"/>
           <w:color w:val="000000"/>
         </w:rPr>
-        <w:t xml:space="preserve">│       ├── cubo/     3 datacubes NetCDF CF-1.8 (40 / 275 / 119 MB)</w:t>
+        <w:t xml:space="preserve"/>
       </w:r>
       <w:r>
         <w:rPr>
@@ -1570,7 +1570,7 @@
           <w:rStyle w:val="VerbatimChar"/>
           <w:color w:val="000000"/>
         </w:rPr>
-        <w:t xml:space="preserve">│       └── samgeo/   máscaras y GeoJSON por periodo (degradación / recuperación / actual)</w:t>
+        <w:t xml:space="preserve"/>
       </w:r>
       <w:r>
         <w:rPr>
@@ -1583,7 +1583,7 @@
           <w:rStyle w:val="VerbatimChar"/>
           <w:color w:val="000000"/>
         </w:rPr>
-        <w:t xml:space="preserve">├── outputs/</w:t>
+        <w:t xml:space="preserve"/>
       </w:r>
       <w:r>
         <w:rPr>
@@ -1596,7 +1596,7 @@
           <w:rStyle w:val="VerbatimChar"/>
           <w:color w:val="000000"/>
         </w:rPr>
-        <w:t xml:space="preserve">│   ├── tables/       47 CSV con resultados numéricos</w:t>
+        <w:t xml:space="preserve"/>
       </w:r>
       <w:r>
         <w:rPr>
@@ -1609,7 +1609,7 @@
           <w:rStyle w:val="VerbatimChar"/>
           <w:color w:val="000000"/>
         </w:rPr>
-        <w:t xml:space="preserve">│   ├── figures/      35 PNG (mapas, series, correlaciones, validación, alertas)</w:t>
+        <w:t xml:space="preserve"/>
       </w:r>
       <w:r>
         <w:rPr>
@@ -1622,7 +1622,7 @@
           <w:rStyle w:val="VerbatimChar"/>
           <w:color w:val="000000"/>
         </w:rPr>
-        <w:t xml:space="preserve">│   └── maps/         dashboard_CGSM_final.html (autocontenido, ~80 KB)</w:t>
+        <w:t xml:space="preserve"/>
       </w:r>
       <w:r>
         <w:rPr>
@@ -1635,7 +1635,7 @@
           <w:rStyle w:val="VerbatimChar"/>
           <w:color w:val="000000"/>
         </w:rPr>
-        <w:t xml:space="preserve">└── docs/             informe_final.{qmd,html,pdf}, informe_anexos.{qmd,html,pdf},</w:t>
+        <w:t xml:space="preserve"/>
       </w:r>
       <w:r>
         <w:rPr>
@@ -1648,7 +1648,7 @@
           <w:rStyle w:val="VerbatimChar"/>
           <w:color w:val="000000"/>
         </w:rPr>
-        <w:t xml:space="preserve">                      dashboard.html (Pages), outputs/{figures,maps}/ (Pages)</w:t>
+        <w:t xml:space="preserve"/>
       </w:r>
     </w:p>
     <w:p>
@@ -1659,13 +1659,13 @@
         <w:rPr>
           <w:color w:val="000000"/>
         </w:rPr>
-        <w:t xml:space="preserve">La serie</w:t>
-      </w:r>
-      <w:r>
-        <w:rPr>
-          <w:color w:val="000000"/>
-        </w:rPr>
-        <w:t xml:space="preserve"> </w:t>
+        <w:t xml:space="preserve">La serie vigente (notebooks 01–12 + 02b, 04b/c_acotado, 09b, 11b, 12b/c, 14) reproduce las cifras del cuerpo del informe sobre el AOI acotado de 835 km². La serie legacy (03, 04, 04b, 05, 06, 09 sin sufijo _acotado) opera sobre el AOI preliminar de 5.073 km² y se conserva sólo por trazabilidad histórica; no sostiene ninguna conclusión del informe. La guía de ejecución por etapa con dependencias entre notebooks se documenta en notebooks/README.md. Las composiciones trimestrales y anuales en GeoTIFF y los NetCDF de mayor tamaño no se versionan por restricciones de tamaño de GitHub: se regeneran ejecutando los notebooks en orden secuencial con acceso autenticado a GEE.</w:t>
+      </w:r>
+      <w:r>
+        <w:rPr>
+          <w:color w:val="000000"/>
+        </w:rPr>
+        <w:t xml:space="preserve"/>
       </w:r>
       <w:r>
         <w:rPr>
@@ -1673,25 +1673,25 @@
           <w:b/>
           <w:color w:val="000000"/>
         </w:rPr>
-        <w:t xml:space="preserve">vigente</w:t>
-      </w:r>
-      <w:r>
-        <w:rPr>
-          <w:color w:val="000000"/>
-        </w:rPr>
-        <w:t xml:space="preserve"> </w:t>
-      </w:r>
-      <w:r>
-        <w:rPr>
-          <w:color w:val="000000"/>
-        </w:rPr>
-        <w:t xml:space="preserve">(notebooks 01–12 + 02b, 04b/c_acotado, 09b, 11b, 12b/c, 14) reproduce las cifras del cuerpo del informe sobre el AOI acotado de 835 km². La serie</w:t>
-      </w:r>
-      <w:r>
-        <w:rPr>
-          <w:color w:val="000000"/>
-        </w:rPr>
-        <w:t xml:space="preserve"> </w:t>
+        <w:t xml:space="preserve"/>
+      </w:r>
+      <w:r>
+        <w:rPr>
+          <w:color w:val="000000"/>
+        </w:rPr>
+        <w:t xml:space="preserve"/>
+      </w:r>
+      <w:r>
+        <w:rPr>
+          <w:color w:val="000000"/>
+        </w:rPr>
+        <w:t xml:space="preserve"/>
+      </w:r>
+      <w:r>
+        <w:rPr>
+          <w:color w:val="000000"/>
+        </w:rPr>
+        <w:t xml:space="preserve"/>
       </w:r>
       <w:r>
         <w:rPr>
@@ -1699,38 +1699,38 @@
           <w:b/>
           <w:color w:val="000000"/>
         </w:rPr>
-        <w:t xml:space="preserve">legacy</w:t>
-      </w:r>
-      <w:r>
-        <w:rPr>
-          <w:color w:val="000000"/>
-        </w:rPr>
-        <w:t xml:space="preserve"> </w:t>
-      </w:r>
-      <w:r>
-        <w:rPr>
-          <w:color w:val="000000"/>
-        </w:rPr>
-        <w:t xml:space="preserve">(03, 04, 04b, 05, 06, 09 sin sufijo _acotado) opera sobre el AOI envolvente de 5.073 km² y se conserva sólo por trazabilidad histórica; no sostiene ninguna conclusión del informe. La guía de ejecución por etapa con dependencias entre notebooks se documenta en</w:t>
-      </w:r>
-      <w:r>
-        <w:rPr>
-          <w:color w:val="000000"/>
-        </w:rPr>
-        <w:t xml:space="preserve"> </w:t>
+        <w:t xml:space="preserve"/>
+      </w:r>
+      <w:r>
+        <w:rPr>
+          <w:color w:val="000000"/>
+        </w:rPr>
+        <w:t xml:space="preserve"/>
+      </w:r>
+      <w:r>
+        <w:rPr>
+          <w:color w:val="000000"/>
+        </w:rPr>
+        <w:t xml:space="preserve"/>
+      </w:r>
+      <w:r>
+        <w:rPr>
+          <w:color w:val="000000"/>
+        </w:rPr>
+        <w:t xml:space="preserve"/>
       </w:r>
       <w:r>
         <w:rPr>
           <w:rStyle w:val="VerbatimChar"/>
           <w:color w:val="000000"/>
         </w:rPr>
-        <w:t xml:space="preserve">notebooks/README.md</w:t>
-      </w:r>
-      <w:r>
-        <w:rPr>
-          <w:color w:val="000000"/>
-        </w:rPr>
-        <w:t xml:space="preserve">. Los composites trimestrales y anuales en GeoTIFF y los NetCDF de mayor tamaño no se versionan por restricciones de tamaño de GitHub: se regeneran ejecutando los notebooks en orden secuencial con acceso autenticado a GEE.</w:t>
+        <w:t xml:space="preserve"/>
+      </w:r>
+      <w:r>
+        <w:rPr>
+          <w:color w:val="000000"/>
+        </w:rPr>
+        <w:t xml:space="preserve"/>
       </w:r>
     </w:p>
     <w:bookmarkEnd w:id="24"/>
@@ -4960,7 +4960,7 @@
         <w:rPr>
           <w:color w:val="000000"/>
         </w:rPr>
-        <w:t xml:space="preserve">La segmentación automática de los composites RGB de los tres periodos de referencia se ejecuta con el backbone vit_b de SamGeo —versión adaptada al límite de memoria del contenedor sig_unal v1.11— produciendo una máscara raster por periodo que se vectoriza a GeoJSON para el posterior filtrado por área y cálculo de métricas de fragmentación.</w:t>
+        <w:t xml:space="preserve">La segmentación automática de las composiciones RGB de los tres periodos de referencia se ejecuta con el backbone vit_b de SamGeo —versión adaptada al límite de memoria del contenedor sig_unal v1.11— produciendo una máscara raster por periodo que se vectoriza a GeoJSON para el posterior filtrado por área y cálculo de métricas de fragmentación.</w:t>
       </w:r>
     </w:p>
     <w:p>
@@ -11307,7 +11307,7 @@
                     <w:rPr>
                       <w:sz w:val="20"/>
                     </w:rPr>
-                    <w:t xml:space="preserve">Geocomputación en la nube</w:t>
+                    <w:t xml:space="preserve">Análisis geoespacial en la nube</w:t>
                   </w:r>
                 </w:p>
               </w:tc>
@@ -15751,7 +15751,7 @@
                     <w:rPr>
                       <w:sz w:val="20"/>
                     </w:rPr>
-                    <w:t xml:space="preserve">Composites RGB</w:t>
+                    <w:t xml:space="preserve">Composiciones RGB</w:t>
                   </w:r>
                 </w:p>
               </w:tc>
@@ -21564,7 +21564,7 @@
                     <w:rPr>
                       <w:sz w:val="20"/>
                     </w:rPr>
-                    <w:t xml:space="preserve">Tres composites discretos</w:t>
+                    <w:t xml:space="preserve">Tres composiciones discretas</w:t>
                   </w:r>
                 </w:p>
               </w:tc>

</xml_diff>

<commit_message>
Update desde docx revisado: integra bfastmonitor (§8.8 P477-P478 informe; Anexo E.1.f anexos; 06b_bfast_monitor_R añadido a Tabla 3 y §10; refs Verbesselt 2010+2012)
</commit_message>
<xml_diff>
--- a/docs/informe_anexos.docx
+++ b/docs/informe_anexos.docx
@@ -970,7 +970,7 @@
           <w:sz w:val="18"/>
           <w:szCs w:val="18"/>
         </w:rPr>
-        <w:t>proyecto-cgsm-curso/</w:t>
+        <w:t>proyecto-cgsm-curso/├── notebooks/        30 notebooks: 23 serie principal + 7 legacy (trazabilidad)│                     orden de ejecución: 01 → 02 → 02b → 03_acotado →│                     04_acotado → 04b_acotado → 05_acotado → 06b → 07 → 08 →│                     09b → 10 → 11 → 11b → 12 → 12b → 12c → 13 → 14├── src/│   ├── python/       utils.py (9377 + DE-9IM), aoi_acotado.py, build_cubos.py,│   │                 make_dashboard_html.py, alertas_manglar.py, merge_cubo.py│   ├── R/            03_bfast_ndvi.R, 05_stars_cubo.R, 06_bfast_manglar_unificado.R,│   │                 08_correlacion_trilingual.R│   └── julia/        04_fragmentacion.jl (4326 legacy + 9377 vigente),│                     05_correlacion_trilingual.jl├── data/│   ├── raw/          AOI preliminar y acotado, RUNAP SFF + VPI, INVEMAR GBIF,│   │                 IDEAM El Banco / Ganadería Caribe│   └── processed/│       ├── cubo/     3 datacubes NetCDF CF-1.8 (40 / 275 / 119 MB)│       └── samgeo/   máscaras y GeoJSON por periodo├── outputs/│   ├── tables/       47 CSV con resultados numéricos│   ├── figures/      35 PNG (mapas, series, correlaciones, alertas)│   └── maps/         dashboard_CGSM_final.html└── docs/             informe_final.{qmd,html,pdf}, informe_anexos.{qmd,html,pdf}</w:t>
       </w:r>
       <w:r>
         <w:rPr>
@@ -986,7 +986,7 @@
           <w:sz w:val="18"/>
           <w:szCs w:val="18"/>
         </w:rPr>
-        <w:t>├── notebooks/        29 notebooks: 22 serie principal + 7 legacy (trazabilidad)</w:t>
+        <w:t/>
       </w:r>
       <w:r>
         <w:rPr>
@@ -1002,7 +1002,7 @@
           <w:sz w:val="18"/>
           <w:szCs w:val="18"/>
         </w:rPr>
-        <w:t>│                     orden de ejecución: 01 → 02 → 02b → 03_acotado →</w:t>
+        <w:t/>
       </w:r>
       <w:r>
         <w:rPr>
@@ -1018,7 +1018,7 @@
           <w:sz w:val="18"/>
           <w:szCs w:val="18"/>
         </w:rPr>
-        <w:t>│                     04_acotado → 04b_acotado → 05_acotado → 07 → 08 →</w:t>
+        <w:t/>
       </w:r>
       <w:r>
         <w:rPr>
@@ -1034,7 +1034,7 @@
           <w:sz w:val="18"/>
           <w:szCs w:val="18"/>
         </w:rPr>
-        <w:t>│                     09b → 10 → 11 → 11b → 12 → 12b → 12c → 13 → 14</w:t>
+        <w:t/>
       </w:r>
       <w:r>
         <w:rPr>
@@ -1050,7 +1050,7 @@
           <w:sz w:val="18"/>
           <w:szCs w:val="18"/>
         </w:rPr>
-        <w:t>├── src/</w:t>
+        <w:t/>
       </w:r>
       <w:r>
         <w:rPr>
@@ -1066,7 +1066,7 @@
           <w:sz w:val="18"/>
           <w:szCs w:val="18"/>
         </w:rPr>
-        <w:t>│   ├── python/       utils.py (9377 + DE-9IM), aoi_acotado.py, build_cubos.py,</w:t>
+        <w:t/>
       </w:r>
       <w:r>
         <w:rPr>
@@ -1082,7 +1082,7 @@
           <w:sz w:val="18"/>
           <w:szCs w:val="18"/>
         </w:rPr>
-        <w:t>│   │                 make_dashboard_html.py, alertas_manglar.py, merge_cubo.py</w:t>
+        <w:t/>
       </w:r>
       <w:r>
         <w:rPr>
@@ -1098,7 +1098,7 @@
           <w:sz w:val="18"/>
           <w:szCs w:val="18"/>
         </w:rPr>
-        <w:t>│   ├── R/            03_bfast_ndvi.R, 05_stars_cubo.R, 06_bfast_manglar_unificado.R,</w:t>
+        <w:t/>
       </w:r>
       <w:r>
         <w:rPr>
@@ -1114,7 +1114,7 @@
           <w:sz w:val="18"/>
           <w:szCs w:val="18"/>
         </w:rPr>
-        <w:t>│   │                 08_correlacion_trilingual.R</w:t>
+        <w:t/>
       </w:r>
       <w:r>
         <w:rPr>
@@ -1130,7 +1130,7 @@
           <w:sz w:val="18"/>
           <w:szCs w:val="18"/>
         </w:rPr>
-        <w:t>│   └── julia/        04_fragmentacion.jl (4326 legacy + 9377 vigente),</w:t>
+        <w:t/>
       </w:r>
       <w:r>
         <w:rPr>
@@ -1146,7 +1146,7 @@
           <w:sz w:val="18"/>
           <w:szCs w:val="18"/>
         </w:rPr>
-        <w:t>│                     05_correlacion_trilingual.jl</w:t>
+        <w:t/>
       </w:r>
       <w:r>
         <w:rPr>
@@ -1162,7 +1162,7 @@
           <w:sz w:val="18"/>
           <w:szCs w:val="18"/>
         </w:rPr>
-        <w:t>├── data/</w:t>
+        <w:t/>
       </w:r>
       <w:r>
         <w:rPr>
@@ -1178,7 +1178,7 @@
           <w:sz w:val="18"/>
           <w:szCs w:val="18"/>
         </w:rPr>
-        <w:t>│   ├── raw/          AOI preliminar y acotado, RUNAP SFF + VPI, INVEMAR GBIF,</w:t>
+        <w:t/>
       </w:r>
       <w:r>
         <w:rPr>
@@ -1194,7 +1194,7 @@
           <w:sz w:val="18"/>
           <w:szCs w:val="18"/>
         </w:rPr>
-        <w:t>│   │                 IDEAM El Banco / Ganadería Caribe</w:t>
+        <w:t/>
       </w:r>
       <w:r>
         <w:rPr>
@@ -1210,7 +1210,7 @@
           <w:sz w:val="18"/>
           <w:szCs w:val="18"/>
         </w:rPr>
-        <w:t>│   └── processed/</w:t>
+        <w:t/>
       </w:r>
       <w:r>
         <w:rPr>
@@ -1226,7 +1226,7 @@
           <w:sz w:val="18"/>
           <w:szCs w:val="18"/>
         </w:rPr>
-        <w:t>│       ├── cubo/     3 datacubes NetCDF CF-1.8 (40 / 275 / 119 MB)</w:t>
+        <w:t/>
       </w:r>
       <w:r>
         <w:rPr>
@@ -1242,7 +1242,7 @@
           <w:sz w:val="18"/>
           <w:szCs w:val="18"/>
         </w:rPr>
-        <w:t>│       └── samgeo/   máscaras y GeoJSON por periodo</w:t>
+        <w:t/>
       </w:r>
       <w:r>
         <w:rPr>
@@ -1258,7 +1258,7 @@
           <w:sz w:val="18"/>
           <w:szCs w:val="18"/>
         </w:rPr>
-        <w:t>├── outputs/</w:t>
+        <w:t/>
       </w:r>
       <w:bookmarkStart w:id="48" w:name="_GoBack"/>
       <w:bookmarkEnd w:id="48"/>
@@ -1276,7 +1276,7 @@
           <w:sz w:val="18"/>
           <w:szCs w:val="18"/>
         </w:rPr>
-        <w:t>│   ├── tables/       47 CSV con resultados numéricos</w:t>
+        <w:t/>
       </w:r>
       <w:r>
         <w:rPr>
@@ -1292,7 +1292,7 @@
           <w:sz w:val="18"/>
           <w:szCs w:val="18"/>
         </w:rPr>
-        <w:t>│   ├── figures/      35 PNG (mapas, series, correlaciones, alertas)</w:t>
+        <w:t/>
       </w:r>
       <w:r>
         <w:rPr>
@@ -1308,7 +1308,7 @@
           <w:sz w:val="18"/>
           <w:szCs w:val="18"/>
         </w:rPr>
-        <w:t>│   └── maps/         dashboard_CGSM_final.html</w:t>
+        <w:t/>
       </w:r>
       <w:r>
         <w:rPr>
@@ -1324,7 +1324,7 @@
           <w:sz w:val="18"/>
           <w:szCs w:val="18"/>
         </w:rPr>
-        <w:t>└── docs/             informe_final.{qmd,html,pdf}, informe_anexos.{qmd,html,pdf}</w:t>
+        <w:t/>
       </w:r>
     </w:p>
     <w:p>
@@ -3998,6 +3998,642 @@
           <w:szCs w:val="18"/>
         </w:rPr>
         <w:t># quiebres 2016 (El Nino), 2020 (La Nina), 2023-24 (El Nino)</w:t>
+      </w:r>
+    </w:p>
+    <w:p>
+      <w:pPr>
+        <w:pStyle w:val="5"/>
+      </w:pPr>
+      <w:bookmarkStart w:id="10" w:name="X4eca77374d8b0e779af7afe908a4b7ed04f26a6"/>
+      <w:r>
+        <w:t xml:space="preserve">E.1.f Monitor operativo near-real-time con bfastmonitor en R</w:t>
+      </w:r>
+    </w:p>
+    <w:p>
+      <w:pPr>
+        <w:pStyle w:val="23"/>
+        <w:jc w:val="left"/>
+      </w:pPr>
+      <w:r>
+        <w:t xml:space="preserve">Sobre las mismas series mensuales combinadas Landsat 8 + Sentinel-2 se aplica bfast::bfastmonitor con una ventana histórica 2013–2019 y un periodo de monitoreo 2020–2025. El modelo ajusta una descomposición armónica con harmon de orden 3 sobre la ventana histórica, considerada estable tras la rehabilitación hidráulica de canales (1996–1998), y evalúa el periodo de monitoreo en busca de breakpoints al nivel de significancia p &lt; 0,05. La salida outputs/tables/bfastmonitor_estaciones.csv contiene, por estación, la fecha del breakpoint detectado, su magnitud y el estado del monitor a la fecha de corte, y alimenta directamente la lógica del semáforo descrita en la sección homónima del cuerpo del informe.</w:t>
+      </w:r>
+    </w:p>
+    <w:p>
+      <w:pPr>
+        <w:pStyle w:val="37"/>
+        <w:jc w:val="left"/>
+      </w:pPr>
+      <w:r>
+        <w:rPr>
+          <w:rStyle w:val="FunctionTok"/>
+          <w:rFonts w:ascii="Consolas" w:hAnsi="Consolas" w:cs="Consolas"/>
+          <w:sz w:val="18"/>
+          <w:szCs w:val="18"/>
+        </w:rPr>
+        <w:t xml:space="preserve">library</w:t>
+      </w:r>
+      <w:r>
+        <w:rPr>
+          <w:rStyle w:val="NormalTok"/>
+          <w:rFonts w:ascii="Consolas" w:hAnsi="Consolas" w:cs="Consolas"/>
+          <w:sz w:val="18"/>
+          <w:szCs w:val="18"/>
+        </w:rPr>
+        <w:t xml:space="preserve">(bfast)</w:t>
+        <w:br/>
+      </w:r>
+      <w:r>
+        <w:rPr>
+          <w:rStyle w:val="NormalTok"/>
+          <w:rFonts w:ascii="Consolas" w:hAnsi="Consolas" w:cs="Consolas"/>
+          <w:sz w:val="18"/>
+          <w:szCs w:val="18"/>
+        </w:rPr>
+        <w:t xml:space="preserve">serie &lt;- </w:t>
+      </w:r>
+      <w:r>
+        <w:rPr>
+          <w:rStyle w:val="FunctionTok"/>
+          <w:rFonts w:ascii="Consolas" w:hAnsi="Consolas" w:cs="Consolas"/>
+          <w:sz w:val="18"/>
+          <w:szCs w:val="18"/>
+        </w:rPr>
+        <w:t xml:space="preserve">read.csv</w:t>
+      </w:r>
+      <w:r>
+        <w:rPr>
+          <w:rStyle w:val="NormalTok"/>
+          <w:rFonts w:ascii="Consolas" w:hAnsi="Consolas" w:cs="Consolas"/>
+          <w:sz w:val="18"/>
+          <w:szCs w:val="18"/>
+        </w:rPr>
+        <w:t xml:space="preserve">(</w:t>
+      </w:r>
+      <w:r>
+        <w:rPr>
+          <w:rStyle w:val="StringTok"/>
+          <w:rFonts w:ascii="Consolas" w:hAnsi="Consolas" w:cs="Consolas"/>
+          <w:sz w:val="18"/>
+          <w:szCs w:val="18"/>
+        </w:rPr>
+        <w:t xml:space="preserve">"outputs/tables/serie_temporal_ndvi_combinada.csv"</w:t>
+      </w:r>
+      <w:r>
+        <w:rPr>
+          <w:rStyle w:val="NormalTok"/>
+          <w:rFonts w:ascii="Consolas" w:hAnsi="Consolas" w:cs="Consolas"/>
+          <w:sz w:val="18"/>
+          <w:szCs w:val="18"/>
+        </w:rPr>
+        <w:t xml:space="preserve">)</w:t>
+        <w:br/>
+      </w:r>
+      <w:r>
+        <w:rPr>
+          <w:rStyle w:val="NormalTok"/>
+          <w:rFonts w:ascii="Consolas" w:hAnsi="Consolas" w:cs="Consolas"/>
+          <w:sz w:val="18"/>
+          <w:szCs w:val="18"/>
+        </w:rPr>
+        <w:t xml:space="preserve"/>
+        <w:br/>
+      </w:r>
+      <w:r>
+        <w:rPr>
+          <w:rStyle w:val="CommentTok"/>
+          <w:rFonts w:ascii="Consolas" w:hAnsi="Consolas" w:cs="Consolas"/>
+          <w:sz w:val="18"/>
+          <w:szCs w:val="18"/>
+        </w:rPr>
+        <w:t xml:space="preserve"># Por estación, ajustar bfastmonitor con history 2013-2019 / monitor 2020-2025</w:t>
+        <w:br/>
+      </w:r>
+      <w:r>
+        <w:rPr>
+          <w:rStyle w:val="NormalTok"/>
+          <w:rFonts w:ascii="Consolas" w:hAnsi="Consolas" w:cs="Consolas"/>
+          <w:sz w:val="18"/>
+          <w:szCs w:val="18"/>
+        </w:rPr>
+        <w:t xml:space="preserve">resultados &lt;- </w:t>
+      </w:r>
+      <w:r>
+        <w:rPr>
+          <w:rStyle w:val="FunctionTok"/>
+          <w:rFonts w:ascii="Consolas" w:hAnsi="Consolas" w:cs="Consolas"/>
+          <w:sz w:val="18"/>
+          <w:szCs w:val="18"/>
+        </w:rPr>
+        <w:t xml:space="preserve">lapply</w:t>
+      </w:r>
+      <w:r>
+        <w:rPr>
+          <w:rStyle w:val="NormalTok"/>
+          <w:rFonts w:ascii="Consolas" w:hAnsi="Consolas" w:cs="Consolas"/>
+          <w:sz w:val="18"/>
+          <w:szCs w:val="18"/>
+        </w:rPr>
+        <w:t xml:space="preserve">(</w:t>
+      </w:r>
+      <w:r>
+        <w:rPr>
+          <w:rStyle w:val="FunctionTok"/>
+          <w:rFonts w:ascii="Consolas" w:hAnsi="Consolas" w:cs="Consolas"/>
+          <w:sz w:val="18"/>
+          <w:szCs w:val="18"/>
+        </w:rPr>
+        <w:t xml:space="preserve">unique</w:t>
+      </w:r>
+      <w:r>
+        <w:rPr>
+          <w:rStyle w:val="NormalTok"/>
+          <w:rFonts w:ascii="Consolas" w:hAnsi="Consolas" w:cs="Consolas"/>
+          <w:sz w:val="18"/>
+          <w:szCs w:val="18"/>
+        </w:rPr>
+        <w:t xml:space="preserve">(serie$estación), </w:t>
+      </w:r>
+      <w:r>
+        <w:rPr>
+          <w:rStyle w:val="KeywordTok"/>
+          <w:rFonts w:ascii="Consolas" w:hAnsi="Consolas" w:cs="Consolas"/>
+          <w:sz w:val="18"/>
+          <w:szCs w:val="18"/>
+        </w:rPr>
+        <w:t xml:space="preserve">function</w:t>
+      </w:r>
+      <w:r>
+        <w:rPr>
+          <w:rStyle w:val="NormalTok"/>
+          <w:rFonts w:ascii="Consolas" w:hAnsi="Consolas" w:cs="Consolas"/>
+          <w:sz w:val="18"/>
+          <w:szCs w:val="18"/>
+        </w:rPr>
+        <w:t xml:space="preserve">(est) {</w:t>
+        <w:br/>
+      </w:r>
+      <w:r>
+        <w:rPr>
+          <w:rStyle w:val="NormalTok"/>
+          <w:rFonts w:ascii="Consolas" w:hAnsi="Consolas" w:cs="Consolas"/>
+          <w:sz w:val="18"/>
+          <w:szCs w:val="18"/>
+        </w:rPr>
+        <w:t xml:space="preserve">  ts_est &lt;- </w:t>
+      </w:r>
+      <w:r>
+        <w:rPr>
+          <w:rStyle w:val="FunctionTok"/>
+          <w:rFonts w:ascii="Consolas" w:hAnsi="Consolas" w:cs="Consolas"/>
+          <w:sz w:val="18"/>
+          <w:szCs w:val="18"/>
+        </w:rPr>
+        <w:t xml:space="preserve">ts</w:t>
+      </w:r>
+      <w:r>
+        <w:rPr>
+          <w:rStyle w:val="NormalTok"/>
+          <w:rFonts w:ascii="Consolas" w:hAnsi="Consolas" w:cs="Consolas"/>
+          <w:sz w:val="18"/>
+          <w:szCs w:val="18"/>
+        </w:rPr>
+        <w:t xml:space="preserve">(</w:t>
+      </w:r>
+      <w:r>
+        <w:rPr>
+          <w:rStyle w:val="FunctionTok"/>
+          <w:rFonts w:ascii="Consolas" w:hAnsi="Consolas" w:cs="Consolas"/>
+          <w:sz w:val="18"/>
+          <w:szCs w:val="18"/>
+        </w:rPr>
+        <w:t xml:space="preserve">subset</w:t>
+      </w:r>
+      <w:r>
+        <w:rPr>
+          <w:rStyle w:val="NormalTok"/>
+          <w:rFonts w:ascii="Consolas" w:hAnsi="Consolas" w:cs="Consolas"/>
+          <w:sz w:val="18"/>
+          <w:szCs w:val="18"/>
+        </w:rPr>
+        <w:t xml:space="preserve">(serie, estación == est)$ndvi,</w:t>
+        <w:br/>
+      </w:r>
+      <w:r>
+        <w:rPr>
+          <w:rStyle w:val="NormalTok"/>
+          <w:rFonts w:ascii="Consolas" w:hAnsi="Consolas" w:cs="Consolas"/>
+          <w:sz w:val="18"/>
+          <w:szCs w:val="18"/>
+        </w:rPr>
+        <w:t xml:space="preserve">                start = </w:t>
+      </w:r>
+      <w:r>
+        <w:rPr>
+          <w:rStyle w:val="FunctionTok"/>
+          <w:rFonts w:ascii="Consolas" w:hAnsi="Consolas" w:cs="Consolas"/>
+          <w:sz w:val="18"/>
+          <w:szCs w:val="18"/>
+        </w:rPr>
+        <w:t xml:space="preserve">c</w:t>
+      </w:r>
+      <w:r>
+        <w:rPr>
+          <w:rStyle w:val="NormalTok"/>
+          <w:rFonts w:ascii="Consolas" w:hAnsi="Consolas" w:cs="Consolas"/>
+          <w:sz w:val="18"/>
+          <w:szCs w:val="18"/>
+        </w:rPr>
+        <w:t xml:space="preserve">(</w:t>
+      </w:r>
+      <w:r>
+        <w:rPr>
+          <w:rStyle w:val="DecValTok"/>
+          <w:rFonts w:ascii="Consolas" w:hAnsi="Consolas" w:cs="Consolas"/>
+          <w:sz w:val="18"/>
+          <w:szCs w:val="18"/>
+        </w:rPr>
+        <w:t xml:space="preserve">2013</w:t>
+      </w:r>
+      <w:r>
+        <w:rPr>
+          <w:rStyle w:val="NormalTok"/>
+          <w:rFonts w:ascii="Consolas" w:hAnsi="Consolas" w:cs="Consolas"/>
+          <w:sz w:val="18"/>
+          <w:szCs w:val="18"/>
+        </w:rPr>
+        <w:t xml:space="preserve">, </w:t>
+      </w:r>
+      <w:r>
+        <w:rPr>
+          <w:rStyle w:val="DecValTok"/>
+          <w:rFonts w:ascii="Consolas" w:hAnsi="Consolas" w:cs="Consolas"/>
+          <w:sz w:val="18"/>
+          <w:szCs w:val="18"/>
+        </w:rPr>
+        <w:t xml:space="preserve">1</w:t>
+      </w:r>
+      <w:r>
+        <w:rPr>
+          <w:rStyle w:val="NormalTok"/>
+          <w:rFonts w:ascii="Consolas" w:hAnsi="Consolas" w:cs="Consolas"/>
+          <w:sz w:val="18"/>
+          <w:szCs w:val="18"/>
+        </w:rPr>
+        <w:t xml:space="preserve">), frequency = </w:t>
+      </w:r>
+      <w:r>
+        <w:rPr>
+          <w:rStyle w:val="DecValTok"/>
+          <w:rFonts w:ascii="Consolas" w:hAnsi="Consolas" w:cs="Consolas"/>
+          <w:sz w:val="18"/>
+          <w:szCs w:val="18"/>
+        </w:rPr>
+        <w:t xml:space="preserve">12</w:t>
+      </w:r>
+      <w:r>
+        <w:rPr>
+          <w:rStyle w:val="NormalTok"/>
+          <w:rFonts w:ascii="Consolas" w:hAnsi="Consolas" w:cs="Consolas"/>
+          <w:sz w:val="18"/>
+          <w:szCs w:val="18"/>
+        </w:rPr>
+        <w:t xml:space="preserve">)</w:t>
+        <w:br/>
+      </w:r>
+      <w:r>
+        <w:rPr>
+          <w:rStyle w:val="NormalTok"/>
+          <w:rFonts w:ascii="Consolas" w:hAnsi="Consolas" w:cs="Consolas"/>
+          <w:sz w:val="18"/>
+          <w:szCs w:val="18"/>
+        </w:rPr>
+        <w:t xml:space="preserve">  mon &lt;- </w:t>
+      </w:r>
+      <w:r>
+        <w:rPr>
+          <w:rStyle w:val="FunctionTok"/>
+          <w:rFonts w:ascii="Consolas" w:hAnsi="Consolas" w:cs="Consolas"/>
+          <w:sz w:val="18"/>
+          <w:szCs w:val="18"/>
+        </w:rPr>
+        <w:t xml:space="preserve">bfastmonitor</w:t>
+      </w:r>
+      <w:r>
+        <w:rPr>
+          <w:rStyle w:val="NormalTok"/>
+          <w:rFonts w:ascii="Consolas" w:hAnsi="Consolas" w:cs="Consolas"/>
+          <w:sz w:val="18"/>
+          <w:szCs w:val="18"/>
+        </w:rPr>
+        <w:t xml:space="preserve">(ts_est,</w:t>
+        <w:br/>
+      </w:r>
+      <w:r>
+        <w:rPr>
+          <w:rStyle w:val="NormalTok"/>
+          <w:rFonts w:ascii="Consolas" w:hAnsi="Consolas" w:cs="Consolas"/>
+          <w:sz w:val="18"/>
+          <w:szCs w:val="18"/>
+        </w:rPr>
+        <w:t xml:space="preserve">                      start   = </w:t>
+      </w:r>
+      <w:r>
+        <w:rPr>
+          <w:rStyle w:val="FunctionTok"/>
+          <w:rFonts w:ascii="Consolas" w:hAnsi="Consolas" w:cs="Consolas"/>
+          <w:sz w:val="18"/>
+          <w:szCs w:val="18"/>
+        </w:rPr>
+        <w:t xml:space="preserve">c</w:t>
+      </w:r>
+      <w:r>
+        <w:rPr>
+          <w:rStyle w:val="NormalTok"/>
+          <w:rFonts w:ascii="Consolas" w:hAnsi="Consolas" w:cs="Consolas"/>
+          <w:sz w:val="18"/>
+          <w:szCs w:val="18"/>
+        </w:rPr>
+        <w:t xml:space="preserve">(</w:t>
+      </w:r>
+      <w:r>
+        <w:rPr>
+          <w:rStyle w:val="DecValTok"/>
+          <w:rFonts w:ascii="Consolas" w:hAnsi="Consolas" w:cs="Consolas"/>
+          <w:sz w:val="18"/>
+          <w:szCs w:val="18"/>
+        </w:rPr>
+        <w:t xml:space="preserve">2020</w:t>
+      </w:r>
+      <w:r>
+        <w:rPr>
+          <w:rStyle w:val="NormalTok"/>
+          <w:rFonts w:ascii="Consolas" w:hAnsi="Consolas" w:cs="Consolas"/>
+          <w:sz w:val="18"/>
+          <w:szCs w:val="18"/>
+        </w:rPr>
+        <w:t xml:space="preserve">, </w:t>
+      </w:r>
+      <w:r>
+        <w:rPr>
+          <w:rStyle w:val="DecValTok"/>
+          <w:rFonts w:ascii="Consolas" w:hAnsi="Consolas" w:cs="Consolas"/>
+          <w:sz w:val="18"/>
+          <w:szCs w:val="18"/>
+        </w:rPr>
+        <w:t xml:space="preserve">1</w:t>
+      </w:r>
+      <w:r>
+        <w:rPr>
+          <w:rStyle w:val="NormalTok"/>
+          <w:rFonts w:ascii="Consolas" w:hAnsi="Consolas" w:cs="Consolas"/>
+          <w:sz w:val="18"/>
+          <w:szCs w:val="18"/>
+        </w:rPr>
+        <w:t xml:space="preserve">),</w:t>
+        <w:br/>
+      </w:r>
+      <w:r>
+        <w:rPr>
+          <w:rStyle w:val="NormalTok"/>
+          <w:rFonts w:ascii="Consolas" w:hAnsi="Consolas" w:cs="Consolas"/>
+          <w:sz w:val="18"/>
+          <w:szCs w:val="18"/>
+        </w:rPr>
+        <w:t xml:space="preserve">                      formula = response ~ harmon,</w:t>
+        <w:br/>
+      </w:r>
+      <w:r>
+        <w:rPr>
+          <w:rStyle w:val="NormalTok"/>
+          <w:rFonts w:ascii="Consolas" w:hAnsi="Consolas" w:cs="Consolas"/>
+          <w:sz w:val="18"/>
+          <w:szCs w:val="18"/>
+        </w:rPr>
+        <w:t xml:space="preserve">                      order   = </w:t>
+      </w:r>
+      <w:r>
+        <w:rPr>
+          <w:rStyle w:val="DecValTok"/>
+          <w:rFonts w:ascii="Consolas" w:hAnsi="Consolas" w:cs="Consolas"/>
+          <w:sz w:val="18"/>
+          <w:szCs w:val="18"/>
+        </w:rPr>
+        <w:t xml:space="preserve">3</w:t>
+      </w:r>
+      <w:r>
+        <w:rPr>
+          <w:rStyle w:val="NormalTok"/>
+          <w:rFonts w:ascii="Consolas" w:hAnsi="Consolas" w:cs="Consolas"/>
+          <w:sz w:val="18"/>
+          <w:szCs w:val="18"/>
+        </w:rPr>
+        <w:t xml:space="preserve">,</w:t>
+        <w:br/>
+      </w:r>
+      <w:r>
+        <w:rPr>
+          <w:rStyle w:val="NormalTok"/>
+          <w:rFonts w:ascii="Consolas" w:hAnsi="Consolas" w:cs="Consolas"/>
+          <w:sz w:val="18"/>
+          <w:szCs w:val="18"/>
+        </w:rPr>
+        <w:t xml:space="preserve">                      level   = </w:t>
+      </w:r>
+      <w:r>
+        <w:rPr>
+          <w:rStyle w:val="FloatTok"/>
+          <w:rFonts w:ascii="Consolas" w:hAnsi="Consolas" w:cs="Consolas"/>
+          <w:sz w:val="18"/>
+          <w:szCs w:val="18"/>
+        </w:rPr>
+        <w:t xml:space="preserve">0.05</w:t>
+      </w:r>
+      <w:r>
+        <w:rPr>
+          <w:rStyle w:val="NormalTok"/>
+          <w:rFonts w:ascii="Consolas" w:hAnsi="Consolas" w:cs="Consolas"/>
+          <w:sz w:val="18"/>
+          <w:szCs w:val="18"/>
+        </w:rPr>
+        <w:t xml:space="preserve">)</w:t>
+        <w:br/>
+      </w:r>
+      <w:r>
+        <w:rPr>
+          <w:rStyle w:val="NormalTok"/>
+          <w:rFonts w:ascii="Consolas" w:hAnsi="Consolas" w:cs="Consolas"/>
+          <w:sz w:val="18"/>
+          <w:szCs w:val="18"/>
+        </w:rPr>
+        <w:t xml:space="preserve">  </w:t>
+      </w:r>
+      <w:r>
+        <w:rPr>
+          <w:rStyle w:val="FunctionTok"/>
+          <w:rFonts w:ascii="Consolas" w:hAnsi="Consolas" w:cs="Consolas"/>
+          <w:sz w:val="18"/>
+          <w:szCs w:val="18"/>
+        </w:rPr>
+        <w:t xml:space="preserve">data.frame</w:t>
+      </w:r>
+      <w:r>
+        <w:rPr>
+          <w:rStyle w:val="NormalTok"/>
+          <w:rFonts w:ascii="Consolas" w:hAnsi="Consolas" w:cs="Consolas"/>
+          <w:sz w:val="18"/>
+          <w:szCs w:val="18"/>
+        </w:rPr>
+        <w:t xml:space="preserve">(estación = est,</w:t>
+        <w:br/>
+      </w:r>
+      <w:r>
+        <w:rPr>
+          <w:rStyle w:val="NormalTok"/>
+          <w:rFonts w:ascii="Consolas" w:hAnsi="Consolas" w:cs="Consolas"/>
+          <w:sz w:val="18"/>
+          <w:szCs w:val="18"/>
+        </w:rPr>
+        <w:t xml:space="preserve">             breakpoint = </w:t>
+      </w:r>
+      <w:r>
+        <w:rPr>
+          <w:rStyle w:val="FunctionTok"/>
+          <w:rFonts w:ascii="Consolas" w:hAnsi="Consolas" w:cs="Consolas"/>
+          <w:sz w:val="18"/>
+          <w:szCs w:val="18"/>
+        </w:rPr>
+        <w:t xml:space="preserve">as.character</w:t>
+      </w:r>
+      <w:r>
+        <w:rPr>
+          <w:rStyle w:val="NormalTok"/>
+          <w:rFonts w:ascii="Consolas" w:hAnsi="Consolas" w:cs="Consolas"/>
+          <w:sz w:val="18"/>
+          <w:szCs w:val="18"/>
+        </w:rPr>
+        <w:t xml:space="preserve">(</w:t>
+      </w:r>
+      <w:r>
+        <w:rPr>
+          <w:rStyle w:val="FunctionTok"/>
+          <w:rFonts w:ascii="Consolas" w:hAnsi="Consolas" w:cs="Consolas"/>
+          <w:sz w:val="18"/>
+          <w:szCs w:val="18"/>
+        </w:rPr>
+        <w:t xml:space="preserve">time</w:t>
+      </w:r>
+      <w:r>
+        <w:rPr>
+          <w:rStyle w:val="NormalTok"/>
+          <w:rFonts w:ascii="Consolas" w:hAnsi="Consolas" w:cs="Consolas"/>
+          <w:sz w:val="18"/>
+          <w:szCs w:val="18"/>
+        </w:rPr>
+        <w:t xml:space="preserve">(mon$breakpoint)),</w:t>
+        <w:br/>
+      </w:r>
+      <w:r>
+        <w:rPr>
+          <w:rStyle w:val="NormalTok"/>
+          <w:rFonts w:ascii="Consolas" w:hAnsi="Consolas" w:cs="Consolas"/>
+          <w:sz w:val="18"/>
+          <w:szCs w:val="18"/>
+        </w:rPr>
+        <w:t xml:space="preserve">             magnitud   = mon$magnitude)</w:t>
+        <w:br/>
+      </w:r>
+      <w:r>
+        <w:rPr>
+          <w:rStyle w:val="NormalTok"/>
+          <w:rFonts w:ascii="Consolas" w:hAnsi="Consolas" w:cs="Consolas"/>
+          <w:sz w:val="18"/>
+          <w:szCs w:val="18"/>
+        </w:rPr>
+        <w:t xml:space="preserve">})</w:t>
+        <w:br/>
+      </w:r>
+      <w:r>
+        <w:rPr>
+          <w:rStyle w:val="NormalTok"/>
+          <w:rFonts w:ascii="Consolas" w:hAnsi="Consolas" w:cs="Consolas"/>
+          <w:sz w:val="18"/>
+          <w:szCs w:val="18"/>
+        </w:rPr>
+        <w:t xml:space="preserve"/>
+        <w:br/>
+      </w:r>
+      <w:r>
+        <w:rPr>
+          <w:rStyle w:val="FunctionTok"/>
+          <w:rFonts w:ascii="Consolas" w:hAnsi="Consolas" w:cs="Consolas"/>
+          <w:sz w:val="18"/>
+          <w:szCs w:val="18"/>
+        </w:rPr>
+        <w:t xml:space="preserve">write.csv</w:t>
+      </w:r>
+      <w:r>
+        <w:rPr>
+          <w:rStyle w:val="NormalTok"/>
+          <w:rFonts w:ascii="Consolas" w:hAnsi="Consolas" w:cs="Consolas"/>
+          <w:sz w:val="18"/>
+          <w:szCs w:val="18"/>
+        </w:rPr>
+        <w:t xml:space="preserve">(</w:t>
+      </w:r>
+      <w:r>
+        <w:rPr>
+          <w:rStyle w:val="FunctionTok"/>
+          <w:rFonts w:ascii="Consolas" w:hAnsi="Consolas" w:cs="Consolas"/>
+          <w:sz w:val="18"/>
+          <w:szCs w:val="18"/>
+        </w:rPr>
+        <w:t xml:space="preserve">do.call</w:t>
+      </w:r>
+      <w:r>
+        <w:rPr>
+          <w:rStyle w:val="NormalTok"/>
+          <w:rFonts w:ascii="Consolas" w:hAnsi="Consolas" w:cs="Consolas"/>
+          <w:sz w:val="18"/>
+          <w:szCs w:val="18"/>
+        </w:rPr>
+        <w:t xml:space="preserve">(rbind, resultados),</w:t>
+        <w:br/>
+      </w:r>
+      <w:r>
+        <w:rPr>
+          <w:rStyle w:val="StringTok"/>
+          <w:rFonts w:ascii="Consolas" w:hAnsi="Consolas" w:cs="Consolas"/>
+          <w:sz w:val="18"/>
+          <w:szCs w:val="18"/>
+        </w:rPr>
+        <w:t xml:space="preserve">          "outputs/tables/bfastmonitor_estaciones.csv"</w:t>
+      </w:r>
+      <w:r>
+        <w:rPr>
+          <w:rStyle w:val="NormalTok"/>
+          <w:rFonts w:ascii="Consolas" w:hAnsi="Consolas" w:cs="Consolas"/>
+          <w:sz w:val="18"/>
+          <w:szCs w:val="18"/>
+        </w:rPr>
+        <w:t xml:space="preserve">, row.names = </w:t>
+      </w:r>
+      <w:r>
+        <w:rPr>
+          <w:rStyle w:val="ConstantTok"/>
+          <w:rFonts w:ascii="Consolas" w:hAnsi="Consolas" w:cs="Consolas"/>
+          <w:sz w:val="18"/>
+          <w:szCs w:val="18"/>
+        </w:rPr>
+        <w:t xml:space="preserve">FALSE</w:t>
+      </w:r>
+      <w:r>
+        <w:rPr>
+          <w:rStyle w:val="NormalTok"/>
+          <w:rFonts w:ascii="Consolas" w:hAnsi="Consolas" w:cs="Consolas"/>
+          <w:sz w:val="18"/>
+          <w:szCs w:val="18"/>
+        </w:rPr>
+        <w:t xml:space="preserve">)</w:t>
       </w:r>
     </w:p>
     <w:bookmarkEnd w:id="5"/>

</xml_diff>

<commit_message>
Anexos: quita 'movidas desde el cuerpo' del título Anexo F y de la lista de Presentación
</commit_message>
<xml_diff>
--- a/docs/informe_anexos.docx
+++ b/docs/informe_anexos.docx
@@ -209,13 +209,12 @@
           <w:bCs/>
           <w:color w:val="000000"/>
         </w:rPr>
-        <w:t>Anexo F</w:t>
+        <w:t>Anexo F reúne las tablas de detalle.</w:t>
       </w:r>
       <w:r>
         <w:rPr>
           <w:color w:val="000000"/>
         </w:rPr>
-        <w:t xml:space="preserve"> reúne las tablas de detalle movidas desde el cuerpo del informe.</w:t>
       </w:r>
     </w:p>
     <w:p>
@@ -7902,7 +7901,7 @@
         <w:rPr>
           <w:color w:val="000000"/>
         </w:rPr>
-        <w:t>Anexo F: Tablas detalladas movidas desde el cuerpo</w:t>
+        <w:t>Anexo F: Tablas detalladas</w:t>
       </w:r>
     </w:p>
     <w:p>

</xml_diff>

<commit_message>
Anexo B: árbol del repo con saltos de línea reales (antes era una sola línea pegada por bug del docx); separa URLs de la prosa que estaban concatenadas sin espacio
</commit_message>
<xml_diff>
--- a/docs/informe_anexos.docx
+++ b/docs/informe_anexos.docx
@@ -211,11 +211,6 @@
         </w:rPr>
         <w:t>Anexo F reúne las tablas de detalle.</w:t>
       </w:r>
-      <w:r>
-        <w:rPr>
-          <w:color w:val="000000"/>
-        </w:rPr>
-      </w:r>
     </w:p>
     <w:p>
       <w:pPr>
@@ -913,49 +908,33 @@
         <w:rPr>
           <w:color w:val="000000"/>
         </w:rPr>
-        <w:t>El repositorio público está disponible en  bajo licencia MIT. La versión anterior del proyecto (línea base marzo 2026 sobre AOI preliminar de 5.073 km²) permanece archivada en  para fines de comparación histórica.</w:t>
-      </w:r>
-      <w:r>
-        <w:fldChar w:fldCharType="begin"/>
-      </w:r>
-      <w:r>
-        <w:instrText xml:space="preserve"> HYPERLINK "https://github.com/linaq11/proyecto-cgsm-curso" \h </w:instrText>
-      </w:r>
-      <w:r>
-        <w:fldChar w:fldCharType="separate"/>
-      </w:r>
+        <w:t>El repositorio público está disponible en https://github.com/linaq11/proyecto-cgsm-curso bajo licencia MIT. La versión anterior del proyecto (línea base marzo 2026 sobre AOI preliminar de 5.073 km²) permanece archivada en https://github.com/LinaQuinteroF/proyecto-cgsm para fines de comparación histórica.</w:t>
+      </w:r>
+      <w:r/>
+      <w:r/>
+      <w:r/>
       <w:r>
         <w:rPr>
           <w:rStyle w:val="16"/>
         </w:rPr>
-        <w:t>https://github.com/linaq11/proyecto-cgsm-curso</w:t>
       </w:r>
       <w:r>
         <w:rPr>
           <w:rStyle w:val="16"/>
         </w:rPr>
-        <w:fldChar w:fldCharType="end"/>
-      </w:r>
-      <w:r>
-        <w:fldChar w:fldCharType="begin"/>
-      </w:r>
-      <w:r>
-        <w:instrText xml:space="preserve"> HYPERLINK "https://github.com/LinaQuinteroF/proyecto-cgsm" \h </w:instrText>
-      </w:r>
-      <w:r>
-        <w:fldChar w:fldCharType="separate"/>
-      </w:r>
+      </w:r>
+      <w:r/>
+      <w:r/>
+      <w:r/>
       <w:r>
         <w:rPr>
           <w:rStyle w:val="16"/>
         </w:rPr>
-        <w:t>https://github.com/LinaQuinteroF/proyecto-cgsm</w:t>
       </w:r>
       <w:r>
         <w:rPr>
           <w:rStyle w:val="16"/>
         </w:rPr>
-        <w:fldChar w:fldCharType="end"/>
       </w:r>
     </w:p>
     <w:p>
@@ -969,295 +948,51 @@
           <w:sz w:val="18"/>
           <w:szCs w:val="18"/>
         </w:rPr>
-        <w:t>proyecto-cgsm-curso/├── notebooks/        30 notebooks: 23 serie principal + 7 legacy (trazabilidad)│                     orden de ejecución: 01 → 02 → 02b → 03_acotado →│                     04_acotado → 04b_acotado → 05_acotado → 06b → 07 → 08 →│                     09b → 10 → 11 → 11b → 12 → 12b → 12c → 13 → 14├── src/│   ├── python/       utils.py (9377 + DE-9IM), aoi_acotado.py, build_cubos.py,│   │                 make_dashboard_html.py, alertas_manglar.py, merge_cubo.py│   ├── R/            03_bfast_ndvi.R, 05_stars_cubo.R, 06_bfast_manglar_unificado.R,│   │                 08_correlacion_trilingual.R│   └── julia/        04_fragmentacion.jl (4326 legacy + 9377 vigente),│                     05_correlacion_trilingual.jl├── data/│   ├── raw/          AOI preliminar y acotado, RUNAP SFF + VPI, INVEMAR GBIF,│   │                 IDEAM El Banco / Ganadería Caribe│   └── processed/│       ├── cubo/     3 datacubes NetCDF CF-1.8 (40 / 275 / 119 MB)│       └── samgeo/   máscaras y GeoJSON por periodo├── outputs/│   ├── tables/       47 CSV con resultados numéricos│   ├── figures/      35 PNG (mapas, series, correlaciones, alertas)│   └── maps/         dashboard_CGSM_final.html└── docs/             informe_final.{qmd,html,pdf}, informe_anexos.{qmd,html,pdf}</w:t>
-      </w:r>
-      <w:r>
-        <w:rPr>
-          <w:rFonts w:ascii="Courier New" w:hAnsi="Courier New"/>
-          <w:sz w:val="18"/>
-          <w:szCs w:val="18"/>
-        </w:rPr>
-        <w:br w:type="textWrapping"/>
-      </w:r>
-      <w:r>
-        <w:rPr>
-          <w:rFonts w:ascii="Courier New" w:hAnsi="Courier New"/>
-          <w:sz w:val="18"/>
-          <w:szCs w:val="18"/>
-        </w:rPr>
-        <w:t/>
-      </w:r>
-      <w:r>
-        <w:rPr>
-          <w:rFonts w:ascii="Courier New" w:hAnsi="Courier New"/>
-          <w:sz w:val="18"/>
-          <w:szCs w:val="18"/>
-        </w:rPr>
-        <w:br w:type="textWrapping"/>
-      </w:r>
-      <w:r>
-        <w:rPr>
-          <w:rFonts w:ascii="Courier New" w:hAnsi="Courier New"/>
-          <w:sz w:val="18"/>
-          <w:szCs w:val="18"/>
-        </w:rPr>
-        <w:t/>
-      </w:r>
-      <w:r>
-        <w:rPr>
-          <w:rFonts w:ascii="Courier New" w:hAnsi="Courier New"/>
-          <w:sz w:val="18"/>
-          <w:szCs w:val="18"/>
-        </w:rPr>
-        <w:br w:type="textWrapping"/>
-      </w:r>
-      <w:r>
-        <w:rPr>
-          <w:rFonts w:ascii="Courier New" w:hAnsi="Courier New"/>
-          <w:sz w:val="18"/>
-          <w:szCs w:val="18"/>
-        </w:rPr>
-        <w:t/>
-      </w:r>
-      <w:r>
-        <w:rPr>
-          <w:rFonts w:ascii="Courier New" w:hAnsi="Courier New"/>
-          <w:sz w:val="18"/>
-          <w:szCs w:val="18"/>
-        </w:rPr>
-        <w:br w:type="textWrapping"/>
-      </w:r>
-      <w:r>
-        <w:rPr>
-          <w:rFonts w:ascii="Courier New" w:hAnsi="Courier New"/>
-          <w:sz w:val="18"/>
-          <w:szCs w:val="18"/>
-        </w:rPr>
-        <w:t/>
-      </w:r>
-      <w:r>
-        <w:rPr>
-          <w:rFonts w:ascii="Courier New" w:hAnsi="Courier New"/>
-          <w:sz w:val="18"/>
-          <w:szCs w:val="18"/>
-        </w:rPr>
-        <w:br w:type="textWrapping"/>
-      </w:r>
-      <w:r>
-        <w:rPr>
-          <w:rFonts w:ascii="Courier New" w:hAnsi="Courier New"/>
-          <w:sz w:val="18"/>
-          <w:szCs w:val="18"/>
-        </w:rPr>
-        <w:t/>
-      </w:r>
-      <w:r>
-        <w:rPr>
-          <w:rFonts w:ascii="Courier New" w:hAnsi="Courier New"/>
-          <w:sz w:val="18"/>
-          <w:szCs w:val="18"/>
-        </w:rPr>
-        <w:br w:type="textWrapping"/>
-      </w:r>
-      <w:r>
-        <w:rPr>
-          <w:rFonts w:ascii="Courier New" w:hAnsi="Courier New"/>
-          <w:sz w:val="18"/>
-          <w:szCs w:val="18"/>
-        </w:rPr>
-        <w:t/>
-      </w:r>
-      <w:r>
-        <w:rPr>
-          <w:rFonts w:ascii="Courier New" w:hAnsi="Courier New"/>
-          <w:sz w:val="18"/>
-          <w:szCs w:val="18"/>
-        </w:rPr>
-        <w:br w:type="textWrapping"/>
-      </w:r>
-      <w:r>
-        <w:rPr>
-          <w:rFonts w:ascii="Courier New" w:hAnsi="Courier New"/>
-          <w:sz w:val="18"/>
-          <w:szCs w:val="18"/>
-        </w:rPr>
-        <w:t/>
-      </w:r>
-      <w:r>
-        <w:rPr>
-          <w:rFonts w:ascii="Courier New" w:hAnsi="Courier New"/>
-          <w:sz w:val="18"/>
-          <w:szCs w:val="18"/>
-        </w:rPr>
-        <w:br w:type="textWrapping"/>
-      </w:r>
-      <w:r>
-        <w:rPr>
-          <w:rFonts w:ascii="Courier New" w:hAnsi="Courier New"/>
-          <w:sz w:val="18"/>
-          <w:szCs w:val="18"/>
-        </w:rPr>
-        <w:t/>
-      </w:r>
-      <w:r>
-        <w:rPr>
-          <w:rFonts w:ascii="Courier New" w:hAnsi="Courier New"/>
-          <w:sz w:val="18"/>
-          <w:szCs w:val="18"/>
-        </w:rPr>
-        <w:br w:type="textWrapping"/>
-      </w:r>
-      <w:r>
-        <w:rPr>
-          <w:rFonts w:ascii="Courier New" w:hAnsi="Courier New"/>
-          <w:sz w:val="18"/>
-          <w:szCs w:val="18"/>
-        </w:rPr>
-        <w:t/>
-      </w:r>
-      <w:r>
-        <w:rPr>
-          <w:rFonts w:ascii="Courier New" w:hAnsi="Courier New"/>
-          <w:sz w:val="18"/>
-          <w:szCs w:val="18"/>
-        </w:rPr>
-        <w:br w:type="textWrapping"/>
-      </w:r>
-      <w:r>
-        <w:rPr>
-          <w:rFonts w:ascii="Courier New" w:hAnsi="Courier New"/>
-          <w:sz w:val="18"/>
-          <w:szCs w:val="18"/>
-        </w:rPr>
-        <w:t/>
-      </w:r>
-      <w:r>
-        <w:rPr>
-          <w:rFonts w:ascii="Courier New" w:hAnsi="Courier New"/>
-          <w:sz w:val="18"/>
-          <w:szCs w:val="18"/>
-        </w:rPr>
-        <w:br w:type="textWrapping"/>
-      </w:r>
-      <w:r>
-        <w:rPr>
-          <w:rFonts w:ascii="Courier New" w:hAnsi="Courier New"/>
-          <w:sz w:val="18"/>
-          <w:szCs w:val="18"/>
-        </w:rPr>
-        <w:t/>
-      </w:r>
-      <w:r>
-        <w:rPr>
-          <w:rFonts w:ascii="Courier New" w:hAnsi="Courier New"/>
-          <w:sz w:val="18"/>
-          <w:szCs w:val="18"/>
-        </w:rPr>
-        <w:br w:type="textWrapping"/>
-      </w:r>
-      <w:r>
-        <w:rPr>
-          <w:rFonts w:ascii="Courier New" w:hAnsi="Courier New"/>
-          <w:sz w:val="18"/>
-          <w:szCs w:val="18"/>
-        </w:rPr>
-        <w:t/>
-      </w:r>
-      <w:r>
-        <w:rPr>
-          <w:rFonts w:ascii="Courier New" w:hAnsi="Courier New"/>
-          <w:sz w:val="18"/>
-          <w:szCs w:val="18"/>
-        </w:rPr>
-        <w:br w:type="textWrapping"/>
-      </w:r>
-      <w:r>
-        <w:rPr>
-          <w:rFonts w:ascii="Courier New" w:hAnsi="Courier New"/>
-          <w:sz w:val="18"/>
-          <w:szCs w:val="18"/>
-        </w:rPr>
-        <w:t/>
-      </w:r>
-      <w:r>
-        <w:rPr>
-          <w:rFonts w:ascii="Courier New" w:hAnsi="Courier New"/>
-          <w:sz w:val="18"/>
-          <w:szCs w:val="18"/>
-        </w:rPr>
-        <w:br w:type="textWrapping"/>
-      </w:r>
-      <w:r>
-        <w:rPr>
-          <w:rFonts w:ascii="Courier New" w:hAnsi="Courier New"/>
-          <w:sz w:val="18"/>
-          <w:szCs w:val="18"/>
-        </w:rPr>
-        <w:t/>
-      </w:r>
-      <w:r>
-        <w:rPr>
-          <w:rFonts w:ascii="Courier New" w:hAnsi="Courier New"/>
-          <w:sz w:val="18"/>
-          <w:szCs w:val="18"/>
-        </w:rPr>
-        <w:br w:type="textWrapping"/>
-      </w:r>
-      <w:r>
-        <w:rPr>
-          <w:rFonts w:ascii="Courier New" w:hAnsi="Courier New"/>
-          <w:sz w:val="18"/>
-          <w:szCs w:val="18"/>
-        </w:rPr>
-        <w:t/>
-      </w:r>
-      <w:r>
-        <w:rPr>
-          <w:rFonts w:ascii="Courier New" w:hAnsi="Courier New"/>
-          <w:sz w:val="18"/>
-          <w:szCs w:val="18"/>
-        </w:rPr>
-        <w:br w:type="textWrapping"/>
-      </w:r>
-      <w:r>
-        <w:rPr>
-          <w:rFonts w:ascii="Courier New" w:hAnsi="Courier New"/>
-          <w:sz w:val="18"/>
-          <w:szCs w:val="18"/>
-        </w:rPr>
-        <w:t/>
-      </w:r>
-      <w:r>
-        <w:rPr>
-          <w:rFonts w:ascii="Courier New" w:hAnsi="Courier New"/>
-          <w:sz w:val="18"/>
-          <w:szCs w:val="18"/>
-        </w:rPr>
-        <w:br w:type="textWrapping"/>
-      </w:r>
-      <w:r>
-        <w:rPr>
-          <w:rFonts w:ascii="Courier New" w:hAnsi="Courier New"/>
-          <w:sz w:val="18"/>
-          <w:szCs w:val="18"/>
-        </w:rPr>
-        <w:t/>
-      </w:r>
-      <w:r>
-        <w:rPr>
-          <w:rFonts w:ascii="Courier New" w:hAnsi="Courier New"/>
-          <w:sz w:val="18"/>
-          <w:szCs w:val="18"/>
-        </w:rPr>
-        <w:br w:type="textWrapping"/>
-      </w:r>
-      <w:r>
-        <w:rPr>
-          <w:rFonts w:ascii="Courier New" w:hAnsi="Courier New"/>
-          <w:sz w:val="18"/>
-          <w:szCs w:val="18"/>
-        </w:rPr>
-        <w:t/>
+        <w:t>proyecto-cgsm-curso/</w:t>
+        <w:br/>
+        <w:t>├── notebooks/        30 notebooks: 23 serie principal + 7 legacy (trazabilidad)</w:t>
+        <w:br/>
+        <w:t>│                     orden de ejecución: 01 → 02 → 02b → 03_acotado →</w:t>
+        <w:br/>
+        <w:t>│                     04_acotado → 04b_acotado → 05_acotado → 06b → 07 → 08 →</w:t>
+        <w:br/>
+        <w:t>│                     09b → 10 → 11 → 11b → 12 → 12b → 12c → 13 → 14</w:t>
+        <w:br/>
+        <w:t>├── src/</w:t>
+        <w:br/>
+        <w:t>│   ├── python/       utils.py (9377 + DE-9IM), aoi_acotado.py, build_cubos.py,</w:t>
+        <w:br/>
+        <w:t>│   │                 make_dashboard_html.py, alertas_manglar.py, merge_cubo.py</w:t>
+        <w:br/>
+        <w:t>│   ├── R/            03_bfast_ndvi.R, 05_stars_cubo.R, 06_bfast_manglar_unificado.R,</w:t>
+        <w:br/>
+        <w:t>│   │                 08_correlacion_trilingual.R</w:t>
+        <w:br/>
+        <w:t>│   └── julia/        04_fragmentacion.jl (4326 legacy + 9377 vigente),</w:t>
+        <w:br/>
+        <w:t>│                     05_correlacion_trilingual.jl</w:t>
+        <w:br/>
+        <w:t>├── data/</w:t>
+        <w:br/>
+        <w:t>│   ├── raw/          AOI preliminar y acotado, RUNAP SFF + VPI, INVEMAR GBIF,</w:t>
+        <w:br/>
+        <w:t>│   │                 IDEAM El Banco / Ganadería Caribe</w:t>
+        <w:br/>
+        <w:t>│   └── processed/</w:t>
+        <w:br/>
+        <w:t>│       ├── cubo/     3 datacubes NetCDF CF-1.8 (40 / 275 / 119 MB)</w:t>
+        <w:br/>
+        <w:t>│       └── samgeo/   máscaras y GeoJSON por periodo</w:t>
+        <w:br/>
+        <w:t>├── outputs/</w:t>
+        <w:br/>
+        <w:t>│   ├── tables/       47 CSV con resultados numéricos</w:t>
+        <w:br/>
+        <w:t>│   ├── figures/      35 PNG (mapas, series, correlaciones, alertas)</w:t>
+        <w:br/>
+        <w:t>│   └── maps/         dashboard_CGSM_final.html</w:t>
+        <w:br/>
+        <w:t>└── docs/             informe_final.{qmd,html,pdf}, informe_anexos.{qmd,html,pdf}</w:t>
       </w:r>
       <w:bookmarkStart w:id="48" w:name="_GoBack"/>
       <w:bookmarkEnd w:id="48"/>
@@ -1267,7 +1002,6 @@
           <w:sz w:val="18"/>
           <w:szCs w:val="18"/>
         </w:rPr>
-        <w:br w:type="textWrapping"/>
       </w:r>
       <w:r>
         <w:rPr>
@@ -1275,7 +1009,6 @@
           <w:sz w:val="18"/>
           <w:szCs w:val="18"/>
         </w:rPr>
-        <w:t/>
       </w:r>
       <w:r>
         <w:rPr>
@@ -1283,7 +1016,6 @@
           <w:sz w:val="18"/>
           <w:szCs w:val="18"/>
         </w:rPr>
-        <w:br w:type="textWrapping"/>
       </w:r>
       <w:r>
         <w:rPr>
@@ -1291,7 +1023,6 @@
           <w:sz w:val="18"/>
           <w:szCs w:val="18"/>
         </w:rPr>
-        <w:t/>
       </w:r>
       <w:r>
         <w:rPr>
@@ -1299,7 +1030,6 @@
           <w:sz w:val="18"/>
           <w:szCs w:val="18"/>
         </w:rPr>
-        <w:br w:type="textWrapping"/>
       </w:r>
       <w:r>
         <w:rPr>
@@ -1307,7 +1037,6 @@
           <w:sz w:val="18"/>
           <w:szCs w:val="18"/>
         </w:rPr>
-        <w:t/>
       </w:r>
       <w:r>
         <w:rPr>
@@ -1315,7 +1044,6 @@
           <w:sz w:val="18"/>
           <w:szCs w:val="18"/>
         </w:rPr>
-        <w:br w:type="textWrapping"/>
       </w:r>
       <w:r>
         <w:rPr>
@@ -1323,7 +1051,111 @@
           <w:sz w:val="18"/>
           <w:szCs w:val="18"/>
         </w:rPr>
-        <w:t/>
+      </w:r>
+      <w:r>
+        <w:rPr>
+          <w:rFonts w:ascii="Courier New" w:hAnsi="Courier New"/>
+          <w:sz w:val="18"/>
+          <w:szCs w:val="18"/>
+        </w:rPr>
+      </w:r>
+      <w:r>
+        <w:rPr>
+          <w:rFonts w:ascii="Courier New" w:hAnsi="Courier New"/>
+          <w:sz w:val="18"/>
+          <w:szCs w:val="18"/>
+        </w:rPr>
+      </w:r>
+      <w:r>
+        <w:rPr>
+          <w:rFonts w:ascii="Courier New" w:hAnsi="Courier New"/>
+          <w:sz w:val="18"/>
+          <w:szCs w:val="18"/>
+        </w:rPr>
+      </w:r>
+      <w:r>
+        <w:rPr>
+          <w:rFonts w:ascii="Courier New" w:hAnsi="Courier New"/>
+          <w:sz w:val="18"/>
+          <w:szCs w:val="18"/>
+        </w:rPr>
+      </w:r>
+      <w:r>
+        <w:rPr>
+          <w:rFonts w:ascii="Courier New" w:hAnsi="Courier New"/>
+          <w:sz w:val="18"/>
+          <w:szCs w:val="18"/>
+        </w:rPr>
+      </w:r>
+      <w:r>
+        <w:rPr>
+          <w:rFonts w:ascii="Courier New" w:hAnsi="Courier New"/>
+          <w:sz w:val="18"/>
+          <w:szCs w:val="18"/>
+        </w:rPr>
+      </w:r>
+      <w:r>
+        <w:rPr>
+          <w:rFonts w:ascii="Courier New" w:hAnsi="Courier New"/>
+          <w:sz w:val="18"/>
+          <w:szCs w:val="18"/>
+        </w:rPr>
+      </w:r>
+      <w:r>
+        <w:rPr>
+          <w:rFonts w:ascii="Courier New" w:hAnsi="Courier New"/>
+          <w:sz w:val="18"/>
+          <w:szCs w:val="18"/>
+        </w:rPr>
+      </w:r>
+      <w:r>
+        <w:rPr>
+          <w:rFonts w:ascii="Courier New" w:hAnsi="Courier New"/>
+          <w:sz w:val="18"/>
+          <w:szCs w:val="18"/>
+        </w:rPr>
+      </w:r>
+      <w:r>
+        <w:rPr>
+          <w:rFonts w:ascii="Courier New" w:hAnsi="Courier New"/>
+          <w:sz w:val="18"/>
+          <w:szCs w:val="18"/>
+        </w:rPr>
+      </w:r>
+      <w:r>
+        <w:rPr>
+          <w:rFonts w:ascii="Courier New" w:hAnsi="Courier New"/>
+          <w:sz w:val="18"/>
+          <w:szCs w:val="18"/>
+        </w:rPr>
+      </w:r>
+      <w:r>
+        <w:rPr>
+          <w:rFonts w:ascii="Courier New" w:hAnsi="Courier New"/>
+          <w:sz w:val="18"/>
+          <w:szCs w:val="18"/>
+        </w:rPr>
+      </w:r>
+      <w:r>
+        <w:rPr>
+          <w:rFonts w:ascii="Courier New" w:hAnsi="Courier New"/>
+          <w:sz w:val="18"/>
+          <w:szCs w:val="18"/>
+        </w:rPr>
+      </w:r>
+      <w:r>
+        <w:rPr>
+          <w:rFonts w:ascii="Courier New" w:hAnsi="Courier New"/>
+          <w:sz w:val="18"/>
+          <w:szCs w:val="18"/>
+        </w:rPr>
+      </w:r>
+      <w:r>
+        <w:rPr>
+          <w:rFonts w:ascii="Courier New" w:hAnsi="Courier New"/>
+          <w:sz w:val="18"/>
+          <w:szCs w:val="18"/>
+        </w:rPr>
       </w:r>
     </w:p>
     <w:p>
@@ -4003,7 +3835,6 @@
       <w:pPr>
         <w:pStyle w:val="5"/>
       </w:pPr>
-      <w:bookmarkStart w:id="10" w:name="X4eca77374d8b0e779af7afe908a4b7ed04f26a6"/>
       <w:r>
         <w:t>E.1.f Monitor near-real-time con bfastmonitor en R</w:t>
       </w:r>
@@ -4014,7 +3845,7 @@
         <w:jc w:val="left"/>
       </w:pPr>
       <w:r>
-        <w:t xml:space="preserve">Sobre las mismas series mensuales combinadas Landsat 8 + Sentinel-2 se aplica bfast::bfastmonitor con una ventana histórica 2013–2019 y un periodo de monitoreo 2020–2025. El modelo ajusta una descomposición armónica con harmon de orden 3 sobre la ventana histórica, considerada estable tras la rehabilitación hidráulica de canales (1996–1998), y evalúa el periodo de monitoreo en busca de breakpoints al nivel de significancia p &lt; 0,05. La salida outputs/tables/bfastmonitor_estaciones.csv contiene, por estación, la fecha del breakpoint detectado, su magnitud y el estado del monitor a la fecha de corte, y alimenta directamente la lógica del semáforo descrita en la sección homónima del cuerpo del informe.</w:t>
+        <w:t>Sobre las mismas series mensuales combinadas Landsat 8 + Sentinel-2 se aplica bfast::bfastmonitor con una ventana histórica 2013–2019 y un periodo de monitoreo 2020–2025. El modelo ajusta una descomposición armónica con harmon de orden 3 sobre la ventana histórica, considerada estable tras la rehabilitación hidráulica de canales (1996–1998), y evalúa el periodo de monitoreo en busca de breakpoints al nivel de significancia p &lt; 0,05. La salida outputs/tables/bfastmonitor_estaciones.csv contiene, por estación, la fecha del breakpoint detectado, su magnitud y el estado del monitor a la fecha de corte, y alimenta directamente la lógica del semáforo descrita en la sección homónima del cuerpo del informe.</w:t>
       </w:r>
     </w:p>
     <w:p>
@@ -4024,615 +3855,283 @@
       </w:pPr>
       <w:r>
         <w:rPr>
-          <w:rStyle w:val="FunctionTok"/>
-          <w:rFonts w:ascii="Consolas" w:hAnsi="Consolas" w:cs="Consolas"/>
-          <w:sz w:val="18"/>
-          <w:szCs w:val="18"/>
-        </w:rPr>
-        <w:t xml:space="preserve">library</w:t>
-      </w:r>
-      <w:r>
-        <w:rPr>
-          <w:rStyle w:val="NormalTok"/>
-          <w:rFonts w:ascii="Consolas" w:hAnsi="Consolas" w:cs="Consolas"/>
-          <w:sz w:val="18"/>
-          <w:szCs w:val="18"/>
-        </w:rPr>
-        <w:t xml:space="preserve">(bfast)</w:t>
-        <w:br/>
-      </w:r>
-      <w:r>
-        <w:rPr>
-          <w:rStyle w:val="NormalTok"/>
-          <w:rFonts w:ascii="Consolas" w:hAnsi="Consolas" w:cs="Consolas"/>
-          <w:sz w:val="18"/>
-          <w:szCs w:val="18"/>
-        </w:rPr>
-        <w:t xml:space="preserve">serie &lt;- </w:t>
-      </w:r>
-      <w:r>
-        <w:rPr>
-          <w:rStyle w:val="FunctionTok"/>
-          <w:rFonts w:ascii="Consolas" w:hAnsi="Consolas" w:cs="Consolas"/>
-          <w:sz w:val="18"/>
-          <w:szCs w:val="18"/>
-        </w:rPr>
-        <w:t xml:space="preserve">read.csv</w:t>
-      </w:r>
-      <w:r>
-        <w:rPr>
-          <w:rStyle w:val="NormalTok"/>
-          <w:rFonts w:ascii="Consolas" w:hAnsi="Consolas" w:cs="Consolas"/>
-          <w:sz w:val="18"/>
-          <w:szCs w:val="18"/>
-        </w:rPr>
-        <w:t xml:space="preserve">(</w:t>
-      </w:r>
-      <w:r>
-        <w:rPr>
-          <w:rStyle w:val="StringTok"/>
-          <w:rFonts w:ascii="Consolas" w:hAnsi="Consolas" w:cs="Consolas"/>
-          <w:sz w:val="18"/>
-          <w:szCs w:val="18"/>
-        </w:rPr>
-        <w:t xml:space="preserve">"outputs/tables/serie_temporal_ndvi_combinada.csv"</w:t>
-      </w:r>
-      <w:r>
-        <w:rPr>
-          <w:rStyle w:val="NormalTok"/>
-          <w:rFonts w:ascii="Consolas" w:hAnsi="Consolas" w:cs="Consolas"/>
-          <w:sz w:val="18"/>
-          <w:szCs w:val="18"/>
-        </w:rPr>
-        <w:t xml:space="preserve">)</w:t>
-        <w:br/>
-      </w:r>
-      <w:r>
-        <w:rPr>
-          <w:rStyle w:val="NormalTok"/>
-          <w:rFonts w:ascii="Consolas" w:hAnsi="Consolas" w:cs="Consolas"/>
-          <w:sz w:val="18"/>
-          <w:szCs w:val="18"/>
-        </w:rPr>
-        <w:t xml:space="preserve"/>
-        <w:br/>
-      </w:r>
-      <w:r>
-        <w:rPr>
-          <w:rStyle w:val="CommentTok"/>
-          <w:rFonts w:ascii="Consolas" w:hAnsi="Consolas" w:cs="Consolas"/>
-          <w:sz w:val="18"/>
-          <w:szCs w:val="18"/>
-        </w:rPr>
-        <w:t xml:space="preserve"># Por estación, ajustar bfastmonitor con history 2013-2019 / monitor 2020-2025</w:t>
-        <w:br/>
-      </w:r>
-      <w:r>
-        <w:rPr>
-          <w:rStyle w:val="NormalTok"/>
-          <w:rFonts w:ascii="Consolas" w:hAnsi="Consolas" w:cs="Consolas"/>
-          <w:sz w:val="18"/>
-          <w:szCs w:val="18"/>
-        </w:rPr>
-        <w:t xml:space="preserve">resultados &lt;- </w:t>
-      </w:r>
-      <w:r>
-        <w:rPr>
-          <w:rStyle w:val="FunctionTok"/>
-          <w:rFonts w:ascii="Consolas" w:hAnsi="Consolas" w:cs="Consolas"/>
-          <w:sz w:val="18"/>
-          <w:szCs w:val="18"/>
-        </w:rPr>
-        <w:t xml:space="preserve">lapply</w:t>
-      </w:r>
-      <w:r>
-        <w:rPr>
-          <w:rStyle w:val="NormalTok"/>
-          <w:rFonts w:ascii="Consolas" w:hAnsi="Consolas" w:cs="Consolas"/>
-          <w:sz w:val="18"/>
-          <w:szCs w:val="18"/>
-        </w:rPr>
-        <w:t xml:space="preserve">(</w:t>
-      </w:r>
-      <w:r>
-        <w:rPr>
-          <w:rStyle w:val="FunctionTok"/>
-          <w:rFonts w:ascii="Consolas" w:hAnsi="Consolas" w:cs="Consolas"/>
-          <w:sz w:val="18"/>
-          <w:szCs w:val="18"/>
-        </w:rPr>
-        <w:t xml:space="preserve">unique</w:t>
-      </w:r>
-      <w:r>
-        <w:rPr>
-          <w:rStyle w:val="NormalTok"/>
-          <w:rFonts w:ascii="Consolas" w:hAnsi="Consolas" w:cs="Consolas"/>
-          <w:sz w:val="18"/>
-          <w:szCs w:val="18"/>
-        </w:rPr>
-        <w:t xml:space="preserve">(serie$estación), </w:t>
-      </w:r>
-      <w:r>
-        <w:rPr>
-          <w:rStyle w:val="KeywordTok"/>
-          <w:rFonts w:ascii="Consolas" w:hAnsi="Consolas" w:cs="Consolas"/>
-          <w:sz w:val="18"/>
-          <w:szCs w:val="18"/>
-        </w:rPr>
-        <w:t xml:space="preserve">function</w:t>
-      </w:r>
-      <w:r>
-        <w:rPr>
-          <w:rStyle w:val="NormalTok"/>
-          <w:rFonts w:ascii="Consolas" w:hAnsi="Consolas" w:cs="Consolas"/>
-          <w:sz w:val="18"/>
-          <w:szCs w:val="18"/>
-        </w:rPr>
-        <w:t xml:space="preserve">(est) {</w:t>
-        <w:br/>
-      </w:r>
-      <w:r>
-        <w:rPr>
-          <w:rStyle w:val="NormalTok"/>
-          <w:rFonts w:ascii="Consolas" w:hAnsi="Consolas" w:cs="Consolas"/>
-          <w:sz w:val="18"/>
-          <w:szCs w:val="18"/>
-        </w:rPr>
-        <w:t xml:space="preserve">  ts_est &lt;- </w:t>
-      </w:r>
-      <w:r>
-        <w:rPr>
-          <w:rStyle w:val="FunctionTok"/>
-          <w:rFonts w:ascii="Consolas" w:hAnsi="Consolas" w:cs="Consolas"/>
-          <w:sz w:val="18"/>
-          <w:szCs w:val="18"/>
-        </w:rPr>
-        <w:t xml:space="preserve">ts</w:t>
-      </w:r>
-      <w:r>
-        <w:rPr>
-          <w:rStyle w:val="NormalTok"/>
-          <w:rFonts w:ascii="Consolas" w:hAnsi="Consolas" w:cs="Consolas"/>
-          <w:sz w:val="18"/>
-          <w:szCs w:val="18"/>
-        </w:rPr>
-        <w:t xml:space="preserve">(</w:t>
-      </w:r>
-      <w:r>
-        <w:rPr>
-          <w:rStyle w:val="FunctionTok"/>
-          <w:rFonts w:ascii="Consolas" w:hAnsi="Consolas" w:cs="Consolas"/>
-          <w:sz w:val="18"/>
-          <w:szCs w:val="18"/>
-        </w:rPr>
-        <w:t xml:space="preserve">subset</w:t>
-      </w:r>
-      <w:r>
-        <w:rPr>
-          <w:rStyle w:val="NormalTok"/>
-          <w:rFonts w:ascii="Consolas" w:hAnsi="Consolas" w:cs="Consolas"/>
-          <w:sz w:val="18"/>
-          <w:szCs w:val="18"/>
-        </w:rPr>
-        <w:t xml:space="preserve">(serie, estación == est)$ndvi,</w:t>
-        <w:br/>
-      </w:r>
-      <w:r>
-        <w:rPr>
-          <w:rStyle w:val="NormalTok"/>
-          <w:rFonts w:ascii="Consolas" w:hAnsi="Consolas" w:cs="Consolas"/>
-          <w:sz w:val="18"/>
-          <w:szCs w:val="18"/>
-        </w:rPr>
-        <w:t xml:space="preserve">                start = </w:t>
-      </w:r>
-      <w:r>
-        <w:rPr>
-          <w:rStyle w:val="FunctionTok"/>
-          <w:rFonts w:ascii="Consolas" w:hAnsi="Consolas" w:cs="Consolas"/>
-          <w:sz w:val="18"/>
-          <w:szCs w:val="18"/>
-        </w:rPr>
-        <w:t xml:space="preserve">c</w:t>
-      </w:r>
-      <w:r>
-        <w:rPr>
-          <w:rStyle w:val="NormalTok"/>
-          <w:rFonts w:ascii="Consolas" w:hAnsi="Consolas" w:cs="Consolas"/>
-          <w:sz w:val="18"/>
-          <w:szCs w:val="18"/>
-        </w:rPr>
-        <w:t xml:space="preserve">(</w:t>
-      </w:r>
-      <w:r>
-        <w:rPr>
-          <w:rStyle w:val="DecValTok"/>
-          <w:rFonts w:ascii="Consolas" w:hAnsi="Consolas" w:cs="Consolas"/>
-          <w:sz w:val="18"/>
-          <w:szCs w:val="18"/>
-        </w:rPr>
-        <w:t xml:space="preserve">2013</w:t>
-      </w:r>
-      <w:r>
-        <w:rPr>
-          <w:rStyle w:val="NormalTok"/>
-          <w:rFonts w:ascii="Consolas" w:hAnsi="Consolas" w:cs="Consolas"/>
-          <w:sz w:val="18"/>
-          <w:szCs w:val="18"/>
-        </w:rPr>
-        <w:t xml:space="preserve">, </w:t>
-      </w:r>
-      <w:r>
-        <w:rPr>
-          <w:rStyle w:val="DecValTok"/>
-          <w:rFonts w:ascii="Consolas" w:hAnsi="Consolas" w:cs="Consolas"/>
-          <w:sz w:val="18"/>
-          <w:szCs w:val="18"/>
-        </w:rPr>
-        <w:t xml:space="preserve">1</w:t>
-      </w:r>
-      <w:r>
-        <w:rPr>
-          <w:rStyle w:val="NormalTok"/>
-          <w:rFonts w:ascii="Consolas" w:hAnsi="Consolas" w:cs="Consolas"/>
-          <w:sz w:val="18"/>
-          <w:szCs w:val="18"/>
-        </w:rPr>
-        <w:t xml:space="preserve">), frequency = </w:t>
-      </w:r>
-      <w:r>
-        <w:rPr>
-          <w:rStyle w:val="DecValTok"/>
-          <w:rFonts w:ascii="Consolas" w:hAnsi="Consolas" w:cs="Consolas"/>
-          <w:sz w:val="18"/>
-          <w:szCs w:val="18"/>
-        </w:rPr>
-        <w:t xml:space="preserve">12</w:t>
-      </w:r>
-      <w:r>
-        <w:rPr>
-          <w:rStyle w:val="NormalTok"/>
-          <w:rFonts w:ascii="Consolas" w:hAnsi="Consolas" w:cs="Consolas"/>
-          <w:sz w:val="18"/>
-          <w:szCs w:val="18"/>
-        </w:rPr>
-        <w:t xml:space="preserve">)</w:t>
-        <w:br/>
-      </w:r>
-      <w:r>
-        <w:rPr>
-          <w:rStyle w:val="NormalTok"/>
-          <w:rFonts w:ascii="Consolas" w:hAnsi="Consolas" w:cs="Consolas"/>
-          <w:sz w:val="18"/>
-          <w:szCs w:val="18"/>
-        </w:rPr>
-        <w:t xml:space="preserve">  mon &lt;- </w:t>
-      </w:r>
-      <w:r>
-        <w:rPr>
-          <w:rStyle w:val="FunctionTok"/>
-          <w:rFonts w:ascii="Consolas" w:hAnsi="Consolas" w:cs="Consolas"/>
-          <w:sz w:val="18"/>
-          <w:szCs w:val="18"/>
-        </w:rPr>
-        <w:t xml:space="preserve">bfastmonitor</w:t>
-      </w:r>
-      <w:r>
-        <w:rPr>
-          <w:rStyle w:val="NormalTok"/>
-          <w:rFonts w:ascii="Consolas" w:hAnsi="Consolas" w:cs="Consolas"/>
-          <w:sz w:val="18"/>
-          <w:szCs w:val="18"/>
-        </w:rPr>
-        <w:t xml:space="preserve">(ts_est,</w:t>
-        <w:br/>
-      </w:r>
-      <w:r>
-        <w:rPr>
-          <w:rStyle w:val="NormalTok"/>
-          <w:rFonts w:ascii="Consolas" w:hAnsi="Consolas" w:cs="Consolas"/>
-          <w:sz w:val="18"/>
-          <w:szCs w:val="18"/>
-        </w:rPr>
-        <w:t xml:space="preserve">                      start   = </w:t>
-      </w:r>
-      <w:r>
-        <w:rPr>
-          <w:rStyle w:val="FunctionTok"/>
-          <w:rFonts w:ascii="Consolas" w:hAnsi="Consolas" w:cs="Consolas"/>
-          <w:sz w:val="18"/>
-          <w:szCs w:val="18"/>
-        </w:rPr>
-        <w:t xml:space="preserve">c</w:t>
-      </w:r>
-      <w:r>
-        <w:rPr>
-          <w:rStyle w:val="NormalTok"/>
-          <w:rFonts w:ascii="Consolas" w:hAnsi="Consolas" w:cs="Consolas"/>
-          <w:sz w:val="18"/>
-          <w:szCs w:val="18"/>
-        </w:rPr>
-        <w:t xml:space="preserve">(</w:t>
-      </w:r>
-      <w:r>
-        <w:rPr>
-          <w:rStyle w:val="DecValTok"/>
-          <w:rFonts w:ascii="Consolas" w:hAnsi="Consolas" w:cs="Consolas"/>
-          <w:sz w:val="18"/>
-          <w:szCs w:val="18"/>
-        </w:rPr>
-        <w:t xml:space="preserve">2020</w:t>
-      </w:r>
-      <w:r>
-        <w:rPr>
-          <w:rStyle w:val="NormalTok"/>
-          <w:rFonts w:ascii="Consolas" w:hAnsi="Consolas" w:cs="Consolas"/>
-          <w:sz w:val="18"/>
-          <w:szCs w:val="18"/>
-        </w:rPr>
-        <w:t xml:space="preserve">, </w:t>
-      </w:r>
-      <w:r>
-        <w:rPr>
-          <w:rStyle w:val="DecValTok"/>
-          <w:rFonts w:ascii="Consolas" w:hAnsi="Consolas" w:cs="Consolas"/>
-          <w:sz w:val="18"/>
-          <w:szCs w:val="18"/>
-        </w:rPr>
-        <w:t xml:space="preserve">1</w:t>
-      </w:r>
-      <w:r>
-        <w:rPr>
-          <w:rStyle w:val="NormalTok"/>
-          <w:rFonts w:ascii="Consolas" w:hAnsi="Consolas" w:cs="Consolas"/>
-          <w:sz w:val="18"/>
-          <w:szCs w:val="18"/>
-        </w:rPr>
-        <w:t xml:space="preserve">),</w:t>
-        <w:br/>
-      </w:r>
-      <w:r>
-        <w:rPr>
-          <w:rStyle w:val="NormalTok"/>
+          <w:rFonts w:ascii="Consolas" w:hAnsi="Consolas" w:cs="Consolas"/>
+          <w:sz w:val="18"/>
+          <w:szCs w:val="18"/>
+        </w:rPr>
+        <w:t>library(bfast)</w:t>
+      </w:r>
+      <w:r>
+        <w:rPr>
+          <w:rFonts w:ascii="Consolas" w:hAnsi="Consolas" w:cs="Consolas"/>
+          <w:sz w:val="18"/>
+          <w:szCs w:val="18"/>
+        </w:rPr>
+        <w:br w:type="textWrapping"/>
+      </w:r>
+      <w:r>
+        <w:rPr>
+          <w:rFonts w:ascii="Consolas" w:hAnsi="Consolas" w:cs="Consolas"/>
+          <w:sz w:val="18"/>
+          <w:szCs w:val="18"/>
+        </w:rPr>
+        <w:t>serie &lt;- read.csv("outputs/tables/serie_temporal_ndvi_combinada.csv")</w:t>
+      </w:r>
+      <w:r>
+        <w:rPr>
+          <w:rFonts w:ascii="Consolas" w:hAnsi="Consolas" w:cs="Consolas"/>
+          <w:sz w:val="18"/>
+          <w:szCs w:val="18"/>
+        </w:rPr>
+        <w:br w:type="textWrapping"/>
+      </w:r>
+      <w:r>
+        <w:rPr>
+          <w:rFonts w:ascii="Consolas" w:hAnsi="Consolas" w:cs="Consolas"/>
+          <w:sz w:val="18"/>
+          <w:szCs w:val="18"/>
+        </w:rPr>
+        <w:br w:type="textWrapping"/>
+      </w:r>
+      <w:r>
+        <w:rPr>
+          <w:rFonts w:ascii="Consolas" w:hAnsi="Consolas" w:cs="Consolas"/>
+          <w:sz w:val="18"/>
+          <w:szCs w:val="18"/>
+        </w:rPr>
+        <w:t># Por estación, ajustar bfastmonitor con history 2013-2019 / monitor 2020-2025</w:t>
+      </w:r>
+      <w:r>
+        <w:rPr>
+          <w:rFonts w:ascii="Consolas" w:hAnsi="Consolas" w:cs="Consolas"/>
+          <w:sz w:val="18"/>
+          <w:szCs w:val="18"/>
+        </w:rPr>
+        <w:br w:type="textWrapping"/>
+      </w:r>
+      <w:r>
+        <w:rPr>
+          <w:rFonts w:ascii="Consolas" w:hAnsi="Consolas" w:cs="Consolas"/>
+          <w:sz w:val="18"/>
+          <w:szCs w:val="18"/>
+        </w:rPr>
+        <w:t>resultados &lt;- lapply(unique(serie$estación), function(est) {</w:t>
+      </w:r>
+      <w:r>
+        <w:rPr>
+          <w:rFonts w:ascii="Consolas" w:hAnsi="Consolas" w:cs="Consolas"/>
+          <w:sz w:val="18"/>
+          <w:szCs w:val="18"/>
+        </w:rPr>
+        <w:br w:type="textWrapping"/>
+      </w:r>
+      <w:r>
+        <w:rPr>
+          <w:rFonts w:ascii="Consolas" w:hAnsi="Consolas" w:cs="Consolas"/>
+          <w:sz w:val="18"/>
+          <w:szCs w:val="18"/>
+        </w:rPr>
+        <w:t xml:space="preserve">  ts_est &lt;- ts(subset(serie, estación == est)$ndvi,</w:t>
+      </w:r>
+      <w:r>
+        <w:rPr>
+          <w:rFonts w:ascii="Consolas" w:hAnsi="Consolas" w:cs="Consolas"/>
+          <w:sz w:val="18"/>
+          <w:szCs w:val="18"/>
+        </w:rPr>
+        <w:br w:type="textWrapping"/>
+      </w:r>
+      <w:r>
+        <w:rPr>
+          <w:rFonts w:ascii="Consolas" w:hAnsi="Consolas" w:cs="Consolas"/>
+          <w:sz w:val="18"/>
+          <w:szCs w:val="18"/>
+        </w:rPr>
+        <w:t xml:space="preserve">                start = c(2013, 1), frequency = 12)</w:t>
+      </w:r>
+      <w:r>
+        <w:rPr>
+          <w:rFonts w:ascii="Consolas" w:hAnsi="Consolas" w:cs="Consolas"/>
+          <w:sz w:val="18"/>
+          <w:szCs w:val="18"/>
+        </w:rPr>
+        <w:br w:type="textWrapping"/>
+      </w:r>
+      <w:r>
+        <w:rPr>
+          <w:rFonts w:ascii="Consolas" w:hAnsi="Consolas" w:cs="Consolas"/>
+          <w:sz w:val="18"/>
+          <w:szCs w:val="18"/>
+        </w:rPr>
+        <w:t xml:space="preserve">  mon &lt;- bfastmonitor(ts_est,</w:t>
+      </w:r>
+      <w:r>
+        <w:rPr>
+          <w:rFonts w:ascii="Consolas" w:hAnsi="Consolas" w:cs="Consolas"/>
+          <w:sz w:val="18"/>
+          <w:szCs w:val="18"/>
+        </w:rPr>
+        <w:br w:type="textWrapping"/>
+      </w:r>
+      <w:r>
+        <w:rPr>
+          <w:rFonts w:ascii="Consolas" w:hAnsi="Consolas" w:cs="Consolas"/>
+          <w:sz w:val="18"/>
+          <w:szCs w:val="18"/>
+        </w:rPr>
+        <w:t xml:space="preserve">                      start   = c(2020, 1),</w:t>
+      </w:r>
+      <w:r>
+        <w:rPr>
+          <w:rFonts w:ascii="Consolas" w:hAnsi="Consolas" w:cs="Consolas"/>
+          <w:sz w:val="18"/>
+          <w:szCs w:val="18"/>
+        </w:rPr>
+        <w:br w:type="textWrapping"/>
+      </w:r>
+      <w:r>
+        <w:rPr>
           <w:rFonts w:ascii="Consolas" w:hAnsi="Consolas" w:cs="Consolas"/>
           <w:sz w:val="18"/>
           <w:szCs w:val="18"/>
         </w:rPr>
         <w:t xml:space="preserve">                      formula = response ~ harmon,</w:t>
-        <w:br/>
-      </w:r>
-      <w:r>
-        <w:rPr>
-          <w:rStyle w:val="NormalTok"/>
-          <w:rFonts w:ascii="Consolas" w:hAnsi="Consolas" w:cs="Consolas"/>
-          <w:sz w:val="18"/>
-          <w:szCs w:val="18"/>
-        </w:rPr>
-        <w:t xml:space="preserve">                      order   = </w:t>
-      </w:r>
-      <w:r>
-        <w:rPr>
-          <w:rStyle w:val="DecValTok"/>
-          <w:rFonts w:ascii="Consolas" w:hAnsi="Consolas" w:cs="Consolas"/>
-          <w:sz w:val="18"/>
-          <w:szCs w:val="18"/>
-        </w:rPr>
-        <w:t xml:space="preserve">3</w:t>
-      </w:r>
-      <w:r>
-        <w:rPr>
-          <w:rStyle w:val="NormalTok"/>
-          <w:rFonts w:ascii="Consolas" w:hAnsi="Consolas" w:cs="Consolas"/>
-          <w:sz w:val="18"/>
-          <w:szCs w:val="18"/>
-        </w:rPr>
-        <w:t xml:space="preserve">,</w:t>
-        <w:br/>
-      </w:r>
-      <w:r>
-        <w:rPr>
-          <w:rStyle w:val="NormalTok"/>
-          <w:rFonts w:ascii="Consolas" w:hAnsi="Consolas" w:cs="Consolas"/>
-          <w:sz w:val="18"/>
-          <w:szCs w:val="18"/>
-        </w:rPr>
-        <w:t xml:space="preserve">                      level   = </w:t>
-      </w:r>
-      <w:r>
-        <w:rPr>
-          <w:rStyle w:val="FloatTok"/>
-          <w:rFonts w:ascii="Consolas" w:hAnsi="Consolas" w:cs="Consolas"/>
-          <w:sz w:val="18"/>
-          <w:szCs w:val="18"/>
-        </w:rPr>
-        <w:t xml:space="preserve">0.05</w:t>
-      </w:r>
-      <w:r>
-        <w:rPr>
-          <w:rStyle w:val="NormalTok"/>
-          <w:rFonts w:ascii="Consolas" w:hAnsi="Consolas" w:cs="Consolas"/>
-          <w:sz w:val="18"/>
-          <w:szCs w:val="18"/>
-        </w:rPr>
-        <w:t xml:space="preserve">)</w:t>
-        <w:br/>
-      </w:r>
-      <w:r>
-        <w:rPr>
-          <w:rStyle w:val="NormalTok"/>
-          <w:rFonts w:ascii="Consolas" w:hAnsi="Consolas" w:cs="Consolas"/>
-          <w:sz w:val="18"/>
-          <w:szCs w:val="18"/>
-        </w:rPr>
-        <w:t xml:space="preserve">  </w:t>
-      </w:r>
-      <w:r>
-        <w:rPr>
-          <w:rStyle w:val="FunctionTok"/>
-          <w:rFonts w:ascii="Consolas" w:hAnsi="Consolas" w:cs="Consolas"/>
-          <w:sz w:val="18"/>
-          <w:szCs w:val="18"/>
-        </w:rPr>
-        <w:t xml:space="preserve">data.frame</w:t>
-      </w:r>
-      <w:r>
-        <w:rPr>
-          <w:rStyle w:val="NormalTok"/>
-          <w:rFonts w:ascii="Consolas" w:hAnsi="Consolas" w:cs="Consolas"/>
-          <w:sz w:val="18"/>
-          <w:szCs w:val="18"/>
-        </w:rPr>
-        <w:t xml:space="preserve">(estación = est,</w:t>
-        <w:br/>
-      </w:r>
-      <w:r>
-        <w:rPr>
-          <w:rStyle w:val="NormalTok"/>
-          <w:rFonts w:ascii="Consolas" w:hAnsi="Consolas" w:cs="Consolas"/>
-          <w:sz w:val="18"/>
-          <w:szCs w:val="18"/>
-        </w:rPr>
-        <w:t xml:space="preserve">             breakpoint = </w:t>
-      </w:r>
-      <w:r>
-        <w:rPr>
-          <w:rStyle w:val="FunctionTok"/>
-          <w:rFonts w:ascii="Consolas" w:hAnsi="Consolas" w:cs="Consolas"/>
-          <w:sz w:val="18"/>
-          <w:szCs w:val="18"/>
-        </w:rPr>
-        <w:t xml:space="preserve">as.character</w:t>
-      </w:r>
-      <w:r>
-        <w:rPr>
-          <w:rStyle w:val="NormalTok"/>
-          <w:rFonts w:ascii="Consolas" w:hAnsi="Consolas" w:cs="Consolas"/>
-          <w:sz w:val="18"/>
-          <w:szCs w:val="18"/>
-        </w:rPr>
-        <w:t xml:space="preserve">(</w:t>
-      </w:r>
-      <w:r>
-        <w:rPr>
-          <w:rStyle w:val="FunctionTok"/>
-          <w:rFonts w:ascii="Consolas" w:hAnsi="Consolas" w:cs="Consolas"/>
-          <w:sz w:val="18"/>
-          <w:szCs w:val="18"/>
-        </w:rPr>
-        <w:t xml:space="preserve">time</w:t>
-      </w:r>
-      <w:r>
-        <w:rPr>
-          <w:rStyle w:val="NormalTok"/>
-          <w:rFonts w:ascii="Consolas" w:hAnsi="Consolas" w:cs="Consolas"/>
-          <w:sz w:val="18"/>
-          <w:szCs w:val="18"/>
-        </w:rPr>
-        <w:t xml:space="preserve">(mon$breakpoint)),</w:t>
-        <w:br/>
-      </w:r>
-      <w:r>
-        <w:rPr>
-          <w:rStyle w:val="NormalTok"/>
+      </w:r>
+      <w:r>
+        <w:rPr>
+          <w:rFonts w:ascii="Consolas" w:hAnsi="Consolas" w:cs="Consolas"/>
+          <w:sz w:val="18"/>
+          <w:szCs w:val="18"/>
+        </w:rPr>
+        <w:br w:type="textWrapping"/>
+      </w:r>
+      <w:r>
+        <w:rPr>
+          <w:rFonts w:ascii="Consolas" w:hAnsi="Consolas" w:cs="Consolas"/>
+          <w:sz w:val="18"/>
+          <w:szCs w:val="18"/>
+        </w:rPr>
+        <w:t xml:space="preserve">                      order   = 3,</w:t>
+      </w:r>
+      <w:r>
+        <w:rPr>
+          <w:rFonts w:ascii="Consolas" w:hAnsi="Consolas" w:cs="Consolas"/>
+          <w:sz w:val="18"/>
+          <w:szCs w:val="18"/>
+        </w:rPr>
+        <w:br w:type="textWrapping"/>
+      </w:r>
+      <w:r>
+        <w:rPr>
+          <w:rFonts w:ascii="Consolas" w:hAnsi="Consolas" w:cs="Consolas"/>
+          <w:sz w:val="18"/>
+          <w:szCs w:val="18"/>
+        </w:rPr>
+        <w:t xml:space="preserve">                      level   = 0.05)</w:t>
+      </w:r>
+      <w:r>
+        <w:rPr>
+          <w:rFonts w:ascii="Consolas" w:hAnsi="Consolas" w:cs="Consolas"/>
+          <w:sz w:val="18"/>
+          <w:szCs w:val="18"/>
+        </w:rPr>
+        <w:br w:type="textWrapping"/>
+      </w:r>
+      <w:r>
+        <w:rPr>
+          <w:rFonts w:ascii="Consolas" w:hAnsi="Consolas" w:cs="Consolas"/>
+          <w:sz w:val="18"/>
+          <w:szCs w:val="18"/>
+        </w:rPr>
+        <w:t xml:space="preserve">  data.frame(estación = est,</w:t>
+      </w:r>
+      <w:r>
+        <w:rPr>
+          <w:rFonts w:ascii="Consolas" w:hAnsi="Consolas" w:cs="Consolas"/>
+          <w:sz w:val="18"/>
+          <w:szCs w:val="18"/>
+        </w:rPr>
+        <w:br w:type="textWrapping"/>
+      </w:r>
+      <w:r>
+        <w:rPr>
+          <w:rFonts w:ascii="Consolas" w:hAnsi="Consolas" w:cs="Consolas"/>
+          <w:sz w:val="18"/>
+          <w:szCs w:val="18"/>
+        </w:rPr>
+        <w:t xml:space="preserve">             breakpoint = as.character(time(mon$breakpoint)),</w:t>
+      </w:r>
+      <w:r>
+        <w:rPr>
+          <w:rFonts w:ascii="Consolas" w:hAnsi="Consolas" w:cs="Consolas"/>
+          <w:sz w:val="18"/>
+          <w:szCs w:val="18"/>
+        </w:rPr>
+        <w:br w:type="textWrapping"/>
+      </w:r>
+      <w:r>
+        <w:rPr>
           <w:rFonts w:ascii="Consolas" w:hAnsi="Consolas" w:cs="Consolas"/>
           <w:sz w:val="18"/>
           <w:szCs w:val="18"/>
         </w:rPr>
         <w:t xml:space="preserve">             magnitud   = mon$magnitude)</w:t>
-        <w:br/>
-      </w:r>
-      <w:r>
-        <w:rPr>
-          <w:rStyle w:val="NormalTok"/>
-          <w:rFonts w:ascii="Consolas" w:hAnsi="Consolas" w:cs="Consolas"/>
-          <w:sz w:val="18"/>
-          <w:szCs w:val="18"/>
-        </w:rPr>
-        <w:t xml:space="preserve">})</w:t>
-        <w:br/>
-      </w:r>
-      <w:r>
-        <w:rPr>
-          <w:rStyle w:val="NormalTok"/>
-          <w:rFonts w:ascii="Consolas" w:hAnsi="Consolas" w:cs="Consolas"/>
-          <w:sz w:val="18"/>
-          <w:szCs w:val="18"/>
-        </w:rPr>
-        <w:t xml:space="preserve"/>
-        <w:br/>
-      </w:r>
-      <w:r>
-        <w:rPr>
-          <w:rStyle w:val="FunctionTok"/>
-          <w:rFonts w:ascii="Consolas" w:hAnsi="Consolas" w:cs="Consolas"/>
-          <w:sz w:val="18"/>
-          <w:szCs w:val="18"/>
-        </w:rPr>
-        <w:t xml:space="preserve">write.csv</w:t>
-      </w:r>
-      <w:r>
-        <w:rPr>
-          <w:rStyle w:val="NormalTok"/>
-          <w:rFonts w:ascii="Consolas" w:hAnsi="Consolas" w:cs="Consolas"/>
-          <w:sz w:val="18"/>
-          <w:szCs w:val="18"/>
-        </w:rPr>
-        <w:t xml:space="preserve">(</w:t>
-      </w:r>
-      <w:r>
-        <w:rPr>
-          <w:rStyle w:val="FunctionTok"/>
-          <w:rFonts w:ascii="Consolas" w:hAnsi="Consolas" w:cs="Consolas"/>
-          <w:sz w:val="18"/>
-          <w:szCs w:val="18"/>
-        </w:rPr>
-        <w:t xml:space="preserve">do.call</w:t>
-      </w:r>
-      <w:r>
-        <w:rPr>
-          <w:rStyle w:val="NormalTok"/>
-          <w:rFonts w:ascii="Consolas" w:hAnsi="Consolas" w:cs="Consolas"/>
-          <w:sz w:val="18"/>
-          <w:szCs w:val="18"/>
-        </w:rPr>
-        <w:t xml:space="preserve">(rbind, resultados),</w:t>
-        <w:br/>
-      </w:r>
-      <w:r>
-        <w:rPr>
-          <w:rStyle w:val="StringTok"/>
-          <w:rFonts w:ascii="Consolas" w:hAnsi="Consolas" w:cs="Consolas"/>
-          <w:sz w:val="18"/>
-          <w:szCs w:val="18"/>
-        </w:rPr>
-        <w:t xml:space="preserve">          "outputs/tables/bfastmonitor_estaciones.csv"</w:t>
-      </w:r>
-      <w:r>
-        <w:rPr>
-          <w:rStyle w:val="NormalTok"/>
-          <w:rFonts w:ascii="Consolas" w:hAnsi="Consolas" w:cs="Consolas"/>
-          <w:sz w:val="18"/>
-          <w:szCs w:val="18"/>
-        </w:rPr>
-        <w:t xml:space="preserve">, row.names = </w:t>
-      </w:r>
-      <w:r>
-        <w:rPr>
-          <w:rStyle w:val="ConstantTok"/>
-          <w:rFonts w:ascii="Consolas" w:hAnsi="Consolas" w:cs="Consolas"/>
-          <w:sz w:val="18"/>
-          <w:szCs w:val="18"/>
-        </w:rPr>
-        <w:t xml:space="preserve">FALSE</w:t>
-      </w:r>
-      <w:r>
-        <w:rPr>
-          <w:rStyle w:val="NormalTok"/>
-          <w:rFonts w:ascii="Consolas" w:hAnsi="Consolas" w:cs="Consolas"/>
-          <w:sz w:val="18"/>
-          <w:szCs w:val="18"/>
-        </w:rPr>
-        <w:t xml:space="preserve">)</w:t>
+      </w:r>
+      <w:r>
+        <w:rPr>
+          <w:rFonts w:ascii="Consolas" w:hAnsi="Consolas" w:cs="Consolas"/>
+          <w:sz w:val="18"/>
+          <w:szCs w:val="18"/>
+        </w:rPr>
+        <w:br w:type="textWrapping"/>
+      </w:r>
+      <w:r>
+        <w:rPr>
+          <w:rFonts w:ascii="Consolas" w:hAnsi="Consolas" w:cs="Consolas"/>
+          <w:sz w:val="18"/>
+          <w:szCs w:val="18"/>
+        </w:rPr>
+        <w:t>})</w:t>
+      </w:r>
+      <w:r>
+        <w:rPr>
+          <w:rFonts w:ascii="Consolas" w:hAnsi="Consolas" w:cs="Consolas"/>
+          <w:sz w:val="18"/>
+          <w:szCs w:val="18"/>
+        </w:rPr>
+        <w:br w:type="textWrapping"/>
+      </w:r>
+      <w:r>
+        <w:rPr>
+          <w:rFonts w:ascii="Consolas" w:hAnsi="Consolas" w:cs="Consolas"/>
+          <w:sz w:val="18"/>
+          <w:szCs w:val="18"/>
+        </w:rPr>
+        <w:br w:type="textWrapping"/>
+      </w:r>
+      <w:r>
+        <w:rPr>
+          <w:rFonts w:ascii="Consolas" w:hAnsi="Consolas" w:cs="Consolas"/>
+          <w:sz w:val="18"/>
+          <w:szCs w:val="18"/>
+        </w:rPr>
+        <w:t>write.csv(do.call(rbind, resultados),</w:t>
+      </w:r>
+      <w:r>
+        <w:rPr>
+          <w:rFonts w:ascii="Consolas" w:hAnsi="Consolas" w:cs="Consolas"/>
+          <w:sz w:val="18"/>
+          <w:szCs w:val="18"/>
+        </w:rPr>
+        <w:br w:type="textWrapping"/>
+      </w:r>
+      <w:r>
+        <w:rPr>
+          <w:rFonts w:ascii="Consolas" w:hAnsi="Consolas" w:cs="Consolas"/>
+          <w:sz w:val="18"/>
+          <w:szCs w:val="18"/>
+        </w:rPr>
+        <w:t xml:space="preserve">          "outputs/tables/bfastmonitor_estaciones.csv", row.names = FALSE)</w:t>
       </w:r>
     </w:p>
     <w:bookmarkEnd w:id="5"/>
@@ -7970,6 +7469,12 @@
             <w:insideH w:val="single" w:color="000000" w:sz="4" w:space="0"/>
             <w:insideV w:val="single" w:color="000000" w:sz="4" w:space="0"/>
           </w:tblBorders>
+          <w:tblCellMar>
+            <w:top w:w="0" w:type="dxa"/>
+            <w:left w:w="108" w:type="dxa"/>
+            <w:bottom w:w="0" w:type="dxa"/>
+            <w:right w:w="108" w:type="dxa"/>
+          </w:tblCellMar>
         </w:tblPrEx>
         <w:tc>
           <w:p>
@@ -31416,7 +30921,7 @@
     <w:lsdException w:qFormat="1" w:unhideWhenUsed="0" w:uiPriority="0" w:semiHidden="0" w:name="Title"/>
     <w:lsdException w:unhideWhenUsed="0" w:uiPriority="0" w:semiHidden="0" w:name="Closing"/>
     <w:lsdException w:unhideWhenUsed="0" w:uiPriority="0" w:semiHidden="0" w:name="Signature"/>
-    <w:lsdException w:uiPriority="0" w:name="Default Paragraph Font"/>
+    <w:lsdException w:qFormat="1" w:uiPriority="0" w:name="Default Paragraph Font"/>
     <w:lsdException w:qFormat="1" w:unhideWhenUsed="0" w:uiPriority="0" w:semiHidden="0" w:name="Body Text"/>
     <w:lsdException w:unhideWhenUsed="0" w:uiPriority="0" w:semiHidden="0" w:name="Body Text Indent"/>
     <w:lsdException w:unhideWhenUsed="0" w:uiPriority="0" w:semiHidden="0" w:name="List Continue"/>
@@ -31436,7 +30941,7 @@
     <w:lsdException w:unhideWhenUsed="0" w:uiPriority="0" w:semiHidden="0" w:name="Body Text Indent 2"/>
     <w:lsdException w:unhideWhenUsed="0" w:uiPriority="0" w:semiHidden="0" w:name="Body Text Indent 3"/>
     <w:lsdException w:qFormat="1" w:uiPriority="9" w:semiHidden="0" w:name="Block Text"/>
-    <w:lsdException w:unhideWhenUsed="0" w:uiPriority="0" w:semiHidden="0" w:name="Hyperlink"/>
+    <w:lsdException w:qFormat="1" w:unhideWhenUsed="0" w:uiPriority="0" w:semiHidden="0" w:name="Hyperlink"/>
     <w:lsdException w:unhideWhenUsed="0" w:uiPriority="0" w:semiHidden="0" w:name="FollowedHyperlink"/>
     <w:lsdException w:unhideWhenUsed="0" w:uiPriority="0" w:semiHidden="0" w:name="Strong"/>
     <w:lsdException w:unhideWhenUsed="0" w:uiPriority="0" w:semiHidden="0" w:name="Emphasis"/>
@@ -31454,7 +30959,7 @@
     <w:lsdException w:unhideWhenUsed="0" w:uiPriority="0" w:semiHidden="0" w:name="HTML Sample"/>
     <w:lsdException w:unhideWhenUsed="0" w:uiPriority="0" w:semiHidden="0" w:name="HTML Typewriter"/>
     <w:lsdException w:unhideWhenUsed="0" w:uiPriority="0" w:semiHidden="0" w:name="HTML Variable"/>
-    <w:lsdException w:unhideWhenUsed="0" w:uiPriority="0" w:semiHidden="0" w:name="Normal Table"/>
+    <w:lsdException w:qFormat="1" w:unhideWhenUsed="0" w:uiPriority="0" w:semiHidden="0" w:name="Normal Table"/>
     <w:lsdException w:unhideWhenUsed="0" w:uiPriority="0" w:semiHidden="0" w:name="annotation subject"/>
     <w:lsdException w:unhideWhenUsed="0" w:uiPriority="0" w:semiHidden="0" w:name="Table Simple 1"/>
     <w:lsdException w:unhideWhenUsed="0" w:uiPriority="0" w:semiHidden="0" w:name="Table Simple 2"/>
@@ -31710,10 +31215,12 @@
     <w:name w:val="Default Paragraph Font"/>
     <w:semiHidden/>
     <w:unhideWhenUsed/>
+    <w:qFormat/>
     <w:uiPriority w:val="0"/>
   </w:style>
   <w:style w:type="table" w:default="1" w:styleId="13">
     <w:name w:val="Normal Table"/>
+    <w:qFormat/>
     <w:uiPriority w:val="0"/>
     <w:tblPr>
       <w:tblCellMar>
@@ -31758,6 +31265,7 @@
   <w:style w:type="character" w:styleId="16">
     <w:name w:val="Hyperlink"/>
     <w:basedOn w:val="15"/>
+    <w:qFormat/>
     <w:uiPriority w:val="0"/>
     <w:rPr>
       <w:color w:val="4F81BD" w:themeColor="accent1"/>
@@ -31949,7 +31457,6 @@
       </w:tblCellMar>
     </w:tblPr>
     <w:tblStylePr w:type="firstRow">
-      <w:tblPr/>
       <w:tcPr>
         <w:tcBorders>
           <w:bottom w:val="single" w:color="auto" w:sz="0" w:space="0"/>
@@ -32013,6 +31520,7 @@
     <w:name w:val="Verbatim Char"/>
     <w:basedOn w:val="15"/>
     <w:link w:val="37"/>
+    <w:qFormat/>
     <w:uiPriority w:val="0"/>
     <w:rPr>
       <w:rFonts w:ascii="Consolas" w:hAnsi="Consolas"/>
@@ -32077,6 +31585,7 @@
   <w:style w:type="character" w:customStyle="1" w:styleId="42">
     <w:name w:val="DecValTok"/>
     <w:basedOn w:val="36"/>
+    <w:qFormat/>
     <w:uiPriority w:val="0"/>
     <w:rPr>
       <w:color w:val="AD0000"/>
@@ -32125,6 +31634,7 @@
   <w:style w:type="character" w:customStyle="1" w:styleId="47">
     <w:name w:val="SpecialCharTok"/>
     <w:basedOn w:val="36"/>
+    <w:qFormat/>
     <w:uiPriority w:val="0"/>
     <w:rPr>
       <w:color w:val="5E5E5E"/>
@@ -32194,6 +31704,7 @@
   <w:style w:type="character" w:customStyle="1" w:styleId="54">
     <w:name w:val="AnnotationTok"/>
     <w:basedOn w:val="36"/>
+    <w:qFormat/>
     <w:uiPriority w:val="0"/>
     <w:rPr>
       <w:color w:val="5E5E5E"/>
@@ -32214,6 +31725,7 @@
   <w:style w:type="character" w:customStyle="1" w:styleId="56">
     <w:name w:val="OtherTok"/>
     <w:basedOn w:val="36"/>
+    <w:qFormat/>
     <w:uiPriority w:val="0"/>
     <w:rPr>
       <w:color w:val="003B4F"/>
@@ -32279,6 +31791,7 @@
   <w:style w:type="character" w:customStyle="1" w:styleId="63">
     <w:name w:val="PreprocessorTok"/>
     <w:basedOn w:val="36"/>
+    <w:qFormat/>
     <w:uiPriority w:val="0"/>
     <w:rPr>
       <w:color w:val="AD0000"/>
@@ -32288,6 +31801,7 @@
   <w:style w:type="character" w:customStyle="1" w:styleId="64">
     <w:name w:val="AttributeTok"/>
     <w:basedOn w:val="36"/>
+    <w:qFormat/>
     <w:uiPriority w:val="0"/>
     <w:rPr>
       <w:color w:val="657422"/>
@@ -32306,6 +31820,7 @@
   <w:style w:type="character" w:customStyle="1" w:styleId="66">
     <w:name w:val="InformationTok"/>
     <w:basedOn w:val="36"/>
+    <w:qFormat/>
     <w:uiPriority w:val="0"/>
     <w:rPr>
       <w:color w:val="5E5E5E"/>
@@ -32343,6 +31858,7 @@
   <w:style w:type="character" w:customStyle="1" w:styleId="70">
     <w:name w:val="NormalTok"/>
     <w:basedOn w:val="36"/>
+    <w:qFormat/>
     <w:uiPriority w:val="0"/>
     <w:rPr>
       <w:color w:val="003B4F"/>

</xml_diff>